<commit_message>
Merge 3 PRs and rebase
</commit_message>
<xml_diff>
--- a/docs/Technical-Design-Document.docx
+++ b/docs/Technical-Design-Document.docx
@@ -193,7 +193,7 @@
               <w:rPr>
                 <w:sz w:val="18"/>
               </w:rPr>
-              <w:t>https://smagara.github.io/SlowDoughPizzaSite_Sveltia/admin/ (hidden ✎ link in the site footer)</w:t>
+              <w:t>https://smagara.github.io/SlowDoughPizzaSite_Sveltia/admin/ — unlisted URL, not linked from the site (v1.2)</w:t>
             </w:r>
           </w:p>
         </w:tc>
@@ -231,7 +231,7 @@
               <w:rPr>
                 <w:sz w:val="18"/>
               </w:rPr>
-              <w:t>1.0 — 13 October 2026</w:t>
+              <w:t>1.2 — 15 October 2026 (see §16 Revision history)</w:t>
             </w:r>
           </w:p>
         </w:tc>
@@ -372,7 +372,7 @@
           <w:i w:val="0"/>
           <w:sz w:val="20"/>
         </w:rPr>
-        <w:t>1. Introduction · 2. Requirements and traceability · 3. Solution overview · 4. Content model · 5. The editor (Sveltia CMS) · 6. Authentication and authorisation · 7. Editorial workflow: from Save to pull request · 8. Build and deployment (CI/CD) · 9. Input validation and security · 10. Local edit mode for development · 11. Testing strategy · 12. Setup and operations runbook · 13. Design decisions log · 14. Open questions · 15. Risks and mitigations · Appendix A: File inventory · Appendix B: Editor screenshots</w:t>
+        <w:t>1. Introduction · 2. Requirements and traceability · 3. Solution overview · 4. Content model · 5. The editor (Sveltia CMS) · 6. Authentication and authorisation · 7. Editorial workflow: from Save to pull request · 8. Build and deployment (CI/CD) · 9. Input validation and security · 10. Local edit mode for development · 11. Testing strategy · 12. Setup and operations runbook · 13. Design decisions log · 14. Open questions · 15. Risks and mitigations · 16. Revision history · Appendix A: File inventory · Appendix B: Editor screenshots</w:t>
       </w:r>
     </w:p>
     <w:p>
@@ -906,7 +906,7 @@
               <w:rPr>
                 <w:sz w:val="17"/>
               </w:rPr>
-              <w:t>§5.4 — unobtrusive ✎ link in the footer → /admin/; site-themed skin (cream/terracotta/Georgia)</w:t>
+              <w:t>§5.4 — v1.0 used an unobtrusive ✎ footer link; per the owner's v1.2 request the site now contains no link at all and editors use the unlisted /admin/ URL. Editor skinned in the site palette; preview pane renders the real page sections (§5.5)</w:t>
             </w:r>
           </w:p>
         </w:tc>
@@ -924,7 +924,7 @@
               <w:rPr>
                 <w:sz w:val="17"/>
               </w:rPr>
-              <w:t>e2e scenarios 1, 8; screenshots B-1, B-2</w:t>
+              <w:t>e2e scenarios 1, 3, 6, 8 (no link/reference to /admin in the public page; preview templates rendered); screenshots B-1, B-5…B-12</w:t>
             </w:r>
           </w:p>
         </w:tc>
@@ -2931,7 +2931,7 @@
         <w:pStyle w:val="Heading2"/>
       </w:pPr>
       <w:r>
-        <w:t>5.4 Hidden entry point and site styling</w:t>
+        <w:t>5.4 Entry point: an unlisted URL, no link on the site</w:t>
       </w:r>
     </w:p>
     <w:p>
@@ -2940,7 +2940,7 @@
           <w:b w:val="0"/>
           <w:i w:val="0"/>
         </w:rPr>
-        <w:t>The footer's copyright line contains a small pen icon (✎) rendered at 25 % opacity that becomes fully visible on hover or keyboard focus and links to /admin/ (Footer.tsx, id `staff-editor-link`). It is deliberately unobtrusive rather than invisible: it stays keyboard- and screen-reader-accessible, and obscurity is not the security boundary — the editor itself requires GitHub sign-in and collaborator status (§6). The link respects the Pages base path via import.meta.env.BASE_URL.</w:t>
+        <w:t>Version 1.0 placed a faint ✎ icon in the footer (visible on hover/focus) that linked to /admin/. After review the owner asked for the editor to stay secret from visitors and bots, so since v1.2 the public site contains no link and no reference to the editor at all — the end-to-end test asserts that neither the rendered page nor dist/index.html mentions “admin”. Editors reach the editor through the address https://smagara.github.io/SlowDoughPizzaSite_Sveltia/admin/, which they bookmark; the manager guide gives the address on its first page.</w:t>
       </w:r>
     </w:p>
     <w:p>
@@ -2949,7 +2949,50 @@
           <w:b w:val="0"/>
           <w:i w:val="0"/>
         </w:rPr>
-        <w:t>The editor is skinned to match the site (src/admin/theme.css): Sveltia's UI is driven by CSS custom properties, so the accent colour is set to the site's terracotta (#c85a32), backgrounds to the site's cream palette, headings to Georgia and body text to the system sans-serif stack. The login page shows the site name and a custom logo (public/admin/logo.svg). A preview stylesheet (src/admin/preview.css) gives the live preview pane the site's typography. The public site's layout is not used as the editing form on purpose: Sveltia's form is the accessible, validated, field-by-field UI that non-technical users need, and it is branded rather than replaced.</w:t>
+        <w:t>What this does and does not achieve: the page is not discoverable (no inbound link; &lt;meta name="robots" content="noindex, nofollow"&gt;; no sitemap entry), but it is still a public URL. Anyone who guesses it sees only the sign-in page; every action behind it requires GitHub sign-in and repository collaborator access (§6). Deliberately no robots.txt Disallow line is added, because that file is public and would advertise the path. Obscurity lowers noise; GitHub provides the security.</w:t>
+      </w:r>
+    </w:p>
+    <w:p>
+      <w:pPr>
+        <w:pStyle w:val="Heading2"/>
+      </w:pPr>
+      <w:r>
+        <w:t>5.5 Site styling and the live preview</w:t>
+      </w:r>
+    </w:p>
+    <w:p>
+      <w:r>
+        <w:rPr>
+          <w:b w:val="0"/>
+          <w:i w:val="0"/>
+        </w:rPr>
+        <w:t>The editor is skinned to match the site (src/admin/theme.css): Sveltia's UI is driven by CSS custom properties, so the accent colour is set to the site's terracotta (#c85a32), backgrounds to the site's cream palette, headings to Georgia and body text to the system sans-serif stack. The login page shows the site name and a custom logo (public/admin/logo.svg; since v1.2 a light tile with a terracotta ring so it renders correctly on the dark theme as well).</w:t>
+      </w:r>
+    </w:p>
+    <w:p>
+      <w:r>
+        <w:rPr>
+          <w:b w:val="0"/>
+          <w:i w:val="0"/>
+        </w:rPr>
+        <w:t>The preview pane renders the section being edited as it will look on the website (src/admin/preview/). Four React templates are registered with CMS.registerPreviewTemplate — keyed by file name for the Site Content files (menu, announcement, hours) and by collection name for blog — together with a stylesheet injected into the preview iframe that reproduces the site's palette and typography (Tailwind is not available there). They mirror the public components: the Daily Menu with its section pills, item cards, prices and dietary badges; the dark announcement strip above the real header and hero, or a note when the banner is switched off; the Weekly Schedule table with closed days; and the blog post card (meta line, title, subtitle, excerpt, Essential Insights) followed by the full essay, whose Markdown body is rendered by Sveltia's own sanitised preview widget inside the site's article styling. A thin browser-like frame labels each preview “as it will appear on slowdoughpizza.com”. The templates are pure, hook-free function components, so the JSX produced by this project's React runtime can be rendered by the React instance bundled inside Sveltia (same major version); they update live as fields change and show placeholders for empty fields. The preview always uses the light site palette, independent of the editor theme, because it depicts the website rather than the editor.</w:t>
+      </w:r>
+    </w:p>
+    <w:p>
+      <w:pPr>
+        <w:pStyle w:val="Heading2"/>
+      </w:pPr>
+      <w:r>
+        <w:t>5.6 No media uploads</w:t>
+      </w:r>
+    </w:p>
+    <w:p>
+      <w:r>
+        <w:rPr>
+          <w:b w:val="0"/>
+          <w:i w:val="0"/>
+        </w:rPr>
+        <w:t>The site has no image fields (all artwork is inline SVG), so an Assets area would only invite stray uploads. Sveltia insists on a media_folder in its configuration validation, therefore two measures are combined: the asset entry points — the Assets navigation item, the “Show Assets” toolbar button and the “Assets” item of the global “+” menu — are removed from the UI by theme.css, and the default media library is configured with max_file_size: 0 so that any upload, including one attempted through the direct #/assets route, is rejected before anything is committed. The end-to-end test covers both. If photos are wanted later (§14), revert these two settings and add an Image field.</w:t>
       </w:r>
     </w:p>
     <w:p>
@@ -3002,7 +3045,7 @@
           <w:i/>
           <w:sz w:val="18"/>
         </w:rPr>
-        <w:t>Figure 2 — The Daily Menu editor with the site theme applied (left: fields, right: live preview).</w:t>
+        <w:t>Figure 2 — The Daily Menu editor: fields on the left, the site-styled live preview on the right.</w:t>
       </w:r>
     </w:p>
     <w:p>
@@ -3082,7 +3125,7 @@
           <w:b w:val="0"/>
           <w:i w:val="0"/>
         </w:rPr>
-        <w:t>After sign-in Sveltia loads the user profile and calls GET /repos/smagara/SlowDoughPizzaSite_Sveltia/collaborators/{login}. Anyone who is not a collaborator is stopped with “You don't have access to the repository” before any content is loaded (verified in e2e scenario 2). This check is a convenience; the real enforcement is GitHub itself: every branch creation, commit and pull-request call is made with the user's own token and is rejected by GitHub unless that account has write permission on the repository. There is no shared service account and no way to act as somebody else.</w:t>
+        <w:t>After sign-in Sveltia loads the user profile, detects the repository's default branch (GraphQL defaultBranchRef) and calls GET /repos/smagara/SlowDoughPizzaSite_Sveltia/collaborators/{login}. Anyone who is not a collaborator is stopped with “You don't have access to the repository” before any content is loaded (verified in e2e scenario 2). This check is a convenience; the real enforcement is GitHub itself: every branch creation, commit and pull-request call is made with the user's own token and is rejected by GitHub unless that account has write permission on the repository. There is no shared service account and no way to act as somebody else.</w:t>
       </w:r>
     </w:p>
     <w:p>
@@ -3304,7 +3347,7 @@
               <w:rPr>
                 <w:sz w:val="18"/>
               </w:rPr>
-              <w:t>Manager opens the hidden link, signs in; Sveltia verifies collaborator status.</w:t>
+              <w:t>Manager opens the bookmarked editor URL and signs in; Sveltia verifies collaborator status.</w:t>
             </w:r>
           </w:p>
         </w:tc>
@@ -3727,6 +3770,70 @@
                 <w:sz w:val="18"/>
               </w:rPr>
               <w:t>Value</w:t>
+            </w:r>
+          </w:p>
+        </w:tc>
+      </w:tr>
+      <w:tr>
+        <w:tc>
+          <w:tcPr>
+            <w:tcW w:type="dxa" w:w="2154"/>
+          </w:tcPr>
+          <w:p>
+            <w:r>
+              <w:rPr>
+                <w:sz w:val="18"/>
+              </w:rPr>
+            </w:r>
+            <w:r>
+              <w:rPr>
+                <w:sz w:val="18"/>
+              </w:rPr>
+              <w:t>Base branch</w:t>
+            </w:r>
+          </w:p>
+        </w:tc>
+        <w:tc>
+          <w:tcPr>
+            <w:tcW w:type="dxa" w:w="7200"/>
+          </w:tcPr>
+          <w:p>
+            <w:r>
+              <w:rPr>
+                <w:sz w:val="18"/>
+              </w:rPr>
+            </w:r>
+            <w:r>
+              <w:rPr>
+                <w:sz w:val="18"/>
+              </w:rPr>
+              <w:t>The repository's default branch, detected by Sveltia at sign-in (</w:t>
+            </w:r>
+            <w:r>
+              <w:rPr>
+                <w:rFonts w:ascii="Consolas" w:hAnsi="Consolas" w:eastAsia="Consolas"/>
+                <w:sz w:val="18"/>
+              </w:rPr>
+              <w:t>backend.branch</w:t>
+            </w:r>
+            <w:r>
+              <w:rPr>
+                <w:sz w:val="18"/>
+              </w:rPr>
+              <w:t xml:space="preserve"> is intentionally not set — see D15). It must be </w:t>
+            </w:r>
+            <w:r>
+              <w:rPr>
+                <w:rFonts w:ascii="Consolas" w:hAnsi="Consolas" w:eastAsia="Consolas"/>
+                <w:sz w:val="18"/>
+              </w:rPr>
+              <w:t>main</w:t>
+            </w:r>
+            <w:r>
+              <w:rPr>
+                <w:sz w:val="18"/>
+              </w:rPr>
+              <w:t>, which is what the workflows build and deploy.</w:t>
             </w:r>
           </w:p>
         </w:tc>
@@ -4383,7 +4490,7 @@
           <w:b w:val="0"/>
           <w:i w:val="0"/>
         </w:rPr>
-        <w:t>A GitHub project site is served from https://smagara.github.io/SlowDoughPizzaSite_Sveltia/. Vite's `base` is therefore taken from the BASE_PATH environment variable (set to `/${repository name}/` by the workflows; `/` locally). Everything that needs an absolute path — the hidden link, the editor logo, `public_folder`, `logout_redirect_url` — is derived from import.meta.env.BASE_URL so the same source works locally and in production. The build emits two HTML entry points: dist/index.html (public site) and dist/admin/index.html (editor).</w:t>
+        <w:t>A GitHub project site is served from https://smagara.github.io/SlowDoughPizzaSite_Sveltia/. Vite's `base` is therefore taken from the BASE_PATH environment variable (set to `/${repository name}/` by the workflows; `/` locally). Everything that needs an absolute path — the editor logo, `public_folder`, `logout_redirect_url` — is derived from import.meta.env.BASE_URL so the same source works locally and in production. The build emits two HTML entry points: dist/index.html (public site) and dist/admin/index.html (editor).</w:t>
       </w:r>
     </w:p>
     <w:p>
@@ -4415,7 +4522,81 @@
         <w:pStyle w:val="Heading2"/>
       </w:pPr>
       <w:r>
-        <w:t>8.3 Timing and failure behaviour</w:t>
+        <w:t>8.3 Build output notes</w:t>
+      </w:r>
+    </w:p>
+    <w:p>
+      <w:r>
+        <w:rPr>
+          <w:b w:val="0"/>
+          <w:i w:val="0"/>
+        </w:rPr>
+        <w:t>Two messages can appear in the build log; neither indicates a problem, and both were reviewed during the first deployment:</w:t>
+      </w:r>
+    </w:p>
+    <w:p>
+      <w:pPr>
+        <w:pStyle w:val="ListBullet"/>
+      </w:pPr>
+      <w:r>
+        <w:rPr>
+          <w:b/>
+        </w:rPr>
+        <w:t>“Some chunks are larger than 500 kB after minification”</w:t>
+      </w:r>
+      <w:r>
+        <w:t xml:space="preserve"> — the editor entry (dist/assets/admin-*.js, ≈2.1 MB minified / 650 kB gzipped) bundles Sveltia CMS, a pre-built single-page application whose optional features (syntax highlighting languages, image codecs, maps, locales) are already emitted as lazily loaded chunks. It cannot be split further from this project. </w:t>
+      </w:r>
+      <w:r>
+        <w:rPr>
+          <w:rFonts w:ascii="Consolas" w:hAnsi="Consolas" w:eastAsia="Consolas"/>
+          <w:sz w:val="19"/>
+        </w:rPr>
+        <w:t>build.chunkSizeWarningLimit</w:t>
+      </w:r>
+      <w:r>
+        <w:t xml:space="preserve"> is set to 2 600 kB in vite.config.ts so the warning stays meaningful for the public site, whose chunk is ≈400 kB. The public page never loads the editor bundle.</w:t>
+      </w:r>
+    </w:p>
+    <w:p>
+      <w:pPr>
+        <w:pStyle w:val="ListBullet"/>
+      </w:pPr>
+      <w:r>
+        <w:rPr>
+          <w:b/>
+        </w:rPr>
+        <w:t>“[PLUGIN_TIMINGS] JavaScript callbacks ran for …”</w:t>
+      </w:r>
+      <w:r>
+        <w:t xml:space="preserve"> — an informational diagnostic of Rolldown, the bundler inside Vite 8, reporting how much build time was spent inside JavaScript plugin hooks (on the reporting machine 1.5 s of 9.5 s). The project's two plugins now declare hook filters (the Markdown plugin only runs for content/**/*.md, the CSP plugin only for the public index.html), so they add no per-module overhead; the remaining time is the React and Tailwind plugins, which is normal. The note about “callbacks listed without a time … overlapped” is part of the same diagnostic. It can be profiled with </w:t>
+      </w:r>
+      <w:r>
+        <w:rPr>
+          <w:rFonts w:ascii="Consolas" w:hAnsi="Consolas" w:eastAsia="Consolas"/>
+          <w:sz w:val="19"/>
+        </w:rPr>
+        <w:t>node --cpu-prof</w:t>
+      </w:r>
+      <w:r>
+        <w:t xml:space="preserve"> if it ever grows.</w:t>
+      </w:r>
+    </w:p>
+    <w:p>
+      <w:r>
+        <w:rPr>
+          <w:b w:val="0"/>
+          <w:i w:val="0"/>
+        </w:rPr>
+        <w:t>The previous “Your Vite config uses features that are unsupported by configLoader: 'native'” notice was removed by using import.meta.dirname and explicit .ts extensions in vite.config.ts.</w:t>
+      </w:r>
+    </w:p>
+    <w:p>
+      <w:pPr>
+        <w:pStyle w:val="Heading2"/>
+      </w:pPr>
+      <w:r>
+        <w:t>8.4 Timing and failure behaviour</w:t>
       </w:r>
     </w:p>
     <w:p>
@@ -5273,6 +5454,15 @@
       </w:r>
     </w:p>
     <w:p>
+      <w:r>
+        <w:rPr>
+          <w:b w:val="0"/>
+          <w:i w:val="0"/>
+        </w:rPr>
+        <w:t>Two behaviours observed during the first external test are worth knowing. First, Sveltia remembers a successful sign-in (token in local storage; directory handle in IndexedDB) and opens the editor directly on the next visit, so the login page — and the local-repository option on it — is not shown again until the user chooses Sign Out from the account menu. Second, the option is keyed on the hostname: it appears for localhost/127.0.0.1 only, not for the LAN address the dev server also prints.</w:t>
+      </w:r>
+    </w:p>
+    <w:p>
       <w:pPr>
         <w:pStyle w:val="Heading1"/>
       </w:pPr>
@@ -5514,7 +5704,7 @@
               <w:rPr>
                 <w:sz w:val="17"/>
               </w:rPr>
-              <w:t>Branch cms/site/menu from main; commit touches only content/menu.json; draft PR → main with label sveltia-cms/draft; after sending: ready for review + sveltia-cms/pending_review; main unchanged; committed JSON well-formed with numeric price; no Publish button</w:t>
+              <w:t>Site-styled preview rendered (menu cards); Assets UI hidden; branch cms/site/menu from main; commit touches only content/menu.json; draft PR → main with label sveltia-cms/draft; after sending: ready for review + sveltia-cms/pending_review; main unchanged; committed JSON well-formed with numeric price; no Publish button</w:t>
             </w:r>
           </w:p>
         </w:tc>
@@ -5682,7 +5872,7 @@
               <w:rPr>
                 <w:sz w:val="17"/>
               </w:rPr>
-              <w:t>Branch cms/site/announcement with the new headline</w:t>
+              <w:t>Preview strip updates live; branch cms/site/announcement with the new headline; upload on the direct /assets route rejected (0 bytes), nothing committed</w:t>
             </w:r>
           </w:p>
         </w:tc>
@@ -5794,7 +5984,7 @@
               <w:rPr>
                 <w:sz w:val="17"/>
               </w:rPr>
-              <w:t>Base-path-correct hidden link and logo; CSP present with no violations; no local-mode button off localhost; sign-in works</w:t>
+              <w:t>No link or reference to /admin in the public page; editor page is noindex; base-path-correct logo; CSP present with no violations; no local-mode button off localhost; sign-in works</w:t>
             </w:r>
           </w:p>
         </w:tc>
@@ -5807,7 +5997,16 @@
           <w:b w:val="0"/>
           <w:i w:val="0"/>
         </w:rPr>
-        <w:t>Run with `npm run test:e2e` (needs `npx playwright install chromium` once). The test also writes the screenshots used in this document and in the manager guide (docs/images/cms/). Static checks: `npm run lint` type-checks the site, the Vite plugins and the CMS configuration; `npm run validate:content` validates the committed content. Both run in CI.</w:t>
+        <w:t>Run with `npm run test:e2e`. npm install brings the Playwright package but not the browser binary; run `npm run test:e2e:setup` (= `npx playwright install chromium`) once — the test prints this hint and exits if Chromium is missing. The test also writes the screenshots used in this document and in the manager guide (docs/images/cms/). Static checks: `npm run lint` type-checks the site, the Vite plugins and the CMS configuration; `npm run validate:content` validates the committed content. Both run in CI.</w:t>
+      </w:r>
+    </w:p>
+    <w:p>
+      <w:r>
+        <w:rPr>
+          <w:b w:val="0"/>
+          <w:i w:val="0"/>
+        </w:rPr>
+        <w:t>Robustness notes from the first external run: scenario 5 originally typed the essay into the rich-text editor with simulated keystrokes. On a slower machine the editor's own “## → heading” conversion raced with the keystrokes (the non-ASCII “°” character is inserted through a different input path) and characters were lost, so the scenario failed intermittently. It now switches the field to raw Markdown mode (“Edit in Markdown” toolbar button) and sets the whole body with a single fill(), then switches back for the screenshot. All waits are on observable state (simulated API calls, file contents) rather than on transient toasts.</w:t>
       </w:r>
     </w:p>
     <w:p>
@@ -5840,7 +6039,15 @@
         <w:pStyle w:val="ListNumber"/>
       </w:pPr>
       <w:r>
-        <w:t>Push this repository to GitHub (default branch main). In Settings → Pages set Build and deployment → Source to GitHub Actions. The deploy workflow publishes the site on the next push.</w:t>
+        <w:t>Make sure the repository's default branch is main and that it contains the content/ folder (Settings → General → Default branch; rename master if necessary). The editor always edits the default branch; the workflows build and deploy main. A mismatch is the one misconfiguration the editor does not report: it simply shows empty collections (§15).</w:t>
+      </w:r>
+    </w:p>
+    <w:p>
+      <w:pPr>
+        <w:pStyle w:val="ListNumber"/>
+      </w:pPr>
+      <w:r>
+        <w:t>Push this repository to GitHub. In Settings → Pages set Build and deployment → Source to GitHub Actions. The deploy workflow publishes the site on the next push.</w:t>
       </w:r>
     </w:p>
     <w:p>
@@ -5872,7 +6079,7 @@
         <w:pStyle w:val="ListNumber"/>
       </w:pPr>
       <w:r>
-        <w:t>Post-deployment checks: open the site, hover the footer to find the ✎ link, sign in as the manager, save a harmless change (e.g. the announcement), confirm the pull request appears with the PR check running, approve, merge, and confirm the site updates.</w:t>
+        <w:t>Post-deployment checks: open the editor URL directly (it is not linked from the site), sign in as the manager, save a harmless change (e.g. the announcement), confirm the pull request appears with the PR check running, approve, merge, and confirm the site updates.</w:t>
       </w:r>
     </w:p>
     <w:p>
@@ -6223,6 +6430,82 @@
                 <w:sz w:val="18"/>
               </w:rPr>
               <w:t>Token mode: create a new fine-grained token (Contents + Pull requests read/write on this repo). OAuth mode: nothing to do beyond collaborator access.</w:t>
+            </w:r>
+          </w:p>
+        </w:tc>
+      </w:tr>
+      <w:tr>
+        <w:tc>
+          <w:tcPr>
+            <w:tcW w:type="dxa" w:w="2551"/>
+          </w:tcPr>
+          <w:p>
+            <w:r>
+              <w:rPr>
+                <w:sz w:val="18"/>
+              </w:rPr>
+            </w:r>
+            <w:r>
+              <w:rPr>
+                <w:sz w:val="18"/>
+              </w:rPr>
+              <w:t>“Work with Local Repository” no longer offered (developer machine)</w:t>
+            </w:r>
+          </w:p>
+        </w:tc>
+        <w:tc>
+          <w:tcPr>
+            <w:tcW w:type="dxa" w:w="6803"/>
+          </w:tcPr>
+          <w:p>
+            <w:r>
+              <w:rPr>
+                <w:sz w:val="18"/>
+              </w:rPr>
+            </w:r>
+            <w:r>
+              <w:rPr>
+                <w:sz w:val="18"/>
+              </w:rPr>
+              <w:t>Still signed in from a previous session (login page skipped) or opened via a non-localhost address. Sign Out from the account menu, or open http://localhost:3000/admin/.</w:t>
+            </w:r>
+          </w:p>
+        </w:tc>
+      </w:tr>
+      <w:tr>
+        <w:tc>
+          <w:tcPr>
+            <w:tcW w:type="dxa" w:w="2551"/>
+          </w:tcPr>
+          <w:p>
+            <w:r>
+              <w:rPr>
+                <w:sz w:val="18"/>
+              </w:rPr>
+            </w:r>
+            <w:r>
+              <w:rPr>
+                <w:sz w:val="18"/>
+              </w:rPr>
+              <w:t>Editor shows no existing content (Blog Posts 0, empty fields) but can create items</w:t>
+            </w:r>
+          </w:p>
+        </w:tc>
+        <w:tc>
+          <w:tcPr>
+            <w:tcW w:type="dxa" w:w="6803"/>
+          </w:tcPr>
+          <w:p>
+            <w:r>
+              <w:rPr>
+                <w:sz w:val="18"/>
+              </w:rPr>
+            </w:r>
+            <w:r>
+              <w:rPr>
+                <w:sz w:val="18"/>
+              </w:rPr>
+              <w:t>The branch the editor reads has no content/ folder. Check which branch holds content/ and make it the default branch (must be main for deployment). If the branch is right, clear a stale editor cache: sign out, clear site data for the editor URL, sign in again.</w:t>
             </w:r>
           </w:p>
         </w:tc>
@@ -6745,7 +7028,7 @@
               <w:rPr>
                 <w:sz w:val="16"/>
               </w:rPr>
-              <w:t>Hidden but accessible footer link (low-opacity icon, visible on hover/focus)</w:t>
+              <w:t>v1.0: hidden-but-accessible footer link. v1.2: no link at all — unlisted /admin/ URL, noindex, no robots.txt entry</w:t>
             </w:r>
           </w:p>
         </w:tc>
@@ -6763,7 +7046,7 @@
               <w:rPr>
                 <w:sz w:val="16"/>
               </w:rPr>
-              <w:t>Fully invisible link; keyboard shortcut; separate unlisted URL only</w:t>
+              <w:t>Invisible link; keyboard shortcut; robots.txt Disallow</w:t>
             </w:r>
           </w:p>
         </w:tc>
@@ -6781,7 +7064,7 @@
               <w:rPr>
                 <w:sz w:val="16"/>
               </w:rPr>
-              <w:t>Meets “hidden link” without harming accessibility; security relies on auth, not obscurity</w:t>
+              <w:t>Owner asked for the editor to be hidden from visitors and bots; an unlisted URL is the cleanest way. Security still relies on GitHub auth, not obscurity</w:t>
             </w:r>
           </w:p>
         </w:tc>
@@ -6819,7 +7102,7 @@
               <w:rPr>
                 <w:sz w:val="16"/>
               </w:rPr>
-              <w:t>Brand Sveltia's UI with CSS custom properties and a logo instead of building a custom form</w:t>
+              <w:t>Brand Sveltia's UI with CSS custom properties and a logo instead of building a custom form; v1.2 adds site-styled preview templates</w:t>
             </w:r>
           </w:p>
         </w:tc>
@@ -6837,7 +7120,7 @@
               <w:rPr>
                 <w:sz w:val="16"/>
               </w:rPr>
-              <w:t>Custom React form calling the GitHub API; Sveltia custom preview templates</w:t>
+              <w:t>Custom React form calling the GitHub API; generic field-dump preview</w:t>
             </w:r>
           </w:p>
         </w:tc>
@@ -6855,7 +7138,7 @@
               <w:rPr>
                 <w:sz w:val="16"/>
               </w:rPr>
-              <w:t>Reuses Sveltia's validation, rich-text editor, workflow UI and accessibility; minimal code to maintain; matches the site's palette/typography</w:t>
+              <w:t>Reuses Sveltia's validation, rich-text editor, workflow UI and accessibility; the preview shows staff what they are editing in the website's own look, with Sveltia's sanitised Markdown widget embedded for the essay body</w:t>
             </w:r>
           </w:p>
         </w:tc>
@@ -6875,7 +7158,7 @@
               <w:rPr>
                 <w:sz w:val="16"/>
               </w:rPr>
-              <w:t>D8</w:t>
+              <w:t>D16</w:t>
             </w:r>
           </w:p>
         </w:tc>
@@ -6893,7 +7176,7 @@
               <w:rPr>
                 <w:sz w:val="16"/>
               </w:rPr>
-              <w:t>Validation rules expressed once in config.ts and re-applied by a CI script; plus anti-markup regexes on every text field</w:t>
+              <w:t>Remove media uploads: hide asset entry points via CSS and set max_file_size: 0 (v1.2)</w:t>
             </w:r>
           </w:p>
         </w:tc>
@@ -6911,7 +7194,7 @@
               <w:rPr>
                 <w:sz w:val="16"/>
               </w:rPr>
-              <w:t>Browser-only validation; a separate JSON Schema</w:t>
+              <w:t>Drop media_folder (rejected by Sveltia's validator); declare an unconfigured cloud library (leaves broken leftovers and a page error on /assets)</w:t>
             </w:r>
           </w:p>
         </w:tc>
@@ -6929,7 +7212,7 @@
               <w:rPr>
                 <w:sz w:val="16"/>
               </w:rPr>
-              <w:t>Single source of truth; server-side guarantee that nothing unvalidated reaches main or the build</w:t>
+              <w:t>No image fields exist; both measures together remove the UI and make uploads impossible even by URL; trivially reversible when images are wanted</w:t>
             </w:r>
           </w:p>
         </w:tc>
@@ -6949,6 +7232,80 @@
               <w:rPr>
                 <w:sz w:val="16"/>
               </w:rPr>
+              <w:t>D8</w:t>
+            </w:r>
+          </w:p>
+        </w:tc>
+        <w:tc>
+          <w:tcPr>
+            <w:tcW w:type="dxa" w:w="2608"/>
+          </w:tcPr>
+          <w:p>
+            <w:r>
+              <w:rPr>
+                <w:sz w:val="16"/>
+              </w:rPr>
+            </w:r>
+            <w:r>
+              <w:rPr>
+                <w:sz w:val="16"/>
+              </w:rPr>
+              <w:t>Validation rules expressed once in config.ts and re-applied by a CI script; plus anti-markup regexes on every text field</w:t>
+            </w:r>
+          </w:p>
+        </w:tc>
+        <w:tc>
+          <w:tcPr>
+            <w:tcW w:type="dxa" w:w="2438"/>
+          </w:tcPr>
+          <w:p>
+            <w:r>
+              <w:rPr>
+                <w:sz w:val="16"/>
+              </w:rPr>
+            </w:r>
+            <w:r>
+              <w:rPr>
+                <w:sz w:val="16"/>
+              </w:rPr>
+              <w:t>Browser-only validation; a separate JSON Schema</w:t>
+            </w:r>
+          </w:p>
+        </w:tc>
+        <w:tc>
+          <w:tcPr>
+            <w:tcW w:type="dxa" w:w="3798"/>
+          </w:tcPr>
+          <w:p>
+            <w:r>
+              <w:rPr>
+                <w:sz w:val="16"/>
+              </w:rPr>
+            </w:r>
+            <w:r>
+              <w:rPr>
+                <w:sz w:val="16"/>
+              </w:rPr>
+              <w:t>Single source of truth; server-side guarantee that nothing unvalidated reaches main or the build</w:t>
+            </w:r>
+          </w:p>
+        </w:tc>
+      </w:tr>
+      <w:tr>
+        <w:tc>
+          <w:tcPr>
+            <w:tcW w:type="dxa" w:w="510"/>
+          </w:tcPr>
+          <w:p>
+            <w:r>
+              <w:rPr>
+                <w:sz w:val="16"/>
+              </w:rPr>
+            </w:r>
+            <w:r>
+              <w:rPr>
+                <w:sz w:val="16"/>
+              </w:rPr>
               <w:t>D9</w:t>
             </w:r>
           </w:p>
@@ -7387,6 +7744,106 @@
                 <w:sz w:val="16"/>
               </w:rPr>
               <w:t>Clear required check for branch protection; works if the repository is renamed/forked</w:t>
+            </w:r>
+          </w:p>
+        </w:tc>
+      </w:tr>
+      <w:tr>
+        <w:tc>
+          <w:tcPr>
+            <w:tcW w:type="dxa" w:w="510"/>
+          </w:tcPr>
+          <w:p>
+            <w:r>
+              <w:rPr>
+                <w:sz w:val="16"/>
+              </w:rPr>
+            </w:r>
+            <w:r>
+              <w:rPr>
+                <w:sz w:val="16"/>
+              </w:rPr>
+              <w:t>D15</w:t>
+            </w:r>
+          </w:p>
+        </w:tc>
+        <w:tc>
+          <w:tcPr>
+            <w:tcW w:type="dxa" w:w="2608"/>
+          </w:tcPr>
+          <w:p>
+            <w:r>
+              <w:rPr>
+                <w:sz w:val="16"/>
+              </w:rPr>
+            </w:r>
+            <w:r>
+              <w:rPr>
+                <w:sz w:val="16"/>
+              </w:rPr>
+              <w:t xml:space="preserve">Do not set </w:t>
+            </w:r>
+            <w:r>
+              <w:rPr>
+                <w:rFonts w:ascii="Consolas" w:hAnsi="Consolas" w:eastAsia="Consolas"/>
+                <w:sz w:val="16"/>
+              </w:rPr>
+              <w:t>backend.branch</w:t>
+            </w:r>
+            <w:r>
+              <w:rPr>
+                <w:sz w:val="16"/>
+              </w:rPr>
+              <w:t>; let Sveltia detect the repository's default branch (v1.1)</w:t>
+            </w:r>
+          </w:p>
+        </w:tc>
+        <w:tc>
+          <w:tcPr>
+            <w:tcW w:type="dxa" w:w="2438"/>
+          </w:tcPr>
+          <w:p>
+            <w:r>
+              <w:rPr>
+                <w:sz w:val="16"/>
+              </w:rPr>
+            </w:r>
+            <w:r>
+              <w:rPr>
+                <w:sz w:val="16"/>
+              </w:rPr>
+              <w:t xml:space="preserve">Hard-code </w:t>
+            </w:r>
+            <w:r>
+              <w:rPr>
+                <w:rFonts w:ascii="Consolas" w:hAnsi="Consolas" w:eastAsia="Consolas"/>
+                <w:sz w:val="16"/>
+              </w:rPr>
+              <w:t>branch: main</w:t>
+            </w:r>
+            <w:r>
+              <w:rPr>
+                <w:sz w:val="16"/>
+              </w:rPr>
+              <w:t xml:space="preserve"> (v1.0)</w:t>
+            </w:r>
+          </w:p>
+        </w:tc>
+        <w:tc>
+          <w:tcPr>
+            <w:tcW w:type="dxa" w:w="3798"/>
+          </w:tcPr>
+          <w:p>
+            <w:r>
+              <w:rPr>
+                <w:sz w:val="16"/>
+              </w:rPr>
+            </w:r>
+            <w:r>
+              <w:rPr>
+                <w:sz w:val="16"/>
+              </w:rPr>
+              <w:t>v1.0 hard-coded main. In the first real deployment the editor showed empty collections while saving still worked — reproduced in the simulation as “configured branch has no content/”: Sveltia reports nothing in that case. Following the default branch removes the silent mismatch; the requirement that the default branch is main (for deployment) is now a documented, visible setup step instead of a hidden assumption.</w:t>
             </w:r>
           </w:p>
         </w:tc>
@@ -7636,7 +8093,7 @@
               <w:rPr>
                 <w:sz w:val="18"/>
               </w:rPr>
-              <w:t>Editor bypasses browser validation (hand-edited commit)</w:t>
+              <w:t>Editor reads a branch without content/ (default branch ≠ branch with content, or stale main)</w:t>
             </w:r>
           </w:p>
         </w:tc>
@@ -7654,7 +8111,7 @@
               <w:rPr>
                 <w:sz w:val="18"/>
               </w:rPr>
-              <w:t>Unsafe or malformed content reaches a PR</w:t>
+              <w:t>Editor shows empty collections with no error; new entries would be proposed against the wrong baseline</w:t>
             </w:r>
           </w:p>
         </w:tc>
@@ -7672,7 +8129,7 @@
               <w:rPr>
                 <w:sz w:val="18"/>
               </w:rPr>
-              <w:t>CI validator (required check) + review + safe rendering + CSP</w:t>
+              <w:t>Editor follows the default branch (D15); setup step 0 and troubleshooting entry; symptom reproduced and documented</w:t>
             </w:r>
           </w:p>
         </w:tc>
@@ -7692,7 +8149,7 @@
               <w:rPr>
                 <w:sz w:val="18"/>
               </w:rPr>
-              <w:t>Sveltia CMS upgrade changes behaviour (e.g. API usage)</w:t>
+              <w:t>Editor bypasses browser validation (hand-edited commit)</w:t>
             </w:r>
           </w:p>
         </w:tc>
@@ -7710,7 +8167,7 @@
               <w:rPr>
                 <w:sz w:val="18"/>
               </w:rPr>
-              <w:t>Editor breaks</w:t>
+              <w:t>Unsafe or malformed content reaches a PR</w:t>
             </w:r>
           </w:p>
         </w:tc>
@@ -7728,20 +8185,7 @@
               <w:rPr>
                 <w:sz w:val="18"/>
               </w:rPr>
-              <w:t xml:space="preserve">Version pinned; e2e test and </w:t>
-            </w:r>
-            <w:r>
-              <w:rPr>
-                <w:rFonts w:ascii="Consolas" w:hAnsi="Consolas" w:eastAsia="Consolas"/>
-                <w:sz w:val="18"/>
-              </w:rPr>
-              <w:t>npm run check</w:t>
-            </w:r>
-            <w:r>
-              <w:rPr>
-                <w:sz w:val="18"/>
-              </w:rPr>
-              <w:t xml:space="preserve"> before upgrading; simulated API makes regressions visible</w:t>
+              <w:t>CI validator (required check) + review + safe rendering + CSP</w:t>
             </w:r>
           </w:p>
         </w:tc>
@@ -7761,7 +8205,7 @@
               <w:rPr>
                 <w:sz w:val="18"/>
               </w:rPr>
-              <w:t>GitHub API outage or rate limit</w:t>
+              <w:t>Sveltia CMS upgrade changes behaviour (e.g. API usage)</w:t>
             </w:r>
           </w:p>
         </w:tc>
@@ -7779,7 +8223,7 @@
               <w:rPr>
                 <w:sz w:val="18"/>
               </w:rPr>
-              <w:t>Editor cannot load/save</w:t>
+              <w:t>Editor breaks</w:t>
             </w:r>
           </w:p>
         </w:tc>
@@ -7797,7 +8241,20 @@
               <w:rPr>
                 <w:sz w:val="18"/>
               </w:rPr>
-              <w:t>Sveltia shows GitHub status on the login page; changes are retried by the user; nothing is lost on the site</w:t>
+              <w:t xml:space="preserve">Version pinned; e2e test and </w:t>
+            </w:r>
+            <w:r>
+              <w:rPr>
+                <w:rFonts w:ascii="Consolas" w:hAnsi="Consolas" w:eastAsia="Consolas"/>
+                <w:sz w:val="18"/>
+              </w:rPr>
+              <w:t>npm run check</w:t>
+            </w:r>
+            <w:r>
+              <w:rPr>
+                <w:sz w:val="18"/>
+              </w:rPr>
+              <w:t xml:space="preserve"> before upgrading; simulated API makes regressions visible</w:t>
             </w:r>
           </w:p>
         </w:tc>
@@ -7817,7 +8274,7 @@
               <w:rPr>
                 <w:sz w:val="18"/>
               </w:rPr>
-              <w:t>Stale editor cache after a merge</w:t>
+              <w:t>GitHub API outage or rate limit</w:t>
             </w:r>
           </w:p>
         </w:tc>
@@ -7835,7 +8292,7 @@
               <w:rPr>
                 <w:sz w:val="18"/>
               </w:rPr>
-              <w:t>Manager sees old values</w:t>
+              <w:t>Editor cannot load/save</w:t>
             </w:r>
           </w:p>
         </w:tc>
@@ -7853,7 +8310,7 @@
               <w:rPr>
                 <w:sz w:val="18"/>
               </w:rPr>
-              <w:t>Sveltia refreshes from main on load; reloading the editor fixes it; documented in the guide</w:t>
+              <w:t>Sveltia shows GitHub status on the login page; changes are retried by the user; nothing is lost on the site</w:t>
             </w:r>
           </w:p>
         </w:tc>
@@ -7873,7 +8330,7 @@
               <w:rPr>
                 <w:sz w:val="18"/>
               </w:rPr>
-              <w:t>Two people edit the same file concurrently</w:t>
+              <w:t>Stale editor cache after a merge</w:t>
             </w:r>
           </w:p>
         </w:tc>
@@ -7891,7 +8348,7 @@
               <w:rPr>
                 <w:sz w:val="18"/>
               </w:rPr>
-              <w:t>Second save hits a moved branch</w:t>
+              <w:t>Manager sees old values</w:t>
             </w:r>
           </w:p>
         </w:tc>
@@ -7909,7 +8366,7 @@
               <w:rPr>
                 <w:sz w:val="18"/>
               </w:rPr>
-              <w:t>Sveltia detects the conflict and asks to reload/overwrite; one PR per entry keeps scope small</w:t>
+              <w:t>Sveltia refreshes from main on load; reloading the editor fixes it; documented in the guide</w:t>
             </w:r>
           </w:p>
         </w:tc>
@@ -7929,7 +8386,7 @@
               <w:rPr>
                 <w:sz w:val="18"/>
               </w:rPr>
-              <w:t>Large Sveltia bundle (~17 MB of mostly lazy-loaded assets)</w:t>
+              <w:t>Two people edit the same file concurrently</w:t>
             </w:r>
           </w:p>
         </w:tc>
@@ -7947,7 +8404,7 @@
               <w:rPr>
                 <w:sz w:val="18"/>
               </w:rPr>
-              <w:t>Slower first load of the editor</w:t>
+              <w:t>Second save hits a moved branch</w:t>
             </w:r>
           </w:p>
         </w:tc>
@@ -7965,7 +8422,7 @@
               <w:rPr>
                 <w:sz w:val="18"/>
               </w:rPr>
-              <w:t>Assets are code-split and cached; public site is unaffected (separate entry)</w:t>
+              <w:t>Sveltia detects the conflict and asks to reload/overwrite; one PR per entry keeps scope small</w:t>
             </w:r>
           </w:p>
         </w:tc>
@@ -7985,6 +8442,62 @@
               <w:rPr>
                 <w:sz w:val="18"/>
               </w:rPr>
+              <w:t>Large Sveltia bundle (~17 MB of mostly lazy-loaded assets)</w:t>
+            </w:r>
+          </w:p>
+        </w:tc>
+        <w:tc>
+          <w:tcPr>
+            <w:tcW w:type="dxa" w:w="2154"/>
+          </w:tcPr>
+          <w:p>
+            <w:r>
+              <w:rPr>
+                <w:sz w:val="18"/>
+              </w:rPr>
+            </w:r>
+            <w:r>
+              <w:rPr>
+                <w:sz w:val="18"/>
+              </w:rPr>
+              <w:t>Slower first load of the editor</w:t>
+            </w:r>
+          </w:p>
+        </w:tc>
+        <w:tc>
+          <w:tcPr>
+            <w:tcW w:type="dxa" w:w="4365"/>
+          </w:tcPr>
+          <w:p>
+            <w:r>
+              <w:rPr>
+                <w:sz w:val="18"/>
+              </w:rPr>
+            </w:r>
+            <w:r>
+              <w:rPr>
+                <w:sz w:val="18"/>
+              </w:rPr>
+              <w:t>Assets are code-split and cached; public site is unaffected (separate entry)</w:t>
+            </w:r>
+          </w:p>
+        </w:tc>
+      </w:tr>
+      <w:tr>
+        <w:tc>
+          <w:tcPr>
+            <w:tcW w:type="dxa" w:w="2835"/>
+          </w:tcPr>
+          <w:p>
+            <w:r>
+              <w:rPr>
+                <w:sz w:val="18"/>
+              </w:rPr>
+            </w:r>
+            <w:r>
+              <w:rPr>
+                <w:sz w:val="18"/>
+              </w:rPr>
               <w:t>Token leakage from the manager's browser</w:t>
             </w:r>
           </w:p>
@@ -8022,6 +8535,253 @@
                 <w:sz w:val="18"/>
               </w:rPr>
               <w:t>Fine-grained, single-repo, expiring token; branch protection still requires review; revoke on GitHub</w:t>
+            </w:r>
+          </w:p>
+        </w:tc>
+      </w:tr>
+    </w:tbl>
+    <w:p/>
+    <w:p>
+      <w:pPr>
+        <w:pStyle w:val="Heading1"/>
+      </w:pPr>
+      <w:r>
+        <w:t>16. Revision history</w:t>
+      </w:r>
+    </w:p>
+    <w:tbl>
+      <w:tblPr>
+        <w:tblStyle w:val="TableGrid"/>
+        <w:tblW w:type="auto" w:w="0"/>
+        <w:jc w:val="center"/>
+        <w:tblLook w:firstColumn="1" w:firstRow="1" w:lastColumn="0" w:lastRow="0" w:noHBand="0" w:noVBand="1" w:val="04A0"/>
+      </w:tblPr>
+      <w:tblGrid>
+        <w:gridCol w:w="3137"/>
+        <w:gridCol w:w="3137"/>
+        <w:gridCol w:w="3137"/>
+      </w:tblGrid>
+      <w:tr>
+        <w:tc>
+          <w:tcPr>
+            <w:tcW w:type="dxa" w:w="907"/>
+            <w:shd w:val="clear" w:color="auto" w:fill="F0E7DC"/>
+          </w:tcPr>
+          <w:p>
+            <w:r/>
+            <w:r>
+              <w:rPr>
+                <w:b/>
+                <w:sz w:val="18"/>
+              </w:rPr>
+              <w:t>Version</w:t>
+            </w:r>
+          </w:p>
+        </w:tc>
+        <w:tc>
+          <w:tcPr>
+            <w:tcW w:type="dxa" w:w="5669"/>
+            <w:shd w:val="clear" w:color="auto" w:fill="F0E7DC"/>
+          </w:tcPr>
+          <w:p>
+            <w:r/>
+            <w:r>
+              <w:rPr>
+                <w:b/>
+                <w:sz w:val="18"/>
+              </w:rPr>
+              <w:t>Change</w:t>
+            </w:r>
+          </w:p>
+        </w:tc>
+        <w:tc>
+          <w:tcPr>
+            <w:tcW w:type="dxa" w:w="2778"/>
+            <w:shd w:val="clear" w:color="auto" w:fill="F0E7DC"/>
+          </w:tcPr>
+          <w:p>
+            <w:r/>
+            <w:r>
+              <w:rPr>
+                <w:b/>
+                <w:sz w:val="18"/>
+              </w:rPr>
+              <w:t>Trigger</w:t>
+            </w:r>
+          </w:p>
+        </w:tc>
+      </w:tr>
+      <w:tr>
+        <w:tc>
+          <w:tcPr>
+            <w:tcW w:type="dxa" w:w="907"/>
+          </w:tcPr>
+          <w:p>
+            <w:r>
+              <w:rPr>
+                <w:sz w:val="18"/>
+              </w:rPr>
+            </w:r>
+            <w:r>
+              <w:rPr>
+                <w:sz w:val="18"/>
+              </w:rPr>
+              <w:t>1.0</w:t>
+            </w:r>
+          </w:p>
+        </w:tc>
+        <w:tc>
+          <w:tcPr>
+            <w:tcW w:type="dxa" w:w="5669"/>
+          </w:tcPr>
+          <w:p>
+            <w:r>
+              <w:rPr>
+                <w:sz w:val="18"/>
+              </w:rPr>
+            </w:r>
+            <w:r>
+              <w:rPr>
+                <w:sz w:val="18"/>
+              </w:rPr>
+              <w:t>Initial design and implementation.</w:t>
+            </w:r>
+          </w:p>
+        </w:tc>
+        <w:tc>
+          <w:tcPr>
+            <w:tcW w:type="dxa" w:w="2778"/>
+          </w:tcPr>
+          <w:p>
+            <w:r>
+              <w:rPr>
+                <w:sz w:val="18"/>
+              </w:rPr>
+            </w:r>
+            <w:r>
+              <w:rPr>
+                <w:sz w:val="18"/>
+              </w:rPr>
+              <w:t>—</w:t>
+            </w:r>
+          </w:p>
+        </w:tc>
+      </w:tr>
+      <w:tr>
+        <w:tc>
+          <w:tcPr>
+            <w:tcW w:type="dxa" w:w="907"/>
+          </w:tcPr>
+          <w:p>
+            <w:r>
+              <w:rPr>
+                <w:sz w:val="18"/>
+              </w:rPr>
+            </w:r>
+            <w:r>
+              <w:rPr>
+                <w:sz w:val="18"/>
+              </w:rPr>
+              <w:t>1.2</w:t>
+            </w:r>
+          </w:p>
+        </w:tc>
+        <w:tc>
+          <w:tcPr>
+            <w:tcW w:type="dxa" w:w="5669"/>
+          </w:tcPr>
+          <w:p>
+            <w:r>
+              <w:rPr>
+                <w:sz w:val="18"/>
+              </w:rPr>
+            </w:r>
+            <w:r>
+              <w:rPr>
+                <w:sz w:val="18"/>
+              </w:rPr>
+              <w:t>Footer link removed — editor reachable only via the unlisted /admin/ URL (§5.4, D6). Media uploads removed (§5.6, D16). Site-styled live preview templates for menu, announcement, hours and blog (§5.5). Logo redrawn for the dark theme. Documented the remembered sign-in / Sign Out behaviour and the localhost-only local option (§10, §12). E2e test extended accordingly.</w:t>
+            </w:r>
+          </w:p>
+        </w:tc>
+        <w:tc>
+          <w:tcPr>
+            <w:tcW w:type="dxa" w:w="2778"/>
+          </w:tcPr>
+          <w:p>
+            <w:r>
+              <w:rPr>
+                <w:sz w:val="18"/>
+              </w:rPr>
+            </w:r>
+            <w:r>
+              <w:rPr>
+                <w:sz w:val="18"/>
+              </w:rPr>
+              <w:t>Owner feedback after the first production use: keep the editor hidden from the public and bots; no media uploads; preview should look like the website; local option “disappeared” after the first sign-in; a visual defect.</w:t>
+            </w:r>
+          </w:p>
+        </w:tc>
+      </w:tr>
+      <w:tr>
+        <w:tc>
+          <w:tcPr>
+            <w:tcW w:type="dxa" w:w="907"/>
+          </w:tcPr>
+          <w:p>
+            <w:r>
+              <w:rPr>
+                <w:sz w:val="18"/>
+              </w:rPr>
+            </w:r>
+            <w:r>
+              <w:rPr>
+                <w:sz w:val="18"/>
+              </w:rPr>
+              <w:t>1.1</w:t>
+            </w:r>
+          </w:p>
+        </w:tc>
+        <w:tc>
+          <w:tcPr>
+            <w:tcW w:type="dxa" w:w="5669"/>
+          </w:tcPr>
+          <w:p>
+            <w:r>
+              <w:rPr>
+                <w:sz w:val="18"/>
+              </w:rPr>
+            </w:r>
+            <w:r>
+              <w:rPr>
+                <w:rFonts w:ascii="Consolas" w:hAnsi="Consolas" w:eastAsia="Consolas"/>
+                <w:sz w:val="18"/>
+              </w:rPr>
+              <w:t>backend.branch</w:t>
+            </w:r>
+            <w:r>
+              <w:rPr>
+                <w:sz w:val="18"/>
+              </w:rPr>
+              <w:t xml:space="preserve"> removed so the editor follows the repository's default branch (D15); runbook step 0 and troubleshooting entry added (§12, §15). Build log reviewed: chunk-size limit raised for the editor bundle, hook filters added to the project's Vite plugins, config-loader notice fixed (§8.3). End-to-end test: raw-Markdown input instead of simulated keystrokes, explicit browser-setup script and hint (§11).</w:t>
+            </w:r>
+          </w:p>
+        </w:tc>
+        <w:tc>
+          <w:tcPr>
+            <w:tcW w:type="dxa" w:w="2778"/>
+          </w:tcPr>
+          <w:p>
+            <w:r>
+              <w:rPr>
+                <w:sz w:val="18"/>
+              </w:rPr>
+            </w:r>
+            <w:r>
+              <w:rPr>
+                <w:sz w:val="18"/>
+              </w:rPr>
+              <w:t>First external deployment and test run: editor showed no existing data although creating entries and the pull request worked; two build warnings; one flaky scenario; Playwright browser not installed.</w:t>
             </w:r>
           </w:p>
         </w:tc>
@@ -8253,7 +9013,7 @@
               <w:rPr>
                 <w:sz w:val="17"/>
               </w:rPr>
-              <w:t>src/components/Navbar.tsx, MenuSection.tsx, ArticlesSection.tsx, HoursAndLocation.tsx, Footer.tsx</w:t>
+              <w:t>src/components/Navbar.tsx, MenuSection.tsx, ArticlesSection.tsx, HoursAndLocation.tsx</w:t>
             </w:r>
           </w:p>
         </w:tc>
@@ -8271,7 +9031,7 @@
               <w:rPr>
                 <w:sz w:val="17"/>
               </w:rPr>
-              <w:t>Consume content/; footer hosts the hidden link</w:t>
+              <w:t>Consume content/ (the footer no longer links to the editor)</w:t>
             </w:r>
           </w:p>
         </w:tc>
@@ -8291,7 +9051,7 @@
               <w:rPr>
                 <w:sz w:val="17"/>
               </w:rPr>
-              <w:t>admin/index.html, src/admin/main.ts, src/admin/config.ts, src/admin/theme.css, src/admin/preview.css, public/admin/logo.svg</w:t>
+              <w:t>admin/index.html, src/admin/main.ts, src/admin/config.ts, src/admin/theme.css, src/admin/preview/templates.tsx, src/admin/preview/preview.css, public/admin/logo.svg</w:t>
             </w:r>
           </w:p>
         </w:tc>
@@ -8309,7 +9069,7 @@
               <w:rPr>
                 <w:sz w:val="17"/>
               </w:rPr>
-              <w:t>The editor: entry page, bootstrap, typed configuration, site theme, preview styles, logo</w:t>
+              <w:t>The editor: entry page, bootstrap, typed configuration, site theme (incl. hiding the asset UI), site-styled preview templates + stylesheet, logo</w:t>
             </w:r>
           </w:p>
         </w:tc>
@@ -8660,7 +9420,7 @@
       <w:r>
         <w:drawing>
           <wp:inline xmlns:a="http://schemas.openxmlformats.org/drawingml/2006/main" xmlns:pic="http://schemas.openxmlformats.org/drawingml/2006/picture">
-            <wp:extent cx="5940000" cy="510469"/>
+            <wp:extent cx="5580000" cy="3487500"/>
             <wp:docPr id="7" name="Picture 7"/>
             <wp:cNvGraphicFramePr>
               <a:graphicFrameLocks noChangeAspect="1"/>
@@ -8669,7 +9429,7 @@
               <a:graphicData uri="http://schemas.openxmlformats.org/drawingml/2006/picture">
                 <pic:pic>
                   <pic:nvPicPr>
-                    <pic:cNvPr id="0" name="15-hidden-footer-link.png"/>
+                    <pic:cNvPr id="0" name="03-collections.png"/>
                     <pic:cNvPicPr/>
                   </pic:nvPicPr>
                   <pic:blipFill>
@@ -8681,7 +9441,7 @@
                   <pic:spPr>
                     <a:xfrm>
                       <a:off x="0" y="0"/>
-                      <a:ext cx="5940000" cy="510469"/>
+                      <a:ext cx="5580000" cy="3487500"/>
                     </a:xfrm>
                     <a:prstGeom prst="rect"/>
                   </pic:spPr>
@@ -8703,7 +9463,7 @@
           <w:i/>
           <w:sz w:val="18"/>
         </w:rPr>
-        <w:t>B-2 — The hidden ✎ link in the site footer (shown while hovered).</w:t>
+        <w:t>B-2 — Collections after sign-in: Blog Posts and Site Content (no Assets area).</w:t>
       </w:r>
     </w:p>
     <w:p>
@@ -8722,7 +9482,7 @@
               <a:graphicData uri="http://schemas.openxmlformats.org/drawingml/2006/picture">
                 <pic:pic>
                   <pic:nvPicPr>
-                    <pic:cNvPr id="0" name="03-collections.png"/>
+                    <pic:cNvPr id="0" name="04-site-content.png"/>
                     <pic:cNvPicPr/>
                   </pic:nvPicPr>
                   <pic:blipFill>
@@ -8756,7 +9516,7 @@
           <w:i/>
           <w:sz w:val="18"/>
         </w:rPr>
-        <w:t>B-3 — Collections after sign-in: Blog Posts and Site Content.</w:t>
+        <w:t>B-3 — Site Content: Daily Menu, Dough Announcement, Opening Hours.</w:t>
       </w:r>
     </w:p>
     <w:p>
@@ -8775,7 +9535,60 @@
               <a:graphicData uri="http://schemas.openxmlformats.org/drawingml/2006/picture">
                 <pic:pic>
                   <pic:nvPicPr>
-                    <pic:cNvPr id="0" name="04-site-content.png"/>
+                    <pic:cNvPr id="0" name="05-menu-editor.png"/>
+                    <pic:cNvPicPr/>
+                  </pic:nvPicPr>
+                  <pic:blipFill>
+                    <a:blip r:embed="rId10"/>
+                    <a:stretch>
+                      <a:fillRect/>
+                    </a:stretch>
+                  </pic:blipFill>
+                  <pic:spPr>
+                    <a:xfrm>
+                      <a:off x="0" y="0"/>
+                      <a:ext cx="5580000" cy="3487500"/>
+                    </a:xfrm>
+                    <a:prstGeom prst="rect"/>
+                  </pic:spPr>
+                </pic:pic>
+              </a:graphicData>
+            </a:graphic>
+          </wp:inline>
+        </w:drawing>
+      </w:r>
+    </w:p>
+    <w:p>
+      <w:pPr>
+        <w:spacing w:after="200"/>
+        <w:jc w:val="center"/>
+      </w:pPr>
+      <w:r>
+        <w:rPr>
+          <w:b w:val="0"/>
+          <w:i/>
+          <w:sz w:val="18"/>
+        </w:rPr>
+        <w:t>B-4 — Daily Menu editor with the site-styled preview (menu cards, prices, badges).</w:t>
+      </w:r>
+    </w:p>
+    <w:p>
+      <w:pPr>
+        <w:jc w:val="center"/>
+      </w:pPr>
+      <w:r>
+        <w:drawing>
+          <wp:inline xmlns:a="http://schemas.openxmlformats.org/drawingml/2006/main" xmlns:pic="http://schemas.openxmlformats.org/drawingml/2006/picture">
+            <wp:extent cx="5580000" cy="3487500"/>
+            <wp:docPr id="10" name="Picture 10"/>
+            <wp:cNvGraphicFramePr>
+              <a:graphicFrameLocks noChangeAspect="1"/>
+            </wp:cNvGraphicFramePr>
+            <a:graphic>
+              <a:graphicData uri="http://schemas.openxmlformats.org/drawingml/2006/picture">
+                <pic:pic>
+                  <pic:nvPicPr>
+                    <pic:cNvPr id="0" name="06-menu-price-edited.png"/>
                     <pic:cNvPicPr/>
                   </pic:nvPicPr>
                   <pic:blipFill>
@@ -8809,60 +9622,7 @@
           <w:i/>
           <w:sz w:val="18"/>
         </w:rPr>
-        <w:t>B-4 — Site Content: Daily Menu, Dough Announcement, Opening Hours.</w:t>
-      </w:r>
-    </w:p>
-    <w:p>
-      <w:pPr>
-        <w:jc w:val="center"/>
-      </w:pPr>
-      <w:r>
-        <w:drawing>
-          <wp:inline xmlns:a="http://schemas.openxmlformats.org/drawingml/2006/main" xmlns:pic="http://schemas.openxmlformats.org/drawingml/2006/picture">
-            <wp:extent cx="5580000" cy="3487500"/>
-            <wp:docPr id="10" name="Picture 10"/>
-            <wp:cNvGraphicFramePr>
-              <a:graphicFrameLocks noChangeAspect="1"/>
-            </wp:cNvGraphicFramePr>
-            <a:graphic>
-              <a:graphicData uri="http://schemas.openxmlformats.org/drawingml/2006/picture">
-                <pic:pic>
-                  <pic:nvPicPr>
-                    <pic:cNvPr id="0" name="06-menu-price-edited.png"/>
-                    <pic:cNvPicPr/>
-                  </pic:nvPicPr>
-                  <pic:blipFill>
-                    <a:blip r:embed="rId18"/>
-                    <a:stretch>
-                      <a:fillRect/>
-                    </a:stretch>
-                  </pic:blipFill>
-                  <pic:spPr>
-                    <a:xfrm>
-                      <a:off x="0" y="0"/>
-                      <a:ext cx="5580000" cy="3487500"/>
-                    </a:xfrm>
-                    <a:prstGeom prst="rect"/>
-                  </pic:spPr>
-                </pic:pic>
-              </a:graphicData>
-            </a:graphic>
-          </wp:inline>
-        </w:drawing>
-      </w:r>
-    </w:p>
-    <w:p>
-      <w:pPr>
-        <w:spacing w:after="200"/>
-        <w:jc w:val="center"/>
-      </w:pPr>
-      <w:r>
-        <w:rPr>
-          <w:b w:val="0"/>
-          <w:i/>
-          <w:sz w:val="18"/>
-        </w:rPr>
-        <w:t>B-5 — Editing a menu item (price changed).</w:t>
+        <w:t>B-5 — Editing a menu item (price changed; the preview follows).</w:t>
       </w:r>
     </w:p>
     <w:p>
@@ -8885,7 +9645,7 @@
                     <pic:cNvPicPr/>
                   </pic:nvPicPr>
                   <pic:blipFill>
-                    <a:blip r:embed="rId19"/>
+                    <a:blip r:embed="rId18"/>
                     <a:stretch>
                       <a:fillRect/>
                     </a:stretch>
@@ -8938,7 +9698,7 @@
                     <pic:cNvPicPr/>
                   </pic:nvPicPr>
                   <pic:blipFill>
-                    <a:blip r:embed="rId20"/>
+                    <a:blip r:embed="rId19"/>
                     <a:stretch>
                       <a:fillRect/>
                     </a:stretch>
@@ -8991,7 +9751,7 @@
                     <pic:cNvPicPr/>
                   </pic:nvPicPr>
                   <pic:blipFill>
-                    <a:blip r:embed="rId21"/>
+                    <a:blip r:embed="rId20"/>
                     <a:stretch>
                       <a:fillRect/>
                     </a:stretch>
@@ -9044,7 +9804,7 @@
                     <pic:cNvPicPr/>
                   </pic:nvPicPr>
                   <pic:blipFill>
-                    <a:blip r:embed="rId22"/>
+                    <a:blip r:embed="rId21"/>
                     <a:stretch>
                       <a:fillRect/>
                     </a:stretch>
@@ -9097,6 +9857,59 @@
                     <pic:cNvPicPr/>
                   </pic:nvPicPr>
                   <pic:blipFill>
+                    <a:blip r:embed="rId22"/>
+                    <a:stretch>
+                      <a:fillRect/>
+                    </a:stretch>
+                  </pic:blipFill>
+                  <pic:spPr>
+                    <a:xfrm>
+                      <a:off x="0" y="0"/>
+                      <a:ext cx="5580000" cy="3487500"/>
+                    </a:xfrm>
+                    <a:prstGeom prst="rect"/>
+                  </pic:spPr>
+                </pic:pic>
+              </a:graphicData>
+            </a:graphic>
+          </wp:inline>
+        </w:drawing>
+      </w:r>
+    </w:p>
+    <w:p>
+      <w:pPr>
+        <w:spacing w:after="200"/>
+        <w:jc w:val="center"/>
+      </w:pPr>
+      <w:r>
+        <w:rPr>
+          <w:b w:val="0"/>
+          <w:i/>
+          <w:sz w:val="18"/>
+        </w:rPr>
+        <w:t>B-10 — Blog post editor; the preview renders the post card and essay in the site's journal style.</w:t>
+      </w:r>
+    </w:p>
+    <w:p>
+      <w:pPr>
+        <w:jc w:val="center"/>
+      </w:pPr>
+      <w:r>
+        <w:drawing>
+          <wp:inline xmlns:a="http://schemas.openxmlformats.org/drawingml/2006/main" xmlns:pic="http://schemas.openxmlformats.org/drawingml/2006/picture">
+            <wp:extent cx="5580000" cy="3487500"/>
+            <wp:docPr id="16" name="Picture 16"/>
+            <wp:cNvGraphicFramePr>
+              <a:graphicFrameLocks noChangeAspect="1"/>
+            </wp:cNvGraphicFramePr>
+            <a:graphic>
+              <a:graphicData uri="http://schemas.openxmlformats.org/drawingml/2006/picture">
+                <pic:pic>
+                  <pic:nvPicPr>
+                    <pic:cNvPr id="0" name="13-announcement-editor.png"/>
+                    <pic:cNvPicPr/>
+                  </pic:nvPicPr>
+                  <pic:blipFill>
                     <a:blip r:embed="rId23"/>
                     <a:stretch>
                       <a:fillRect/>
@@ -9127,60 +9940,7 @@
           <w:i/>
           <w:sz w:val="18"/>
         </w:rPr>
-        <w:t>B-10 — Blog post editor with heading, quote and takeaways.</w:t>
-      </w:r>
-    </w:p>
-    <w:p>
-      <w:pPr>
-        <w:jc w:val="center"/>
-      </w:pPr>
-      <w:r>
-        <w:drawing>
-          <wp:inline xmlns:a="http://schemas.openxmlformats.org/drawingml/2006/main" xmlns:pic="http://schemas.openxmlformats.org/drawingml/2006/picture">
-            <wp:extent cx="5580000" cy="3487500"/>
-            <wp:docPr id="16" name="Picture 16"/>
-            <wp:cNvGraphicFramePr>
-              <a:graphicFrameLocks noChangeAspect="1"/>
-            </wp:cNvGraphicFramePr>
-            <a:graphic>
-              <a:graphicData uri="http://schemas.openxmlformats.org/drawingml/2006/picture">
-                <pic:pic>
-                  <pic:nvPicPr>
-                    <pic:cNvPr id="0" name="13-announcement-editor.png"/>
-                    <pic:cNvPicPr/>
-                  </pic:nvPicPr>
-                  <pic:blipFill>
-                    <a:blip r:embed="rId24"/>
-                    <a:stretch>
-                      <a:fillRect/>
-                    </a:stretch>
-                  </pic:blipFill>
-                  <pic:spPr>
-                    <a:xfrm>
-                      <a:off x="0" y="0"/>
-                      <a:ext cx="5580000" cy="3487500"/>
-                    </a:xfrm>
-                    <a:prstGeom prst="rect"/>
-                  </pic:spPr>
-                </pic:pic>
-              </a:graphicData>
-            </a:graphic>
-          </wp:inline>
-        </w:drawing>
-      </w:r>
-    </w:p>
-    <w:p>
-      <w:pPr>
-        <w:spacing w:after="200"/>
-        <w:jc w:val="center"/>
-      </w:pPr>
-      <w:r>
-        <w:rPr>
-          <w:b w:val="0"/>
-          <w:i/>
-          <w:sz w:val="18"/>
-        </w:rPr>
-        <w:t>B-11 — Dough announcement editor.</w:t>
+        <w:t>B-11 — Dough announcement editor: the preview shows the strip above the real site header.</w:t>
       </w:r>
     </w:p>
     <w:p>
@@ -9203,7 +9963,7 @@
                     <pic:cNvPicPr/>
                   </pic:nvPicPr>
                   <pic:blipFill>
-                    <a:blip r:embed="rId25"/>
+                    <a:blip r:embed="rId24"/>
                     <a:stretch>
                       <a:fillRect/>
                     </a:stretch>
@@ -9256,7 +10016,7 @@
                     <pic:cNvPicPr/>
                   </pic:nvPicPr>
                   <pic:blipFill>
-                    <a:blip r:embed="rId26"/>
+                    <a:blip r:embed="rId25"/>
                     <a:stretch>
                       <a:fillRect/>
                     </a:stretch>
@@ -9286,7 +10046,7 @@
           <w:i/>
           <w:sz w:val="18"/>
         </w:rPr>
-        <w:t>B-13 — Local repository mode editing Opening Hours (day names are read-only).</w:t>
+        <w:t>B-13 — Local repository mode editing Opening Hours (day names are read-only); preview shows the Weekly Schedule table.</w:t>
       </w:r>
     </w:p>
     <w:sectPr>

</xml_diff>

<commit_message>
Expanded workflow card descriptions
</commit_message>
<xml_diff>
--- a/docs/Technical-Design-Document.docx
+++ b/docs/Technical-Design-Document.docx
@@ -231,7 +231,7 @@
               <w:rPr>
                 <w:sz w:val="18"/>
               </w:rPr>
-              <w:t>1.2 — 15 October 2026 (see §16 Revision history)</w:t>
+              <w:t>1.3 — 16 October 2026 (see §16 Revision history)</w:t>
             </w:r>
           </w:p>
         </w:tc>
@@ -2100,6 +2100,298 @@
               <w:rPr>
                 <w:sz w:val="18"/>
               </w:rPr>
+              <w:t>content/menu-items/&lt;slug&gt;.json</w:t>
+            </w:r>
+          </w:p>
+        </w:tc>
+        <w:tc>
+          <w:tcPr>
+            <w:tcW w:type="dxa" w:w="3572"/>
+          </w:tcPr>
+          <w:p>
+            <w:r>
+              <w:rPr>
+                <w:sz w:val="18"/>
+              </w:rPr>
+            </w:r>
+            <w:r>
+              <w:rPr>
+                <w:sz w:val="18"/>
+              </w:rPr>
+              <w:t xml:space="preserve">JSON — </w:t>
+            </w:r>
+            <w:r>
+              <w:rPr>
+                <w:rFonts w:ascii="Consolas" w:hAnsi="Consolas" w:eastAsia="Consolas"/>
+                <w:sz w:val="18"/>
+              </w:rPr>
+              <w:t>name</w:t>
+            </w:r>
+            <w:r>
+              <w:rPr>
+                <w:sz w:val="18"/>
+              </w:rPr>
+              <w:t xml:space="preserve">, </w:t>
+            </w:r>
+            <w:r>
+              <w:rPr>
+                <w:rFonts w:ascii="Consolas" w:hAnsi="Consolas" w:eastAsia="Consolas"/>
+                <w:sz w:val="18"/>
+              </w:rPr>
+              <w:t>label</w:t>
+            </w:r>
+            <w:r>
+              <w:rPr>
+                <w:sz w:val="18"/>
+              </w:rPr>
+              <w:t xml:space="preserve"> (computed: Section › Name — $price), </w:t>
+            </w:r>
+            <w:r>
+              <w:rPr>
+                <w:rFonts w:ascii="Consolas" w:hAnsi="Consolas" w:eastAsia="Consolas"/>
+                <w:sz w:val="18"/>
+              </w:rPr>
+              <w:t>section</w:t>
+            </w:r>
+            <w:r>
+              <w:rPr>
+                <w:sz w:val="18"/>
+              </w:rPr>
+              <w:t xml:space="preserve"> (title of a menu section), </w:t>
+            </w:r>
+            <w:r>
+              <w:rPr>
+                <w:rFonts w:ascii="Consolas" w:hAnsi="Consolas" w:eastAsia="Consolas"/>
+                <w:sz w:val="18"/>
+              </w:rPr>
+              <w:t>italianName</w:t>
+            </w:r>
+            <w:r>
+              <w:rPr>
+                <w:sz w:val="18"/>
+              </w:rPr>
+              <w:t xml:space="preserve">, </w:t>
+            </w:r>
+            <w:r>
+              <w:rPr>
+                <w:rFonts w:ascii="Consolas" w:hAnsi="Consolas" w:eastAsia="Consolas"/>
+                <w:sz w:val="18"/>
+              </w:rPr>
+              <w:t>description</w:t>
+            </w:r>
+            <w:r>
+              <w:rPr>
+                <w:sz w:val="18"/>
+              </w:rPr>
+              <w:t xml:space="preserve">, </w:t>
+            </w:r>
+            <w:r>
+              <w:rPr>
+                <w:rFonts w:ascii="Consolas" w:hAnsi="Consolas" w:eastAsia="Consolas"/>
+                <w:sz w:val="18"/>
+              </w:rPr>
+              <w:t>price</w:t>
+            </w:r>
+            <w:r>
+              <w:rPr>
+                <w:sz w:val="18"/>
+              </w:rPr>
+              <w:t xml:space="preserve">, </w:t>
+            </w:r>
+            <w:r>
+              <w:rPr>
+                <w:rFonts w:ascii="Consolas" w:hAnsi="Consolas" w:eastAsia="Consolas"/>
+                <w:sz w:val="18"/>
+              </w:rPr>
+              <w:t>tags[]</w:t>
+            </w:r>
+            <w:r>
+              <w:rPr>
+                <w:sz w:val="18"/>
+              </w:rPr>
+              <w:t xml:space="preserve">, </w:t>
+            </w:r>
+            <w:r>
+              <w:rPr>
+                <w:rFonts w:ascii="Consolas" w:hAnsi="Consolas" w:eastAsia="Consolas"/>
+                <w:sz w:val="18"/>
+              </w:rPr>
+              <w:t>order</w:t>
+            </w:r>
+            <w:r>
+              <w:rPr>
+                <w:sz w:val="18"/>
+              </w:rPr>
+              <w:t xml:space="preserve">, </w:t>
+            </w:r>
+            <w:r>
+              <w:rPr>
+                <w:rFonts w:ascii="Consolas" w:hAnsi="Consolas" w:eastAsia="Consolas"/>
+                <w:sz w:val="18"/>
+              </w:rPr>
+              <w:t>visible</w:t>
+            </w:r>
+          </w:p>
+        </w:tc>
+        <w:tc>
+          <w:tcPr>
+            <w:tcW w:type="dxa" w:w="1984"/>
+          </w:tcPr>
+          <w:p>
+            <w:r>
+              <w:rPr>
+                <w:sz w:val="18"/>
+              </w:rPr>
+            </w:r>
+            <w:r>
+              <w:rPr>
+                <w:sz w:val="18"/>
+              </w:rPr>
+              <w:t>Menu Items (one entry per dish/drink)</w:t>
+            </w:r>
+          </w:p>
+        </w:tc>
+        <w:tc>
+          <w:tcPr>
+            <w:tcW w:type="dxa" w:w="1417"/>
+          </w:tcPr>
+          <w:p>
+            <w:r>
+              <w:rPr>
+                <w:sz w:val="18"/>
+              </w:rPr>
+            </w:r>
+            <w:r>
+              <w:rPr>
+                <w:sz w:val="18"/>
+              </w:rPr>
+              <w:t>MenuSection.tsx via the loader</w:t>
+            </w:r>
+          </w:p>
+        </w:tc>
+      </w:tr>
+      <w:tr>
+        <w:tc>
+          <w:tcPr>
+            <w:tcW w:type="dxa" w:w="2381"/>
+          </w:tcPr>
+          <w:p>
+            <w:r>
+              <w:rPr>
+                <w:sz w:val="18"/>
+              </w:rPr>
+            </w:r>
+            <w:r>
+              <w:rPr>
+                <w:sz w:val="18"/>
+              </w:rPr>
+              <w:t>content/menu-sections/&lt;slug&gt;.json</w:t>
+            </w:r>
+          </w:p>
+        </w:tc>
+        <w:tc>
+          <w:tcPr>
+            <w:tcW w:type="dxa" w:w="3572"/>
+          </w:tcPr>
+          <w:p>
+            <w:r>
+              <w:rPr>
+                <w:sz w:val="18"/>
+              </w:rPr>
+            </w:r>
+            <w:r>
+              <w:rPr>
+                <w:sz w:val="18"/>
+              </w:rPr>
+              <w:t xml:space="preserve">JSON — </w:t>
+            </w:r>
+            <w:r>
+              <w:rPr>
+                <w:rFonts w:ascii="Consolas" w:hAnsi="Consolas" w:eastAsia="Consolas"/>
+                <w:sz w:val="18"/>
+              </w:rPr>
+              <w:t>title</w:t>
+            </w:r>
+            <w:r>
+              <w:rPr>
+                <w:sz w:val="18"/>
+              </w:rPr>
+              <w:t xml:space="preserve">, </w:t>
+            </w:r>
+            <w:r>
+              <w:rPr>
+                <w:rFonts w:ascii="Consolas" w:hAnsi="Consolas" w:eastAsia="Consolas"/>
+                <w:sz w:val="18"/>
+              </w:rPr>
+              <w:t>subtitle</w:t>
+            </w:r>
+            <w:r>
+              <w:rPr>
+                <w:sz w:val="18"/>
+              </w:rPr>
+              <w:t xml:space="preserve">, </w:t>
+            </w:r>
+            <w:r>
+              <w:rPr>
+                <w:rFonts w:ascii="Consolas" w:hAnsi="Consolas" w:eastAsia="Consolas"/>
+                <w:sz w:val="18"/>
+              </w:rPr>
+              <w:t>order</w:t>
+            </w:r>
+          </w:p>
+        </w:tc>
+        <w:tc>
+          <w:tcPr>
+            <w:tcW w:type="dxa" w:w="1984"/>
+          </w:tcPr>
+          <w:p>
+            <w:r>
+              <w:rPr>
+                <w:sz w:val="18"/>
+              </w:rPr>
+            </w:r>
+            <w:r>
+              <w:rPr>
+                <w:sz w:val="18"/>
+              </w:rPr>
+              <w:t>Menu Sections (one entry per heading)</w:t>
+            </w:r>
+          </w:p>
+        </w:tc>
+        <w:tc>
+          <w:tcPr>
+            <w:tcW w:type="dxa" w:w="1417"/>
+          </w:tcPr>
+          <w:p>
+            <w:r>
+              <w:rPr>
+                <w:sz w:val="18"/>
+              </w:rPr>
+            </w:r>
+            <w:r>
+              <w:rPr>
+                <w:sz w:val="18"/>
+              </w:rPr>
+              <w:t>MenuSection.tsx via the loader</w:t>
+            </w:r>
+          </w:p>
+        </w:tc>
+      </w:tr>
+      <w:tr>
+        <w:tc>
+          <w:tcPr>
+            <w:tcW w:type="dxa" w:w="2381"/>
+          </w:tcPr>
+          <w:p>
+            <w:r>
+              <w:rPr>
+                <w:sz w:val="18"/>
+              </w:rPr>
+            </w:r>
+            <w:r>
+              <w:rPr>
+                <w:sz w:val="18"/>
+              </w:rPr>
               <w:t>content/menu.json</w:t>
             </w:r>
           </w:p>
@@ -2127,32 +2419,6 @@
               </w:rPr>
               <w:t>intro</w:t>
             </w:r>
-            <w:r>
-              <w:rPr>
-                <w:sz w:val="18"/>
-              </w:rPr>
-              <w:t xml:space="preserve">, </w:t>
-            </w:r>
-            <w:r>
-              <w:rPr>
-                <w:rFonts w:ascii="Consolas" w:hAnsi="Consolas" w:eastAsia="Consolas"/>
-                <w:sz w:val="18"/>
-              </w:rPr>
-              <w:t>categories[]</w:t>
-            </w:r>
-            <w:r>
-              <w:rPr>
-                <w:sz w:val="18"/>
-              </w:rPr>
-              <w:t xml:space="preserve"> → </w:t>
-            </w:r>
-            <w:r>
-              <w:rPr>
-                <w:rFonts w:ascii="Consolas" w:hAnsi="Consolas" w:eastAsia="Consolas"/>
-                <w:sz w:val="18"/>
-              </w:rPr>
-              <w:t>items[]</w:t>
-            </w:r>
           </w:p>
         </w:tc>
         <w:tc>
@@ -2169,7 +2435,7 @@
               <w:rPr>
                 <w:sz w:val="18"/>
               </w:rPr>
-              <w:t>Site Content → Daily Menu</w:t>
+              <w:t>Site Content → Menu Introduction</w:t>
             </w:r>
           </w:p>
         </w:tc>
@@ -2477,6 +2743,44 @@
           <w:i w:val="0"/>
         </w:rPr>
         <w:t>src/content/index.ts is the single import point. It gives every consumer a typed object (src/types.ts) and derives what the editor should not have to maintain:</w:t>
+      </w:r>
+    </w:p>
+    <w:p>
+      <w:pPr>
+        <w:pStyle w:val="ListBullet"/>
+      </w:pPr>
+      <w:r>
+        <w:t xml:space="preserve">The Daily Menu is assembled from three sources: sections sorted by </w:t>
+      </w:r>
+      <w:r>
+        <w:rPr>
+          <w:rFonts w:ascii="Consolas" w:hAnsi="Consolas" w:eastAsia="Consolas"/>
+          <w:sz w:val="19"/>
+        </w:rPr>
+        <w:t>order</w:t>
+      </w:r>
+      <w:r>
+        <w:t xml:space="preserve">, items (with </w:t>
+      </w:r>
+      <w:r>
+        <w:rPr>
+          <w:rFonts w:ascii="Consolas" w:hAnsi="Consolas" w:eastAsia="Consolas"/>
+          <w:sz w:val="19"/>
+        </w:rPr>
+        <w:t>visible: true</w:t>
+      </w:r>
+      <w:r>
+        <w:t xml:space="preserve">) sorted by </w:t>
+      </w:r>
+      <w:r>
+        <w:rPr>
+          <w:rFonts w:ascii="Consolas" w:hAnsi="Consolas" w:eastAsia="Consolas"/>
+          <w:sz w:val="19"/>
+        </w:rPr>
+        <w:t>order</w:t>
+      </w:r>
+      <w:r>
+        <w:t xml:space="preserve"> then name and attached to their section by title, and the introduction. An item whose section title matches no section is left out with a console warning (the CI validator rejects it earlier).</w:t>
       </w:r>
     </w:p>
     <w:p>
@@ -2575,7 +2879,24 @@
         <w:pStyle w:val="Heading2"/>
       </w:pPr>
       <w:r>
-        <w:t>4.3 Why JSON for structured data and Markdown for posts</w:t>
+        <w:t>4.3 Why one file per menu item (v1.3)</w:t>
+      </w:r>
+    </w:p>
+    <w:p>
+      <w:r>
+        <w:rPr>
+          <w:b w:val="0"/>
+          <w:i w:val="0"/>
+        </w:rPr>
+        <w:t>Versions 1.0–1.2 kept the whole menu in one menu.json with nested lists. That is the simplest editing screen, but every change — a price, a typo, a new dish — produced the same pull request (“update Site Content ‘menu’”) and the same workflow card (“Daily Menu”), which the kitchen staff could not tell apart. Sveltia's workflow cards and PR titles can only show an entry's identifier, so the granularity of the content model is the granularity of the review process. Splitting the menu into one JSON file per item (and per section) gives: a card and a pull request per dish that read “Neapolitan Pizzas (Pizze Nap… › Margherita Verace D.O.P. — $21”; small, readable diffs; no conflicts when two people edit different dishes; a per-item “Show on menu” switch for sold-out or seasonal dishes; and a grouped, sortable item list in the editor. The cost is that ordering is expressed with position numbers instead of drag-and-drop and that a section rename must be repeated on its items (§14).</w:t>
+      </w:r>
+    </w:p>
+    <w:p>
+      <w:pPr>
+        <w:pStyle w:val="Heading2"/>
+      </w:pPr>
+      <w:r>
+        <w:t>4.4 Why JSON for structured data and Markdown for posts</w:t>
       </w:r>
     </w:p>
     <w:p>
@@ -2816,7 +3137,20 @@
               <w:rPr>
                 <w:sz w:val="18"/>
               </w:rPr>
-              <w:t>Site Content → Daily Menu</w:t>
+              <w:t xml:space="preserve">Menu Items (folder collection </w:t>
+            </w:r>
+            <w:r>
+              <w:rPr>
+                <w:rFonts w:ascii="Consolas" w:hAnsi="Consolas" w:eastAsia="Consolas"/>
+                <w:sz w:val="18"/>
+              </w:rPr>
+              <w:t>menu-items</w:t>
+            </w:r>
+            <w:r>
+              <w:rPr>
+                <w:sz w:val="18"/>
+              </w:rPr>
+              <w:t>, JSON)</w:t>
             </w:r>
           </w:p>
         </w:tc>
@@ -2834,7 +3168,109 @@
               <w:rPr>
                 <w:sz w:val="18"/>
               </w:rPr>
-              <w:t>intro (≤400 chars); categories (1–8, reorderable) each with title (≤80), subtitle (≤200), items (1–30, reorderable) with name (2–80), italianName, description (≤300), price (number 0–500, step 0.5), tags (multi-select from a fixed badge vocabulary).</w:t>
+              <w:t xml:space="preserve">name (2–80, no &lt; &gt;), label (compute widget: </w:t>
+            </w:r>
+            <w:r>
+              <w:rPr>
+                <w:rFonts w:ascii="Consolas" w:hAnsi="Consolas" w:eastAsia="Consolas"/>
+                <w:sz w:val="18"/>
+              </w:rPr>
+              <w:t>{{fields.section | truncate(28)}} › {{fields.name}} — ${{fields.price}}</w:t>
+            </w:r>
+            <w:r>
+              <w:rPr>
+                <w:sz w:val="18"/>
+              </w:rPr>
+              <w:t>, used as the identifier so it is what cards and the GitHub PR list show), section (relation to Menu Sections, stored as the section title), italianName, description (≤300), price (0–500, step 0.5), tags (fixed badge vocabulary), order (1–999, default 50), visible (boolean). Slug from the name; list grouped by section and sorted by order.</w:t>
+            </w:r>
+          </w:p>
+        </w:tc>
+      </w:tr>
+      <w:tr>
+        <w:tc>
+          <w:tcPr>
+            <w:tcW w:type="dxa" w:w="2551"/>
+          </w:tcPr>
+          <w:p>
+            <w:r>
+              <w:rPr>
+                <w:sz w:val="18"/>
+              </w:rPr>
+            </w:r>
+            <w:r>
+              <w:rPr>
+                <w:sz w:val="18"/>
+              </w:rPr>
+              <w:t xml:space="preserve">Menu Sections (folder collection </w:t>
+            </w:r>
+            <w:r>
+              <w:rPr>
+                <w:rFonts w:ascii="Consolas" w:hAnsi="Consolas" w:eastAsia="Consolas"/>
+                <w:sz w:val="18"/>
+              </w:rPr>
+              <w:t>menu-sections</w:t>
+            </w:r>
+            <w:r>
+              <w:rPr>
+                <w:sz w:val="18"/>
+              </w:rPr>
+              <w:t>, JSON)</w:t>
+            </w:r>
+          </w:p>
+        </w:tc>
+        <w:tc>
+          <w:tcPr>
+            <w:tcW w:type="dxa" w:w="6803"/>
+          </w:tcPr>
+          <w:p>
+            <w:r>
+              <w:rPr>
+                <w:sz w:val="18"/>
+              </w:rPr>
+            </w:r>
+            <w:r>
+              <w:rPr>
+                <w:sz w:val="18"/>
+              </w:rPr>
+              <w:t>title (2–80), subtitle (≤200), order (1–999). Summary “order · title”.</w:t>
+            </w:r>
+          </w:p>
+        </w:tc>
+      </w:tr>
+      <w:tr>
+        <w:tc>
+          <w:tcPr>
+            <w:tcW w:type="dxa" w:w="2551"/>
+          </w:tcPr>
+          <w:p>
+            <w:r>
+              <w:rPr>
+                <w:sz w:val="18"/>
+              </w:rPr>
+            </w:r>
+            <w:r>
+              <w:rPr>
+                <w:sz w:val="18"/>
+              </w:rPr>
+              <w:t>Site Content → Menu Introduction</w:t>
+            </w:r>
+          </w:p>
+        </w:tc>
+        <w:tc>
+          <w:tcPr>
+            <w:tcW w:type="dxa" w:w="6803"/>
+          </w:tcPr>
+          <w:p>
+            <w:r>
+              <w:rPr>
+                <w:sz w:val="18"/>
+              </w:rPr>
+            </w:r>
+            <w:r>
+              <w:rPr>
+                <w:sz w:val="18"/>
+              </w:rPr>
+              <w:t>intro (≤400 chars).</w:t>
             </w:r>
           </w:p>
         </w:tc>
@@ -3871,7 +4307,7 @@
               <w:rPr>
                 <w:sz w:val="18"/>
               </w:rPr>
-              <w:t>cms/&lt;collection&gt;/&lt;slug&gt;, e.g. cms/site/menu, cms/blog/harvest-special-pumpkin-sage. One branch (and one PR) per entry; further saves of the same entry add commits to the same branch.</w:t>
+              <w:t>cms/&lt;collection&gt;/&lt;slug&gt;, e.g. cms/menu-items/margherita-verace-d-o-p, cms/blog/harvest-special-pumpkin-sage. One branch (and one PR) per entry; further saves of the same entry add commits to the same branch.</w:t>
             </w:r>
           </w:p>
         </w:tc>
@@ -4175,7 +4611,7 @@
         <w:pStyle w:val="Heading2"/>
       </w:pPr>
       <w:r>
-        <w:t>7.2 What the reviewer sees</w:t>
+        <w:t>7.2 Pull-request lifecycle versus the lanes — and why there is no “Published” lane</w:t>
       </w:r>
     </w:p>
     <w:p>
@@ -4184,7 +4620,109 @@
           <w:b w:val="0"/>
           <w:i w:val="0"/>
         </w:rPr>
-        <w:t>The pull request's Files changed tab shows a line-level diff of a JSON or Markdown file (e.g. `"price": 19` → `"price": 21`). The PR check summary lists the changed files. Because the validator and the build run on the exact merge result, a green check means the site will build with that content. If the check is red, the job log names the file, field and rule that failed (e.g. “content/menu.json: categories[0].items[2].description is longer than 300 characters”).</w:t>
+        <w:t>During the first production use the owner observed that pull requests exist while entries are still in Drafts and proposed a read-only final lane, “Published”, that would be the moment the pull request is actually opened. The proposal was examined against how Sveltia and GitHub work; the conclusion is to keep the standard behaviour, for the following reasons.</w:t>
+      </w:r>
+    </w:p>
+    <w:p>
+      <w:pPr>
+        <w:pStyle w:val="ListBullet"/>
+      </w:pPr>
+      <w:r>
+        <w:rPr>
+          <w:b/>
+        </w:rPr>
+        <w:t>A lane is a label, a card is a pull request.</w:t>
+      </w:r>
+      <w:r>
+        <w:t xml:space="preserve"> Sveltia stores no workflow state of its own: the Drafts/In Review/Ready columns are populated by listing the repository's open pull requests that carry a sveltia-cms/* label, and the position of a card is that label. The first Save therefore must create the branch and the pull request — there is nowhere else to keep a draft that another device, another editor or a reviewer could see. (Sveltia's “draft backup” in the browser only protects unsaved typing on one machine.)</w:t>
+      </w:r>
+    </w:p>
+    <w:p>
+      <w:pPr>
+        <w:pStyle w:val="ListBullet"/>
+      </w:pPr>
+      <w:r>
+        <w:rPr>
+          <w:b/>
+        </w:rPr>
+        <w:t>Lane moves do not create pull requests.</w:t>
+      </w:r>
+      <w:r>
+        <w:t xml:space="preserve"> Moving a card relabels the same PR and toggles GitHub's draft flag (Drafts ⇄ ready for review). The end-to-end test moves an entry In Review → Draft → In Review and asserts that exactly one pull request exists; the owner's own screenshot of PR #3 shows the same: one PR, labels added/removed as the card moved.</w:t>
+      </w:r>
+    </w:p>
+    <w:p>
+      <w:pPr>
+        <w:pStyle w:val="ListBullet"/>
+      </w:pPr>
+      <w:r>
+        <w:rPr>
+          <w:b/>
+        </w:rPr>
+        <w:t>GitHub's draft pull request is the “not yet” state the proposal asked for.</w:t>
+      </w:r>
+      <w:r>
+        <w:t xml:space="preserve"> While a card sits in Drafts its PR is a draft PR: GitHub does not request reviews for it, reviewers filter it out with </w:t>
+      </w:r>
+      <w:r>
+        <w:rPr>
+          <w:rFonts w:ascii="Consolas" w:hAnsi="Consolas" w:eastAsia="Consolas"/>
+          <w:sz w:val="19"/>
+        </w:rPr>
+        <w:t>is:pr draft:false</w:t>
+      </w:r>
+      <w:r>
+        <w:t>, the merge button is disabled, and the required status check still runs so problems surface early. “Send for Review” is the moment the team is asked to look. A “Published” lane cannot exist as a column because a merged PR is closed and leaves the board — publication is visible on the website and in GitHub's merged list instead.</w:t>
+      </w:r>
+    </w:p>
+    <w:p>
+      <w:pPr>
+        <w:pStyle w:val="ListBullet"/>
+      </w:pPr>
+      <w:r>
+        <w:rPr>
+          <w:b/>
+        </w:rPr>
+        <w:t>Alternatives considered.</w:t>
+      </w:r>
+      <w:r>
+        <w:t xml:space="preserve"> (a) </w:t>
+      </w:r>
+      <w:r>
+        <w:rPr>
+          <w:rFonts w:ascii="Consolas" w:hAnsi="Consolas" w:eastAsia="Consolas"/>
+          <w:sz w:val="19"/>
+        </w:rPr>
+        <w:t>publish_mode: simple</w:t>
+      </w:r>
+      <w:r>
+        <w:t xml:space="preserve"> (no workflow): every save commits straight to main — rejected by the brief. (b) Open Authoring: drafts live in a fork, but a PR is still opened at the same time. (c) A custom “save locally, open PR later” mode: not supported by Sveltia and would hide drafts from everyone but one browser. (d) Hiding the Ready column: not configurable; it is harmless (moving there only relabels) and the guide tells staff to use Draft and In Review only.</w:t>
+      </w:r>
+    </w:p>
+    <w:p>
+      <w:r>
+        <w:rPr>
+          <w:b w:val="0"/>
+          <w:i w:val="0"/>
+        </w:rPr>
+        <w:t>What was changed instead is the *legibility* of the cards and pull requests: item-level entries (§4.3) with a computed label, so the board reads “Section › Item — $price” and the PR list reads “update Menu Item ‘&lt;slug&gt;’”.</w:t>
+      </w:r>
+    </w:p>
+    <w:p>
+      <w:pPr>
+        <w:pStyle w:val="Heading2"/>
+      </w:pPr>
+      <w:r>
+        <w:t>7.3 What the reviewer sees</w:t>
+      </w:r>
+    </w:p>
+    <w:p>
+      <w:r>
+        <w:rPr>
+          <w:b w:val="0"/>
+          <w:i w:val="0"/>
+        </w:rPr>
+        <w:t>The pull request's Files changed tab shows a line-level diff of a JSON or Markdown file (e.g. `"price": 19` → `"price": 21`, plus the recomputed label line). The PR check summary lists the changed files. Because the validator and the build run on the exact merge result, a green check means the site will build with that content. If the check is red, the job log names the file, field and rule that failed (e.g. “content/menu.json: categories[0].items[2].description is longer than 300 characters”).</w:t>
       </w:r>
     </w:p>
     <w:p>
@@ -5686,7 +6224,7 @@
               <w:rPr>
                 <w:sz w:val="17"/>
               </w:rPr>
-              <w:t>Edit menu price → Save → Send for Review</w:t>
+              <w:t>Edit a menu item's price → Save → Send for Review → lane moves</w:t>
             </w:r>
           </w:p>
         </w:tc>
@@ -5704,7 +6242,63 @@
               <w:rPr>
                 <w:sz w:val="17"/>
               </w:rPr>
-              <w:t>Site-styled preview rendered (menu cards); Assets UI hidden; branch cms/site/menu from main; commit touches only content/menu.json; draft PR → main with label sveltia-cms/draft; after sending: ready for review + sveltia-cms/pending_review; main unchanged; committed JSON well-formed with numeric price; no Publish button</w:t>
+              <w:t>Item preview rendered and follows the price; branch cms/menu-items/&lt;slug&gt; from main; commit touches only content/menu.json; draft PR → main with label sveltia-cms/draft; after sending: ready for review + sveltia-cms/pending_review; main unchanged; committed JSON well-formed, numeric price, computed label, stable key order; In Review → Draft → In Review relabels the same PR (still exactly one); workflow card reads “Menu Item / Neapolitan Pizzas (Pizze Nap… › Margherita Verace D.O.P. — $21”; Assets UI hidden; no Publish button</w:t>
+            </w:r>
+          </w:p>
+        </w:tc>
+      </w:tr>
+      <w:tr>
+        <w:tc>
+          <w:tcPr>
+            <w:tcW w:type="dxa" w:w="454"/>
+          </w:tcPr>
+          <w:p>
+            <w:r>
+              <w:rPr>
+                <w:sz w:val="17"/>
+              </w:rPr>
+            </w:r>
+            <w:r>
+              <w:rPr>
+                <w:sz w:val="17"/>
+              </w:rPr>
+              <w:t>9</w:t>
+            </w:r>
+          </w:p>
+        </w:tc>
+        <w:tc>
+          <w:tcPr>
+            <w:tcW w:type="dxa" w:w="3402"/>
+          </w:tcPr>
+          <w:p>
+            <w:r>
+              <w:rPr>
+                <w:sz w:val="17"/>
+              </w:rPr>
+            </w:r>
+            <w:r>
+              <w:rPr>
+                <w:sz w:val="17"/>
+              </w:rPr>
+              <w:t>Stale URL #/collections/settings</w:t>
+            </w:r>
+          </w:p>
+        </w:tc>
+        <w:tc>
+          <w:tcPr>
+            <w:tcW w:type="dxa" w:w="5499"/>
+          </w:tcPr>
+          <w:p>
+            <w:r>
+              <w:rPr>
+                <w:sz w:val="17"/>
+              </w:rPr>
+            </w:r>
+            <w:r>
+              <w:rPr>
+                <w:sz w:val="17"/>
+              </w:rPr>
+              <w:t>Hash removed on load with a console breadcrumb; after sign-in the Menu Items list is shown, no “Collection not found”</w:t>
             </w:r>
           </w:p>
         </w:tc>
@@ -6449,6 +7043,82 @@
               <w:rPr>
                 <w:sz w:val="18"/>
               </w:rPr>
+              <w:t>After sign-in: empty page, “Collection not found.” + Back button</w:t>
+            </w:r>
+          </w:p>
+        </w:tc>
+        <w:tc>
+          <w:tcPr>
+            <w:tcW w:type="dxa" w:w="6803"/>
+          </w:tcPr>
+          <w:p>
+            <w:r>
+              <w:rPr>
+                <w:sz w:val="18"/>
+              </w:rPr>
+            </w:r>
+            <w:r>
+              <w:rPr>
+                <w:sz w:val="18"/>
+              </w:rPr>
+              <w:t>The URL names a collection that does not exist (observed: …/admin/#/collections/settings — a bookmark from an earlier configuration). v1.3 drops such a hash on load and opens the start page; otherwise open the plain editor URL.</w:t>
+            </w:r>
+          </w:p>
+        </w:tc>
+      </w:tr>
+      <w:tr>
+        <w:tc>
+          <w:tcPr>
+            <w:tcW w:type="dxa" w:w="2551"/>
+          </w:tcPr>
+          <w:p>
+            <w:r>
+              <w:rPr>
+                <w:sz w:val="18"/>
+              </w:rPr>
+            </w:r>
+            <w:r>
+              <w:rPr>
+                <w:sz w:val="18"/>
+              </w:rPr>
+              <w:t>Sidebar labels clipped (“Site Conte…”) on laptop-sized windows; wordmark overlapping the logo border on Windows</w:t>
+            </w:r>
+          </w:p>
+        </w:tc>
+        <w:tc>
+          <w:tcPr>
+            <w:tcW w:type="dxa" w:w="6803"/>
+          </w:tcPr>
+          <w:p>
+            <w:r>
+              <w:rPr>
+                <w:sz w:val="18"/>
+              </w:rPr>
+            </w:r>
+            <w:r>
+              <w:rPr>
+                <w:sz w:val="18"/>
+              </w:rPr>
+              <w:t>Fixed in v1.3 (sidebar minimum width in theme.css; textLength in logo.svg). Hard-refresh to load the new build.</w:t>
+            </w:r>
+          </w:p>
+        </w:tc>
+      </w:tr>
+      <w:tr>
+        <w:tc>
+          <w:tcPr>
+            <w:tcW w:type="dxa" w:w="2551"/>
+          </w:tcPr>
+          <w:p>
+            <w:r>
+              <w:rPr>
+                <w:sz w:val="18"/>
+              </w:rPr>
+            </w:r>
+            <w:r>
+              <w:rPr>
+                <w:sz w:val="18"/>
+              </w:rPr>
               <w:t>“Work with Local Repository” no longer offered (developer machine)</w:t>
             </w:r>
           </w:p>
@@ -7139,6 +7809,167 @@
                 <w:sz w:val="16"/>
               </w:rPr>
               <w:t>Reuses Sveltia's validation, rich-text editor, workflow UI and accessibility; the preview shows staff what they are editing in the website's own look, with Sveltia's sanitised Markdown widget embedded for the essay body</w:t>
+            </w:r>
+          </w:p>
+        </w:tc>
+      </w:tr>
+      <w:tr>
+        <w:tc>
+          <w:tcPr>
+            <w:tcW w:type="dxa" w:w="510"/>
+          </w:tcPr>
+          <w:p>
+            <w:r>
+              <w:rPr>
+                <w:sz w:val="16"/>
+              </w:rPr>
+            </w:r>
+            <w:r>
+              <w:rPr>
+                <w:sz w:val="16"/>
+              </w:rPr>
+              <w:t>D17</w:t>
+            </w:r>
+          </w:p>
+        </w:tc>
+        <w:tc>
+          <w:tcPr>
+            <w:tcW w:type="dxa" w:w="2608"/>
+          </w:tcPr>
+          <w:p>
+            <w:r>
+              <w:rPr>
+                <w:sz w:val="16"/>
+              </w:rPr>
+            </w:r>
+            <w:r>
+              <w:rPr>
+                <w:sz w:val="16"/>
+              </w:rPr>
+              <w:t xml:space="preserve">One JSON file per menu item and per menu section; computed </w:t>
+            </w:r>
+            <w:r>
+              <w:rPr>
+                <w:rFonts w:ascii="Consolas" w:hAnsi="Consolas" w:eastAsia="Consolas"/>
+                <w:sz w:val="16"/>
+              </w:rPr>
+              <w:t>label</w:t>
+            </w:r>
+            <w:r>
+              <w:rPr>
+                <w:sz w:val="16"/>
+              </w:rPr>
+              <w:t xml:space="preserve"> field as the item identifier (v1.3)</w:t>
+            </w:r>
+          </w:p>
+        </w:tc>
+        <w:tc>
+          <w:tcPr>
+            <w:tcW w:type="dxa" w:w="2438"/>
+          </w:tcPr>
+          <w:p>
+            <w:r>
+              <w:rPr>
+                <w:sz w:val="16"/>
+              </w:rPr>
+            </w:r>
+            <w:r>
+              <w:rPr>
+                <w:sz w:val="16"/>
+              </w:rPr>
+              <w:t>Keep single menu.json; one file per section only; rewrite PR titles with a GitHub Action that diffs the JSON</w:t>
+            </w:r>
+          </w:p>
+        </w:tc>
+        <w:tc>
+          <w:tcPr>
+            <w:tcW w:type="dxa" w:w="3798"/>
+          </w:tcPr>
+          <w:p>
+            <w:r>
+              <w:rPr>
+                <w:sz w:val="16"/>
+              </w:rPr>
+            </w:r>
+            <w:r>
+              <w:rPr>
+                <w:sz w:val="16"/>
+              </w:rPr>
+              <w:t>Cards/PR titles can only show an entry's identifier, so granularity must live in the content model; a diff-rewriting Action would help GitHub but not the board. Per-item files also give small diffs, conflict-free parallel edits and a per-dish visibility switch</w:t>
+            </w:r>
+          </w:p>
+        </w:tc>
+      </w:tr>
+      <w:tr>
+        <w:tc>
+          <w:tcPr>
+            <w:tcW w:type="dxa" w:w="510"/>
+          </w:tcPr>
+          <w:p>
+            <w:r>
+              <w:rPr>
+                <w:sz w:val="16"/>
+              </w:rPr>
+            </w:r>
+            <w:r>
+              <w:rPr>
+                <w:sz w:val="16"/>
+              </w:rPr>
+              <w:t>D18</w:t>
+            </w:r>
+          </w:p>
+        </w:tc>
+        <w:tc>
+          <w:tcPr>
+            <w:tcW w:type="dxa" w:w="2608"/>
+          </w:tcPr>
+          <w:p>
+            <w:r>
+              <w:rPr>
+                <w:sz w:val="16"/>
+              </w:rPr>
+            </w:r>
+            <w:r>
+              <w:rPr>
+                <w:sz w:val="16"/>
+              </w:rPr>
+              <w:t>Keep Sveltia's standard PR lifecycle (draft PR at first save, relabel on lane moves); no “Published” lane (v1.3)</w:t>
+            </w:r>
+          </w:p>
+        </w:tc>
+        <w:tc>
+          <w:tcPr>
+            <w:tcW w:type="dxa" w:w="2438"/>
+          </w:tcPr>
+          <w:p>
+            <w:r>
+              <w:rPr>
+                <w:sz w:val="16"/>
+              </w:rPr>
+            </w:r>
+            <w:r>
+              <w:rPr>
+                <w:sz w:val="16"/>
+              </w:rPr>
+              <w:t>Open the PR only when leaving Drafts; a custom local-draft mode; simple publish mode</w:t>
+            </w:r>
+          </w:p>
+        </w:tc>
+        <w:tc>
+          <w:tcPr>
+            <w:tcW w:type="dxa" w:w="3798"/>
+          </w:tcPr>
+          <w:p>
+            <w:r>
+              <w:rPr>
+                <w:sz w:val="16"/>
+              </w:rPr>
+            </w:r>
+            <w:r>
+              <w:rPr>
+                <w:sz w:val="16"/>
+              </w:rPr>
+              <w:t>Workflow state lives in GitHub by design — a draft without a PR is invisible to everyone else; GitHub draft PRs already express “not yet”; merged PRs leave the board, so “Published” is the website itself (§7.2)</w:t>
             </w:r>
           </w:p>
         </w:tc>
@@ -7926,6 +8757,54 @@
       </w:r>
       <w:r>
         <w:t xml:space="preserve"> Hero copy, contact details, the “Batch Capacity” notice and the header hours badge are still hard-coded. They can be moved to content/ with the same pattern if routine updates are expected.</w:t>
+      </w:r>
+    </w:p>
+    <w:p>
+      <w:pPr>
+        <w:pStyle w:val="ListBullet"/>
+      </w:pPr>
+      <w:r>
+        <w:rPr>
+          <w:b/>
+        </w:rPr>
+        <w:t>Renaming a menu section.</w:t>
+      </w:r>
+      <w:r>
+        <w:t xml:space="preserve"> Items refer to their section by title (so diffs and cards stay human-readable). Renaming a section therefore needs the items re-pointed (the CI validator flags any item whose section no longer exists). If renames turn out to be frequent, switch the relation to the section slug and resolve titles in the loader.</w:t>
+      </w:r>
+    </w:p>
+    <w:p>
+      <w:pPr>
+        <w:pStyle w:val="ListBullet"/>
+      </w:pPr>
+      <w:r>
+        <w:rPr>
+          <w:b/>
+        </w:rPr>
+        <w:t>Group order in the Menu Items list.</w:t>
+      </w:r>
+      <w:r>
+        <w:t xml:space="preserve"> Sveltia orders groups alphabetically, not by the sections' </w:t>
+      </w:r>
+      <w:r>
+        <w:rPr>
+          <w:rFonts w:ascii="Consolas" w:hAnsi="Consolas" w:eastAsia="Consolas"/>
+          <w:sz w:val="19"/>
+        </w:rPr>
+        <w:t>order</w:t>
+      </w:r>
+      <w:r>
+        <w:t xml:space="preserve">; the website uses </w:t>
+      </w:r>
+      <w:r>
+        <w:rPr>
+          <w:rFonts w:ascii="Consolas" w:hAnsi="Consolas" w:eastAsia="Consolas"/>
+          <w:sz w:val="19"/>
+        </w:rPr>
+        <w:t>order</w:t>
+      </w:r>
+      <w:r>
+        <w:t>. Prefixing section titles with numbers would align both at the cost of uglier headings.</w:t>
       </w:r>
     </w:p>
     <w:p>
@@ -8682,6 +9561,62 @@
               <w:rPr>
                 <w:sz w:val="18"/>
               </w:rPr>
+              <w:t>1.3</w:t>
+            </w:r>
+          </w:p>
+        </w:tc>
+        <w:tc>
+          <w:tcPr>
+            <w:tcW w:type="dxa" w:w="5669"/>
+          </w:tcPr>
+          <w:p>
+            <w:r>
+              <w:rPr>
+                <w:sz w:val="18"/>
+              </w:rPr>
+            </w:r>
+            <w:r>
+              <w:rPr>
+                <w:sz w:val="18"/>
+              </w:rPr>
+              <w:t>Menu split into one entry per item and per section with a computed “Section › Item — $price” label that the workflow cards and PR list show (§4.3, §5.3, D17). Pull-request lifecycle analysed and documented; “Published lane” proposal declined with reasons (§7.2, D18); e2e test asserts that lane moves relabel a single PR. Route guard for stale #/collections/&lt;unknown&gt; URLs (§12). Sidebar minimum width; logo wordmark fitted with textLength.</w:t>
+            </w:r>
+          </w:p>
+        </w:tc>
+        <w:tc>
+          <w:tcPr>
+            <w:tcW w:type="dxa" w:w="2778"/>
+          </w:tcPr>
+          <w:p>
+            <w:r>
+              <w:rPr>
+                <w:sz w:val="18"/>
+              </w:rPr>
+            </w:r>
+            <w:r>
+              <w:rPr>
+                <w:sz w:val="18"/>
+              </w:rPr>
+              <w:t>Owner feedback with screenshots: “Collection not found” after OAuth sign-in (URL …/#/collections/settings); workflow cards indistinguishable for menu edits; PRs present while entries are drafts; sidebar labels clipped; wordmark overlapping the logo border.</w:t>
+            </w:r>
+          </w:p>
+        </w:tc>
+      </w:tr>
+      <w:tr>
+        <w:tc>
+          <w:tcPr>
+            <w:tcW w:type="dxa" w:w="907"/>
+          </w:tcPr>
+          <w:p>
+            <w:r>
+              <w:rPr>
+                <w:sz w:val="18"/>
+              </w:rPr>
+            </w:r>
+            <w:r>
+              <w:rPr>
+                <w:sz w:val="18"/>
+              </w:rPr>
               <w:t>1.2</w:t>
             </w:r>
           </w:p>
@@ -8861,7 +9796,7 @@
               <w:rPr>
                 <w:sz w:val="17"/>
               </w:rPr>
-              <w:t>content/menu.json, announcement.json, hours.json, blog/*.md</w:t>
+              <w:t>content/menu-items/*.json, menu-sections/*.json, menu.json, announcement.json, hours.json, blog/*.md</w:t>
             </w:r>
           </w:p>
         </w:tc>
@@ -9463,7 +10398,7 @@
           <w:i/>
           <w:sz w:val="18"/>
         </w:rPr>
-        <w:t>B-2 — Collections after sign-in: Blog Posts and Site Content (no Assets area).</w:t>
+        <w:t>B-2 — Start page after sign-in: the Menu Items list grouped by section (no Assets area).</w:t>
       </w:r>
     </w:p>
     <w:p>
@@ -9569,7 +10504,7 @@
           <w:i/>
           <w:sz w:val="18"/>
         </w:rPr>
-        <w:t>B-4 — Daily Menu editor with the site-styled preview (menu cards, prices, badges).</w:t>
+        <w:t>B-4 — Menu item editor: section picker, fields, and the site-styled preview of the item card.</w:t>
       </w:r>
     </w:p>
     <w:p>
@@ -9781,7 +10716,7 @@
           <w:i/>
           <w:sz w:val="18"/>
         </w:rPr>
-        <w:t>B-8 — Editorial Workflow board (no Publish action for editors).</w:t>
+        <w:t>B-8 — Editorial Workflow board: the card reads “Section › Item — $price” (no Publish action for editors).</w:t>
       </w:r>
     </w:p>
     <w:p>

</xml_diff>

<commit_message>
Fixes for e2e test output, PR detail increased, remove admin slash
</commit_message>
<xml_diff>
--- a/docs/Technical-Design-Document.docx
+++ b/docs/Technical-Design-Document.docx
@@ -193,7 +193,7 @@
               <w:rPr>
                 <w:sz w:val="18"/>
               </w:rPr>
-              <w:t>https://smagara.github.io/SlowDoughPizzaSite_Sveltia/admin/ — unlisted URL, not linked from the site (v1.2)</w:t>
+              <w:t>https://smagara.github.io/SlowDoughPizzaSite_Sveltia/admin — unlisted URL, not linked from the site; works with or without a trailing slash</w:t>
             </w:r>
           </w:p>
         </w:tc>
@@ -231,7 +231,7 @@
               <w:rPr>
                 <w:sz w:val="18"/>
               </w:rPr>
-              <w:t>1.3 — 16 October 2026 (see §16 Revision history)</w:t>
+              <w:t>1.5 — 17 October 2026 (see §16 Revision history)</w:t>
             </w:r>
           </w:p>
         </w:tc>
@@ -3385,6 +3385,15 @@
           <w:b w:val="0"/>
           <w:i w:val="0"/>
         </w:rPr>
+        <w:t>The address works with or without a trailing slash: the editor lives at admin/index.html, and a static public/admin.html (served by GitHub Pages for …/admin) redirects to admin/ while preserving any #/… route; the dev server does the same with a 302 (tools/vite-plugin-admin-redirect.ts). The quick guide prints the short form as a clickable link.</w:t>
+      </w:r>
+    </w:p>
+    <w:p>
+      <w:r>
+        <w:rPr>
+          <w:b w:val="0"/>
+          <w:i w:val="0"/>
+        </w:rPr>
         <w:t>What this does and does not achieve: the page is not discoverable (no inbound link; &lt;meta name="robots" content="noindex, nofollow"&gt;; no sitemap entry), but it is still a public URL. Anyone who guesses it sees only the sign-in page; every action behind it requires GitHub sign-in and repository collaborator access (§6). Deliberately no robots.txt Disallow line is added, because that file is public and would advertise the path. Obscurity lowers noise; GitHub provides the security.</w:t>
       </w:r>
     </w:p>
@@ -3569,7 +3578,24 @@
         <w:pStyle w:val="Heading2"/>
       </w:pPr>
       <w:r>
-        <w:t>6.3 What a collaborator can and cannot do</w:t>
+        <w:t>6.3 Where the editor reads from — and the content-source check</w:t>
+      </w:r>
+    </w:p>
+    <w:p>
+      <w:r>
+        <w:rPr>
+          <w:b w:val="0"/>
+          <w:i w:val="0"/>
+        </w:rPr>
+        <w:t>In GitHub mode the editor reads the repository's default branch on GitHub; in local mode it reads the working copy in the chosen folder. The two diverge whenever files exist locally but have not been pushed (or were pushed to another branch). Sveltia then shows the affected collections as empty without any error, which was mistaken for a CMS bug twice (v1.1: a stale main without content/; v1.4: the v1.3 menu folders present locally but not yet on main). Since v1.4 src/admin/content-check.ts runs after a GitHub sign-in: using the user's own token it asks which branch is being read and whether every configured folder and file exists there (GET /repos/{repo}/contents/{path}?ref=branch), and shows a dismissible banner naming the missing paths with the remedy (commit and push/merge to that branch, reload). It never blocks the editor and is silent when everything is present; the result is also logged to the console. The e2e test covers both outcomes (scenarios 3 and 10).</w:t>
+      </w:r>
+    </w:p>
+    <w:p>
+      <w:pPr>
+        <w:pStyle w:val="Heading2"/>
+      </w:pPr>
+      <w:r>
+        <w:t>6.4 What a collaborator can and cannot do</w:t>
       </w:r>
     </w:p>
     <w:p>
@@ -3632,7 +3658,7 @@
       <w:r>
         <w:drawing>
           <wp:inline xmlns:a="http://schemas.openxmlformats.org/drawingml/2006/main" xmlns:pic="http://schemas.openxmlformats.org/drawingml/2006/picture">
-            <wp:extent cx="8820000" cy="5250000"/>
+            <wp:extent cx="8820000" cy="4593750"/>
             <wp:docPr id="3" name="Picture 3"/>
             <wp:cNvGraphicFramePr>
               <a:graphicFrameLocks noChangeAspect="1"/>
@@ -3653,7 +3679,7 @@
                   <pic:spPr>
                     <a:xfrm>
                       <a:off x="0" y="0"/>
-                      <a:ext cx="8820000" cy="5250000"/>
+                      <a:ext cx="8820000" cy="4593750"/>
                     </a:xfrm>
                     <a:prstGeom prst="rect"/>
                   </pic:spPr>
@@ -4611,7 +4637,7 @@
         <w:pStyle w:val="Heading2"/>
       </w:pPr>
       <w:r>
-        <w:t>7.2 Pull-request lifecycle versus the lanes — and why there is no “Published” lane</w:t>
+        <w:t>7.2 Pull-request lifecycle versus the lanes</w:t>
       </w:r>
     </w:p>
     <w:p>
@@ -4620,83 +4646,7 @@
           <w:b w:val="0"/>
           <w:i w:val="0"/>
         </w:rPr>
-        <w:t>During the first production use the owner observed that pull requests exist while entries are still in Drafts and proposed a read-only final lane, “Published”, that would be the moment the pull request is actually opened. The proposal was examined against how Sveltia and GitHub work; the conclusion is to keep the standard behaviour, for the following reasons.</w:t>
-      </w:r>
-    </w:p>
-    <w:p>
-      <w:pPr>
-        <w:pStyle w:val="ListBullet"/>
-      </w:pPr>
-      <w:r>
-        <w:rPr>
-          <w:b/>
-        </w:rPr>
-        <w:t>A lane is a label, a card is a pull request.</w:t>
-      </w:r>
-      <w:r>
-        <w:t xml:space="preserve"> Sveltia stores no workflow state of its own: the Drafts/In Review/Ready columns are populated by listing the repository's open pull requests that carry a sveltia-cms/* label, and the position of a card is that label. The first Save therefore must create the branch and the pull request — there is nowhere else to keep a draft that another device, another editor or a reviewer could see. (Sveltia's “draft backup” in the browser only protects unsaved typing on one machine.)</w:t>
-      </w:r>
-    </w:p>
-    <w:p>
-      <w:pPr>
-        <w:pStyle w:val="ListBullet"/>
-      </w:pPr>
-      <w:r>
-        <w:rPr>
-          <w:b/>
-        </w:rPr>
-        <w:t>Lane moves do not create pull requests.</w:t>
-      </w:r>
-      <w:r>
-        <w:t xml:space="preserve"> Moving a card relabels the same PR and toggles GitHub's draft flag (Drafts ⇄ ready for review). The end-to-end test moves an entry In Review → Draft → In Review and asserts that exactly one pull request exists; the owner's own screenshot of PR #3 shows the same: one PR, labels added/removed as the card moved.</w:t>
-      </w:r>
-    </w:p>
-    <w:p>
-      <w:pPr>
-        <w:pStyle w:val="ListBullet"/>
-      </w:pPr>
-      <w:r>
-        <w:rPr>
-          <w:b/>
-        </w:rPr>
-        <w:t>GitHub's draft pull request is the “not yet” state the proposal asked for.</w:t>
-      </w:r>
-      <w:r>
-        <w:t xml:space="preserve"> While a card sits in Drafts its PR is a draft PR: GitHub does not request reviews for it, reviewers filter it out with </w:t>
-      </w:r>
-      <w:r>
-        <w:rPr>
-          <w:rFonts w:ascii="Consolas" w:hAnsi="Consolas" w:eastAsia="Consolas"/>
-          <w:sz w:val="19"/>
-        </w:rPr>
-        <w:t>is:pr draft:false</w:t>
-      </w:r>
-      <w:r>
-        <w:t>, the merge button is disabled, and the required status check still runs so problems surface early. “Send for Review” is the moment the team is asked to look. A “Published” lane cannot exist as a column because a merged PR is closed and leaves the board — publication is visible on the website and in GitHub's merged list instead.</w:t>
-      </w:r>
-    </w:p>
-    <w:p>
-      <w:pPr>
-        <w:pStyle w:val="ListBullet"/>
-      </w:pPr>
-      <w:r>
-        <w:rPr>
-          <w:b/>
-        </w:rPr>
-        <w:t>Alternatives considered.</w:t>
-      </w:r>
-      <w:r>
-        <w:t xml:space="preserve"> (a) </w:t>
-      </w:r>
-      <w:r>
-        <w:rPr>
-          <w:rFonts w:ascii="Consolas" w:hAnsi="Consolas" w:eastAsia="Consolas"/>
-          <w:sz w:val="19"/>
-        </w:rPr>
-        <w:t>publish_mode: simple</w:t>
-      </w:r>
-      <w:r>
-        <w:t xml:space="preserve"> (no workflow): every save commits straight to main — rejected by the brief. (b) Open Authoring: drafts live in a fork, but a PR is still opened at the same time. (c) A custom “save locally, open PR later” mode: not supported by Sveltia and would hide drafts from everyone but one browser. (d) Hiding the Ready column: not configurable; it is harmless (moving there only relabels) and the guide tells staff to use Draft and In Review only.</w:t>
+        <w:t>Sveltia keeps no workflow state of its own: a card on the board *is* an open pull request and the lane *is* its label (sveltia-cms/draft → pending_review → pending_publish). The first Save therefore creates the branch and a GitHub draft pull request; lane moves relabel that same PR and toggle GitHub's draft flag; a merged PR leaves the board. The end-to-end test asserts that moving In Review → Draft → In Review leaves exactly one PR, and the owner's PR #3 timeline showed the same. A “Published” lane cannot exist as a column — publication is the website and GitHub's merged list.</w:t>
       </w:r>
     </w:p>
     <w:p>
@@ -4705,7 +4655,16 @@
           <w:b w:val="0"/>
           <w:i w:val="0"/>
         </w:rPr>
-        <w:t>What was changed instead is the *legibility* of the cards and pull requests: item-level entries (§4.3) with a computed label, so the board reads “Section › Item — $price” and the PR list reads “update Menu Item ‘&lt;slug&gt;’”.</w:t>
+        <w:t>Two gaps between the two systems were observed in production and closed in v1.5 (§8.5): GitHub considered an entry mergeable as soon as it left Drafts (“ready for review” is GitHub's only non-draft state), and publishing still required someone to approve and merge on GitHub. The CMS publish gate now ties GitHub's mergeability to the editor's lanes and performs the merge itself once an entry reaches Ready, so routine content changes never require a GitHub visit. Sveltia's own Publish button stays hidden (publish: false); the Ready lane is the publishing control.</w:t>
+      </w:r>
+    </w:p>
+    <w:p>
+      <w:r>
+        <w:rPr>
+          <w:b w:val="0"/>
+          <w:i w:val="0"/>
+        </w:rPr>
+        <w:t>Cosmetic note: when a card moves, GitHub's timeline shows “added sveltia-cms/draft, sveltia-cms/pending_review and removed sveltia-cms/draft” in one line. Sveltia replaces the whole label set in a single API call and GitHub renders the diff that way; no label is actually re-added.</w:t>
       </w:r>
     </w:p>
     <w:p>
@@ -4940,6 +4899,80 @@
               <w:rPr>
                 <w:sz w:val="17"/>
               </w:rPr>
+              <w:t>.github/workflows/cms-publish.yml — “CMS publish”</w:t>
+            </w:r>
+          </w:p>
+        </w:tc>
+        <w:tc>
+          <w:tcPr>
+            <w:tcW w:type="dxa" w:w="1474"/>
+          </w:tcPr>
+          <w:p>
+            <w:r>
+              <w:rPr>
+                <w:sz w:val="17"/>
+              </w:rPr>
+            </w:r>
+            <w:r>
+              <w:rPr>
+                <w:sz w:val="17"/>
+              </w:rPr>
+              <w:t>pull_request (opened, synchronize, labeled, unlabeled, ready_for_review, converted_to_draft) and completion of “PR check”</w:t>
+            </w:r>
+          </w:p>
+        </w:tc>
+        <w:tc>
+          <w:tcPr>
+            <w:tcW w:type="dxa" w:w="3231"/>
+          </w:tcPr>
+          <w:p>
+            <w:r>
+              <w:rPr>
+                <w:sz w:val="17"/>
+              </w:rPr>
+            </w:r>
+            <w:r>
+              <w:rPr>
+                <w:sz w:val="17"/>
+              </w:rPr>
+              <w:t>actions/github-script running scripts/cms-publish-gate.mjs: report commit status sveltia/workflow; when Ready + green PR check: squash-merge, dispatch deploy, comment</w:t>
+            </w:r>
+          </w:p>
+        </w:tc>
+        <w:tc>
+          <w:tcPr>
+            <w:tcW w:type="dxa" w:w="2268"/>
+          </w:tcPr>
+          <w:p>
+            <w:r>
+              <w:rPr>
+                <w:sz w:val="17"/>
+              </w:rPr>
+            </w:r>
+            <w:r>
+              <w:rPr>
+                <w:sz w:val="17"/>
+              </w:rPr>
+              <w:t>Aligns GitHub mergeability with the editor's lanes and publishes without a GitHub visit (§8.5). Permissions: contents/pull-requests/statuses/actions write, checks read.</w:t>
+            </w:r>
+          </w:p>
+        </w:tc>
+      </w:tr>
+      <w:tr>
+        <w:tc>
+          <w:tcPr>
+            <w:tcW w:type="dxa" w:w="2381"/>
+          </w:tcPr>
+          <w:p>
+            <w:r>
+              <w:rPr>
+                <w:sz w:val="17"/>
+              </w:rPr>
+            </w:r>
+            <w:r>
+              <w:rPr>
+                <w:sz w:val="17"/>
+              </w:rPr>
               <w:t>.github/workflows/deploy.yml — “Deploy to GitHub Pages”</w:t>
             </w:r>
           </w:p>
@@ -4958,7 +4991,7 @@
               <w:rPr>
                 <w:sz w:val="17"/>
               </w:rPr>
-              <w:t>push → main, manual dispatch</w:t>
+              <w:t>push → main, workflow_dispatch (manual or from the publish gate)</w:t>
             </w:r>
           </w:p>
         </w:tc>
@@ -4976,7 +5009,7 @@
               <w:rPr>
                 <w:sz w:val="17"/>
               </w:rPr>
-              <w:t>same validate/lint/build · upload-pages-artifact · deploy-pages (environment github-pages)</w:t>
+              <w:t>same validate/lint/unit/build · upload-pages-artifact · deploy-pages (environment github-pages)</w:t>
             </w:r>
           </w:p>
         </w:tc>
@@ -5144,6 +5177,553 @@
           <w:i w:val="0"/>
         </w:rPr>
         <w:t>A typical deploy completes in 2–3 minutes. If validation or the build fails on main (which should be impossible once the PR check is required), nothing is deployed and the previous version stays live. Re-running the workflow manually (workflow_dispatch) is supported.</w:t>
+      </w:r>
+    </w:p>
+    <w:p>
+      <w:pPr>
+        <w:pStyle w:val="Heading2"/>
+      </w:pPr>
+      <w:r>
+        <w:t>8.5 The CMS publish gate</w:t>
+      </w:r>
+    </w:p>
+    <w:p>
+      <w:r>
+        <w:rPr>
+          <w:b w:val="0"/>
+          <w:i w:val="0"/>
+        </w:rPr>
+        <w:t>scripts/cms-publish-gate.mjs (pure decision function decide(), unit-tested in tests/unit/) runs inside cms-publish.yml on every pull-request event that can change an entry's lane and whenever the PR check completes. For each open PR it derives the lane from the sveltia-cms/* label and reports a commit status named sveltia/workflow on the head commit:</w:t>
+      </w:r>
+    </w:p>
+    <w:tbl>
+      <w:tblPr>
+        <w:tblStyle w:val="TableGrid"/>
+        <w:tblW w:type="auto" w:w="0"/>
+        <w:jc w:val="center"/>
+        <w:tblLook w:firstColumn="1" w:firstRow="1" w:lastColumn="0" w:lastRow="0" w:noHBand="0" w:noVBand="1" w:val="04A0"/>
+      </w:tblPr>
+      <w:tblGrid>
+        <w:gridCol w:w="3137"/>
+        <w:gridCol w:w="3137"/>
+        <w:gridCol w:w="3137"/>
+      </w:tblGrid>
+      <w:tr>
+        <w:tc>
+          <w:tcPr>
+            <w:tcW w:type="dxa" w:w="2948"/>
+            <w:shd w:val="clear" w:color="auto" w:fill="F0E7DC"/>
+          </w:tcPr>
+          <w:p>
+            <w:r/>
+            <w:r>
+              <w:rPr>
+                <w:b/>
+                <w:sz w:val="18"/>
+              </w:rPr>
+              <w:t>Situation</w:t>
+            </w:r>
+          </w:p>
+        </w:tc>
+        <w:tc>
+          <w:tcPr>
+            <w:tcW w:type="dxa" w:w="3288"/>
+            <w:shd w:val="clear" w:color="auto" w:fill="F0E7DC"/>
+          </w:tcPr>
+          <w:p>
+            <w:r/>
+            <w:r>
+              <w:rPr>
+                <w:b/>
+                <w:sz w:val="18"/>
+              </w:rPr>
+              <w:t>Status</w:t>
+            </w:r>
+          </w:p>
+        </w:tc>
+        <w:tc>
+          <w:tcPr>
+            <w:tcW w:type="dxa" w:w="3118"/>
+            <w:shd w:val="clear" w:color="auto" w:fill="F0E7DC"/>
+          </w:tcPr>
+          <w:p>
+            <w:r/>
+            <w:r>
+              <w:rPr>
+                <w:b/>
+                <w:sz w:val="18"/>
+              </w:rPr>
+              <w:t>Effect</w:t>
+            </w:r>
+          </w:p>
+        </w:tc>
+      </w:tr>
+      <w:tr>
+        <w:tc>
+          <w:tcPr>
+            <w:tcW w:type="dxa" w:w="2948"/>
+          </w:tcPr>
+          <w:p>
+            <w:r>
+              <w:rPr>
+                <w:sz w:val="18"/>
+              </w:rPr>
+            </w:r>
+            <w:r>
+              <w:rPr>
+                <w:sz w:val="18"/>
+              </w:rPr>
+              <w:t>No sveltia-cms/* label (ordinary code PR)</w:t>
+            </w:r>
+          </w:p>
+        </w:tc>
+        <w:tc>
+          <w:tcPr>
+            <w:tcW w:type="dxa" w:w="3288"/>
+          </w:tcPr>
+          <w:p>
+            <w:r>
+              <w:rPr>
+                <w:sz w:val="18"/>
+              </w:rPr>
+            </w:r>
+            <w:r>
+              <w:rPr>
+                <w:sz w:val="18"/>
+              </w:rPr>
+              <w:t>success — “Not a content-editor pull request”</w:t>
+            </w:r>
+          </w:p>
+        </w:tc>
+        <w:tc>
+          <w:tcPr>
+            <w:tcW w:type="dxa" w:w="3118"/>
+          </w:tcPr>
+          <w:p>
+            <w:r>
+              <w:rPr>
+                <w:sz w:val="18"/>
+              </w:rPr>
+            </w:r>
+            <w:r>
+              <w:rPr>
+                <w:sz w:val="18"/>
+              </w:rPr>
+              <w:t>Never blocks developers</w:t>
+            </w:r>
+          </w:p>
+        </w:tc>
+      </w:tr>
+      <w:tr>
+        <w:tc>
+          <w:tcPr>
+            <w:tcW w:type="dxa" w:w="2948"/>
+          </w:tcPr>
+          <w:p>
+            <w:r>
+              <w:rPr>
+                <w:sz w:val="18"/>
+              </w:rPr>
+            </w:r>
+            <w:r>
+              <w:rPr>
+                <w:sz w:val="18"/>
+              </w:rPr>
+              <w:t>Draft (GitHub draft PR or label sveltia-cms/draft)</w:t>
+            </w:r>
+          </w:p>
+        </w:tc>
+        <w:tc>
+          <w:tcPr>
+            <w:tcW w:type="dxa" w:w="3288"/>
+          </w:tcPr>
+          <w:p>
+            <w:r>
+              <w:rPr>
+                <w:sz w:val="18"/>
+              </w:rPr>
+            </w:r>
+            <w:r>
+              <w:rPr>
+                <w:sz w:val="18"/>
+              </w:rPr>
+              <w:t>pending — “Draft in the content editor — not ready to publish”</w:t>
+            </w:r>
+          </w:p>
+        </w:tc>
+        <w:tc>
+          <w:tcPr>
+            <w:tcW w:type="dxa" w:w="3118"/>
+          </w:tcPr>
+          <w:p>
+            <w:r>
+              <w:rPr>
+                <w:sz w:val="18"/>
+              </w:rPr>
+            </w:r>
+            <w:r>
+              <w:rPr>
+                <w:sz w:val="18"/>
+              </w:rPr>
+              <w:t>Merge button disabled (status is required by the branch rule)</w:t>
+            </w:r>
+          </w:p>
+        </w:tc>
+      </w:tr>
+      <w:tr>
+        <w:tc>
+          <w:tcPr>
+            <w:tcW w:type="dxa" w:w="2948"/>
+          </w:tcPr>
+          <w:p>
+            <w:r>
+              <w:rPr>
+                <w:sz w:val="18"/>
+              </w:rPr>
+            </w:r>
+            <w:r>
+              <w:rPr>
+                <w:sz w:val="18"/>
+              </w:rPr>
+              <w:t>In Review (sveltia-cms/pending_review)</w:t>
+            </w:r>
+          </w:p>
+        </w:tc>
+        <w:tc>
+          <w:tcPr>
+            <w:tcW w:type="dxa" w:w="3288"/>
+          </w:tcPr>
+          <w:p>
+            <w:r>
+              <w:rPr>
+                <w:sz w:val="18"/>
+              </w:rPr>
+            </w:r>
+            <w:r>
+              <w:rPr>
+                <w:sz w:val="18"/>
+              </w:rPr>
+              <w:t>pending — “In review … move it to Ready to publish”</w:t>
+            </w:r>
+          </w:p>
+        </w:tc>
+        <w:tc>
+          <w:tcPr>
+            <w:tcW w:type="dxa" w:w="3118"/>
+          </w:tcPr>
+          <w:p>
+            <w:r>
+              <w:rPr>
+                <w:sz w:val="18"/>
+              </w:rPr>
+            </w:r>
+            <w:r>
+              <w:rPr>
+                <w:sz w:val="18"/>
+              </w:rPr>
+              <w:t>Merge blocked; the card waits in the editor</w:t>
+            </w:r>
+          </w:p>
+        </w:tc>
+      </w:tr>
+      <w:tr>
+        <w:tc>
+          <w:tcPr>
+            <w:tcW w:type="dxa" w:w="2948"/>
+          </w:tcPr>
+          <w:p>
+            <w:r>
+              <w:rPr>
+                <w:sz w:val="18"/>
+              </w:rPr>
+            </w:r>
+            <w:r>
+              <w:rPr>
+                <w:sz w:val="18"/>
+              </w:rPr>
+              <w:t>Deletion request (sveltia-cms/pending_deletion)</w:t>
+            </w:r>
+          </w:p>
+        </w:tc>
+        <w:tc>
+          <w:tcPr>
+            <w:tcW w:type="dxa" w:w="3288"/>
+          </w:tcPr>
+          <w:p>
+            <w:r>
+              <w:rPr>
+                <w:sz w:val="18"/>
+              </w:rPr>
+            </w:r>
+            <w:r>
+              <w:rPr>
+                <w:sz w:val="18"/>
+              </w:rPr>
+              <w:t>pending — “a developer merges this on GitHub”</w:t>
+            </w:r>
+          </w:p>
+        </w:tc>
+        <w:tc>
+          <w:tcPr>
+            <w:tcW w:type="dxa" w:w="3118"/>
+          </w:tcPr>
+          <w:p>
+            <w:r>
+              <w:rPr>
+                <w:sz w:val="18"/>
+              </w:rPr>
+            </w:r>
+            <w:r>
+              <w:rPr>
+                <w:sz w:val="18"/>
+              </w:rPr>
+              <w:t>Deliberately never automated</w:t>
+            </w:r>
+          </w:p>
+        </w:tc>
+      </w:tr>
+      <w:tr>
+        <w:tc>
+          <w:tcPr>
+            <w:tcW w:type="dxa" w:w="2948"/>
+          </w:tcPr>
+          <w:p>
+            <w:r>
+              <w:rPr>
+                <w:sz w:val="18"/>
+              </w:rPr>
+            </w:r>
+            <w:r>
+              <w:rPr>
+                <w:sz w:val="18"/>
+              </w:rPr>
+              <w:t>Ready, PR check not finished</w:t>
+            </w:r>
+          </w:p>
+        </w:tc>
+        <w:tc>
+          <w:tcPr>
+            <w:tcW w:type="dxa" w:w="3288"/>
+          </w:tcPr>
+          <w:p>
+            <w:r>
+              <w:rPr>
+                <w:sz w:val="18"/>
+              </w:rPr>
+            </w:r>
+            <w:r>
+              <w:rPr>
+                <w:sz w:val="18"/>
+              </w:rPr>
+              <w:t>pending — “waiting for the PR check”</w:t>
+            </w:r>
+          </w:p>
+        </w:tc>
+        <w:tc>
+          <w:tcPr>
+            <w:tcW w:type="dxa" w:w="3118"/>
+          </w:tcPr>
+          <w:p>
+            <w:r>
+              <w:rPr>
+                <w:sz w:val="18"/>
+              </w:rPr>
+            </w:r>
+            <w:r>
+              <w:rPr>
+                <w:sz w:val="18"/>
+              </w:rPr>
+              <w:t>Re-evaluated when the check completes (workflow_run trigger)</w:t>
+            </w:r>
+          </w:p>
+        </w:tc>
+      </w:tr>
+      <w:tr>
+        <w:tc>
+          <w:tcPr>
+            <w:tcW w:type="dxa" w:w="2948"/>
+          </w:tcPr>
+          <w:p>
+            <w:r>
+              <w:rPr>
+                <w:sz w:val="18"/>
+              </w:rPr>
+            </w:r>
+            <w:r>
+              <w:rPr>
+                <w:sz w:val="18"/>
+              </w:rPr>
+              <w:t>Ready, PR check failed</w:t>
+            </w:r>
+          </w:p>
+        </w:tc>
+        <w:tc>
+          <w:tcPr>
+            <w:tcW w:type="dxa" w:w="3288"/>
+          </w:tcPr>
+          <w:p>
+            <w:r>
+              <w:rPr>
+                <w:sz w:val="18"/>
+              </w:rPr>
+            </w:r>
+            <w:r>
+              <w:rPr>
+                <w:sz w:val="18"/>
+              </w:rPr>
+              <w:t>failure — “see its log”</w:t>
+            </w:r>
+          </w:p>
+        </w:tc>
+        <w:tc>
+          <w:tcPr>
+            <w:tcW w:type="dxa" w:w="3118"/>
+          </w:tcPr>
+          <w:p>
+            <w:r>
+              <w:rPr>
+                <w:sz w:val="18"/>
+              </w:rPr>
+            </w:r>
+            <w:r>
+              <w:rPr>
+                <w:sz w:val="18"/>
+              </w:rPr>
+              <w:t>Nothing merged; a new save in the editor re-runs everything</w:t>
+            </w:r>
+          </w:p>
+        </w:tc>
+      </w:tr>
+      <w:tr>
+        <w:tc>
+          <w:tcPr>
+            <w:tcW w:type="dxa" w:w="2948"/>
+          </w:tcPr>
+          <w:p>
+            <w:r>
+              <w:rPr>
+                <w:sz w:val="18"/>
+              </w:rPr>
+            </w:r>
+            <w:r>
+              <w:rPr>
+                <w:sz w:val="18"/>
+              </w:rPr>
+              <w:t>Ready, four-eyes rule violated (optional)</w:t>
+            </w:r>
+          </w:p>
+        </w:tc>
+        <w:tc>
+          <w:tcPr>
+            <w:tcW w:type="dxa" w:w="3288"/>
+          </w:tcPr>
+          <w:p>
+            <w:r>
+              <w:rPr>
+                <w:sz w:val="18"/>
+              </w:rPr>
+            </w:r>
+            <w:r>
+              <w:rPr>
+                <w:sz w:val="18"/>
+              </w:rPr>
+              <w:t>failure — “Ready must be set by someone other than the author”</w:t>
+            </w:r>
+          </w:p>
+        </w:tc>
+        <w:tc>
+          <w:tcPr>
+            <w:tcW w:type="dxa" w:w="3118"/>
+          </w:tcPr>
+          <w:p>
+            <w:r>
+              <w:rPr>
+                <w:sz w:val="18"/>
+              </w:rPr>
+            </w:r>
+            <w:r>
+              <w:rPr>
+                <w:sz w:val="18"/>
+              </w:rPr>
+              <w:t>Only with CMS_REQUIRE_SECOND_REVIEWER=true; the PR timeline records who applied the label</w:t>
+            </w:r>
+          </w:p>
+        </w:tc>
+      </w:tr>
+      <w:tr>
+        <w:tc>
+          <w:tcPr>
+            <w:tcW w:type="dxa" w:w="2948"/>
+          </w:tcPr>
+          <w:p>
+            <w:r>
+              <w:rPr>
+                <w:sz w:val="18"/>
+              </w:rPr>
+            </w:r>
+            <w:r>
+              <w:rPr>
+                <w:sz w:val="18"/>
+              </w:rPr>
+              <w:t>Ready, PR check passed</w:t>
+            </w:r>
+          </w:p>
+        </w:tc>
+        <w:tc>
+          <w:tcPr>
+            <w:tcW w:type="dxa" w:w="3288"/>
+          </w:tcPr>
+          <w:p>
+            <w:r>
+              <w:rPr>
+                <w:sz w:val="18"/>
+              </w:rPr>
+            </w:r>
+            <w:r>
+              <w:rPr>
+                <w:sz w:val="18"/>
+              </w:rPr>
+              <w:t>success — “Approved in the content editor by &lt;user&gt; — publishing”</w:t>
+            </w:r>
+          </w:p>
+        </w:tc>
+        <w:tc>
+          <w:tcPr>
+            <w:tcW w:type="dxa" w:w="3118"/>
+          </w:tcPr>
+          <w:p>
+            <w:r>
+              <w:rPr>
+                <w:sz w:val="18"/>
+              </w:rPr>
+            </w:r>
+            <w:r>
+              <w:rPr>
+                <w:sz w:val="18"/>
+              </w:rPr>
+              <w:t>Squash-merge (retrying briefly until branch protection sees the status), deploy workflow dispatched, explanatory comment on the PR</w:t>
+            </w:r>
+          </w:p>
+        </w:tc>
+      </w:tr>
+    </w:tbl>
+    <w:p/>
+    <w:p>
+      <w:r>
+        <w:rPr>
+          <w:b w:val="0"/>
+          <w:i w:val="0"/>
+        </w:rPr>
+        <w:t>Why dispatch the deploy workflow: pushes and merges performed with the workflow's own GITHUB_TOKEN do not trigger other workflows (a GitHub safeguard against loops), so the push-to-main trigger of deploy.yml would not fire after an automatic merge. workflow_dispatch is explicitly exempt from that rule, so the gate starts the deployment directly; a developer's manual merge still triggers it through the push event. No personal access token or GitHub App is needed.</w:t>
+      </w:r>
+    </w:p>
+    <w:p>
+      <w:r>
+        <w:rPr>
+          <w:b w:val="0"/>
+          <w:i w:val="0"/>
+        </w:rPr>
+        <w:t>Prerequisites and trade-offs (decision D20): the branch rule for main must require both statuses — “Validate &amp; build (PR)” and “sveltia/workflow” — and, for the no-GitHub flow, require 0 approvals: GitHub cannot count a label as an approval, and a required approval can only be given on GitHub by someone other than the author. The approval therefore moves into the editor: whoever moves a card to Ready publishes it. With a single manager that is acceptable (and identical to a site owner merging their own change); where separation of duties matters, CMS_REQUIRE_SECOND_REVIEWER=true enforces that the person who sets Ready is not the author of the draft, using GitHub's own audit trail. The gate never bypasses branch protection — if the rule still requires approvals, the merge call fails and the status explains why, leaving the PR for a developer.</w:t>
       </w:r>
     </w:p>
     <w:p>
@@ -6318,7 +6898,7 @@
               <w:rPr>
                 <w:sz w:val="17"/>
               </w:rPr>
-              <w:t>4</w:t>
+              <w:t>10</w:t>
             </w:r>
           </w:p>
         </w:tc>
@@ -6336,7 +6916,7 @@
               <w:rPr>
                 <w:sz w:val="17"/>
               </w:rPr>
-              <w:t>Script/HTML in title and body</w:t>
+              <w:t>GitHub branch without content/menu-items and content/menu-sections</w:t>
             </w:r>
           </w:p>
         </w:tc>
@@ -6354,7 +6934,7 @@
               <w:rPr>
                 <w:sz w:val="17"/>
               </w:rPr>
-              <w:t>Both custom error messages shown; save blocked; zero API calls</w:t>
+              <w:t>Collections show 0 entries and the content-check banner names exactly those two folders (not the existing ones); banner is dismissible; absent in scenario 3 where the branch is complete</w:t>
             </w:r>
           </w:p>
         </w:tc>
@@ -6374,7 +6954,7 @@
               <w:rPr>
                 <w:sz w:val="17"/>
               </w:rPr>
-              <w:t>5</w:t>
+              <w:t>4</w:t>
             </w:r>
           </w:p>
         </w:tc>
@@ -6392,7 +6972,7 @@
               <w:rPr>
                 <w:sz w:val="17"/>
               </w:rPr>
-              <w:t>Create a blog post with heading, quote, takeaways</w:t>
+              <w:t>Script/HTML in title and body</w:t>
             </w:r>
           </w:p>
         </w:tc>
@@ -6410,7 +6990,7 @@
               <w:rPr>
                 <w:sz w:val="17"/>
               </w:rPr>
-              <w:t>Branch cms/blog/&lt;slug&gt;; Markdown file parses with the build plugin; front matter fields correct; PR title</w:t>
+              <w:t>Both custom error messages shown; save blocked; zero API calls</w:t>
             </w:r>
           </w:p>
         </w:tc>
@@ -6430,7 +7010,7 @@
               <w:rPr>
                 <w:sz w:val="17"/>
               </w:rPr>
-              <w:t>6</w:t>
+              <w:t>5</w:t>
             </w:r>
           </w:p>
         </w:tc>
@@ -6448,7 +7028,7 @@
               <w:rPr>
                 <w:sz w:val="17"/>
               </w:rPr>
-              <w:t>Edit the announcement banner</w:t>
+              <w:t>Create a blog post with heading, quote, takeaways</w:t>
             </w:r>
           </w:p>
         </w:tc>
@@ -6466,7 +7046,7 @@
               <w:rPr>
                 <w:sz w:val="17"/>
               </w:rPr>
-              <w:t>Preview strip updates live; branch cms/site/announcement with the new headline; upload on the direct /assets route rejected (0 bytes), nothing committed</w:t>
+              <w:t>Branch cms/blog/&lt;slug&gt;; Markdown file parses with the build plugin; front matter fields correct; PR title</w:t>
             </w:r>
           </w:p>
         </w:tc>
@@ -6486,7 +7066,7 @@
               <w:rPr>
                 <w:sz w:val="17"/>
               </w:rPr>
-              <w:t>7</w:t>
+              <w:t>6</w:t>
             </w:r>
           </w:p>
         </w:tc>
@@ -6504,7 +7084,7 @@
               <w:rPr>
                 <w:sz w:val="17"/>
               </w:rPr>
-              <w:t>Local repository mode</w:t>
+              <w:t>Edit the announcement banner</w:t>
             </w:r>
           </w:p>
         </w:tc>
@@ -6522,7 +7102,7 @@
               <w:rPr>
                 <w:sz w:val="17"/>
               </w:rPr>
-              <w:t>Opening hours written to the working copy; no GitHub request made</w:t>
+              <w:t>Preview strip updates live; branch cms/site/dough-announcement with the new headline; upload on the direct /assets route rejected (0 bytes), nothing committed</w:t>
             </w:r>
           </w:p>
         </w:tc>
@@ -6542,6 +7122,62 @@
               <w:rPr>
                 <w:sz w:val="17"/>
               </w:rPr>
+              <w:t>7</w:t>
+            </w:r>
+          </w:p>
+        </w:tc>
+        <w:tc>
+          <w:tcPr>
+            <w:tcW w:type="dxa" w:w="3402"/>
+          </w:tcPr>
+          <w:p>
+            <w:r>
+              <w:rPr>
+                <w:sz w:val="17"/>
+              </w:rPr>
+            </w:r>
+            <w:r>
+              <w:rPr>
+                <w:sz w:val="17"/>
+              </w:rPr>
+              <w:t>Local repository mode</w:t>
+            </w:r>
+          </w:p>
+        </w:tc>
+        <w:tc>
+          <w:tcPr>
+            <w:tcW w:type="dxa" w:w="5499"/>
+          </w:tcPr>
+          <w:p>
+            <w:r>
+              <w:rPr>
+                <w:sz w:val="17"/>
+              </w:rPr>
+            </w:r>
+            <w:r>
+              <w:rPr>
+                <w:sz w:val="17"/>
+              </w:rPr>
+              <w:t>Opening hours written to the working copy; no GitHub request made</w:t>
+            </w:r>
+          </w:p>
+        </w:tc>
+      </w:tr>
+      <w:tr>
+        <w:tc>
+          <w:tcPr>
+            <w:tcW w:type="dxa" w:w="454"/>
+          </w:tcPr>
+          <w:p>
+            <w:r>
+              <w:rPr>
+                <w:sz w:val="17"/>
+              </w:rPr>
+            </w:r>
+            <w:r>
+              <w:rPr>
+                <w:sz w:val="17"/>
+              </w:rPr>
               <w:t>8</w:t>
             </w:r>
           </w:p>
@@ -6578,7 +7214,7 @@
               <w:rPr>
                 <w:sz w:val="17"/>
               </w:rPr>
-              <w:t>No link or reference to /admin in the public page; editor page is noindex; base-path-correct logo; CSP present with no violations; no local-mode button off localhost; sign-in works</w:t>
+              <w:t>…/admin without a trailing slash redirects to …/admin/ keeping the #/route; no link or reference to /admin in the public page; editor page is noindex; base-path-correct logo; CSP present with no violations; no local-mode button off localhost; sign-in works</w:t>
             </w:r>
           </w:p>
         </w:tc>
@@ -6591,7 +7227,16 @@
           <w:b w:val="0"/>
           <w:i w:val="0"/>
         </w:rPr>
-        <w:t>Run with `npm run test:e2e`. npm install brings the Playwright package but not the browser binary; run `npm run test:e2e:setup` (= `npx playwright install chromium`) once — the test prints this hint and exits if Chromium is missing. The test also writes the screenshots used in this document and in the manager guide (docs/images/cms/). Static checks: `npm run lint` type-checks the site, the Vite plugins and the CMS configuration; `npm run validate:content` validates the committed content. Both run in CI.</w:t>
+        <w:t>The publishing gate's decision logic is covered by `npm run test:unit` (node:test, tests/unit/cms-publish-gate.test.mjs): code PRs pass through, Draft/In Review/deletion are pending, Ready merges only with a green PR check, the four-eyes rule, failure cases. The GitHub API calls around it are thin and reviewed by hand; the first real Ready → merge → deploy cycle is a post-deployment check (§12).</w:t>
+      </w:r>
+    </w:p>
+    <w:p>
+      <w:r>
+        <w:rPr>
+          <w:b w:val="0"/>
+          <w:i w:val="0"/>
+        </w:rPr>
+        <w:t>Run with `npm run test:e2e`. Screenshots are written to the git-ignored test-results/ folder; `UPDATE_SCREENSHOTS=1 npm run test:e2e` refreshes the committed documentation images. npm install brings the Playwright package but not the browser binary; run `npm run test:e2e:setup` (= `npx playwright install chromium`) once — the test prints this hint and exits if Chromium is missing. The test also writes the screenshots used in this document and in the manager guide (docs/images/cms/). Static checks: `npm run lint` type-checks the site, the Vite plugins and the CMS configuration; `npm run validate:content` validates the committed content. Both run in CI.</w:t>
       </w:r>
     </w:p>
     <w:p>
@@ -6657,7 +7302,7 @@
         <w:pStyle w:val="ListNumber"/>
       </w:pPr>
       <w:r>
-        <w:t>Protect main (Settings → Branches or Rules): require a pull request before merging, require 1 approval, require the status check “Validate &amp; build (PR)”, block force pushes. Optionally require conversation resolution. Enable Settings → General → Automatically delete head branches.</w:t>
+        <w:t>Protect main (Settings → Branches or Rules): require a pull request before merging; require the status checks “Validate &amp; build (PR)” and “sveltia/workflow” (GitHub offers a status in the picker once it has been reported — open any pull request first); block force pushes; required approvals 0 for the no-GitHub publishing flow (or 1 if a developer should merge content on GitHub — the gate then reports why it cannot merge). Optionally set the repository variable CMS_REQUIRE_SECOND_REVIEWER=true (four-eyes rule). Enable Settings → General → Automatically delete head branches.</w:t>
       </w:r>
     </w:p>
     <w:p>
@@ -6673,7 +7318,7 @@
         <w:pStyle w:val="ListNumber"/>
       </w:pPr>
       <w:r>
-        <w:t>Post-deployment checks: open the editor URL directly (it is not linked from the site), sign in as the manager, save a harmless change (e.g. the announcement), confirm the pull request appears with the PR check running, approve, merge, and confirm the site updates.</w:t>
+        <w:t>Post-deployment checks: open the editor URL directly (it is not linked from the site), sign in as the manager, save a harmless change (e.g. the announcement), Send for Review, confirm on GitHub that the PR shows the pending “sveltia/workflow” status and cannot be merged, move the card to Ready in the editor, and confirm the gate merges it, the deploy workflow runs and the site updates — without touching GitHub.</w:t>
       </w:r>
     </w:p>
     <w:p>
@@ -7043,7 +7688,7 @@
               <w:rPr>
                 <w:sz w:val="18"/>
               </w:rPr>
-              <w:t>After sign-in: empty page, “Collection not found.” + Back button</w:t>
+              <w:t>Collections show 0 entries in GitHub mode but are full in local mode (seen after v1.3: Menu Items / Menu Sections)</w:t>
             </w:r>
           </w:p>
         </w:tc>
@@ -7061,7 +7706,7 @@
               <w:rPr>
                 <w:sz w:val="18"/>
               </w:rPr>
-              <w:t>The URL names a collection that does not exist (observed: …/admin/#/collections/settings — a bookmark from an earlier configuration). v1.3 drops such a hash on load and opens the start page; otherwise open the plain editor URL.</w:t>
+              <w:t>The folders exist in the working copy but not on the GitHub branch being read. The content-check banner names them; commit and push (or merge) to main and reload.</w:t>
             </w:r>
           </w:p>
         </w:tc>
@@ -7081,7 +7726,7 @@
               <w:rPr>
                 <w:sz w:val="18"/>
               </w:rPr>
-              <w:t>Sidebar labels clipped (“Site Conte…”) on laptop-sized windows; wordmark overlapping the logo border on Windows</w:t>
+              <w:t>After sign-in: empty page, “Collection not found.” + Back button</w:t>
             </w:r>
           </w:p>
         </w:tc>
@@ -7099,7 +7744,7 @@
               <w:rPr>
                 <w:sz w:val="18"/>
               </w:rPr>
-              <w:t>Fixed in v1.3 (sidebar minimum width in theme.css; textLength in logo.svg). Hard-refresh to load the new build.</w:t>
+              <w:t>The URL names a collection that does not exist (observed: …/admin/#/collections/settings — a bookmark from an earlier configuration). v1.3 drops such a hash on load and opens the start page; otherwise open the plain editor URL.</w:t>
             </w:r>
           </w:p>
         </w:tc>
@@ -7119,7 +7764,7 @@
               <w:rPr>
                 <w:sz w:val="18"/>
               </w:rPr>
-              <w:t>“Work with Local Repository” no longer offered (developer machine)</w:t>
+              <w:t>Sidebar labels clipped (“Site Conte…”) on laptop-sized windows; wordmark overlapping the logo border on Windows</w:t>
             </w:r>
           </w:p>
         </w:tc>
@@ -7137,7 +7782,7 @@
               <w:rPr>
                 <w:sz w:val="18"/>
               </w:rPr>
-              <w:t>Still signed in from a previous session (login page skipped) or opened via a non-localhost address. Sign Out from the account menu, or open http://localhost:3000/admin/.</w:t>
+              <w:t>Fixed in v1.3 (sidebar minimum width in theme.css; textLength in logo.svg). Hard-refresh to load the new build.</w:t>
             </w:r>
           </w:p>
         </w:tc>
@@ -7157,6 +7802,44 @@
               <w:rPr>
                 <w:sz w:val="18"/>
               </w:rPr>
+              <w:t>“Work with Local Repository” no longer offered (developer machine)</w:t>
+            </w:r>
+          </w:p>
+        </w:tc>
+        <w:tc>
+          <w:tcPr>
+            <w:tcW w:type="dxa" w:w="6803"/>
+          </w:tcPr>
+          <w:p>
+            <w:r>
+              <w:rPr>
+                <w:sz w:val="18"/>
+              </w:rPr>
+            </w:r>
+            <w:r>
+              <w:rPr>
+                <w:sz w:val="18"/>
+              </w:rPr>
+              <w:t>Still signed in from a previous session (login page skipped) or opened via a non-localhost address. Sign Out from the account menu, or open http://localhost:3000/admin/.</w:t>
+            </w:r>
+          </w:p>
+        </w:tc>
+      </w:tr>
+      <w:tr>
+        <w:tc>
+          <w:tcPr>
+            <w:tcW w:type="dxa" w:w="2551"/>
+          </w:tcPr>
+          <w:p>
+            <w:r>
+              <w:rPr>
+                <w:sz w:val="18"/>
+              </w:rPr>
+            </w:r>
+            <w:r>
+              <w:rPr>
+                <w:sz w:val="18"/>
+              </w:rPr>
               <w:t>Editor shows no existing content (Blog Posts 0, empty fields) but can create items</w:t>
             </w:r>
           </w:p>
@@ -7176,6 +7859,535 @@
                 <w:sz w:val="18"/>
               </w:rPr>
               <w:t>The branch the editor reads has no content/ folder. Check which branch holds content/ and make it the default branch (must be main for deployment). If the branch is right, clear a stale editor cache: sign out, clear site data for the editor URL, sign in again.</w:t>
+            </w:r>
+          </w:p>
+        </w:tc>
+      </w:tr>
+    </w:tbl>
+    <w:p/>
+    <w:p>
+      <w:pPr>
+        <w:pStyle w:val="Heading2"/>
+      </w:pPr>
+      <w:r>
+        <w:t>12.3 Developer workflow between content updates</w:t>
+      </w:r>
+    </w:p>
+    <w:p>
+      <w:r>
+        <w:rPr>
+          <w:b w:val="0"/>
+          <w:i w:val="0"/>
+        </w:rPr>
+        <w:t>Content pull requests land on main continuously through the publish gate, so the repository's main branch moves without any developer action. Code patches must therefore be made on short-lived branches started from the current main, and the working tree on the developer machine must stay clean so that git can fast-forward. The procedure below was written after a rebase on the developer box left content/menu-items/ unpushed (§16, v1.4).</w:t>
+      </w:r>
+    </w:p>
+    <w:tbl>
+      <w:tblPr>
+        <w:tblStyle w:val="TableGrid"/>
+        <w:tblW w:type="auto" w:w="0"/>
+        <w:jc w:val="center"/>
+        <w:tblLook w:firstColumn="1" w:firstRow="1" w:lastColumn="0" w:lastRow="0" w:noHBand="0" w:noVBand="1" w:val="04A0"/>
+      </w:tblPr>
+      <w:tblGrid>
+        <w:gridCol w:w="3137"/>
+        <w:gridCol w:w="3137"/>
+        <w:gridCol w:w="3137"/>
+      </w:tblGrid>
+      <w:tr>
+        <w:tc>
+          <w:tcPr>
+            <w:tcW w:type="dxa" w:w="2041"/>
+            <w:shd w:val="clear" w:color="auto" w:fill="F0E7DC"/>
+          </w:tcPr>
+          <w:p>
+            <w:r/>
+            <w:r>
+              <w:rPr>
+                <w:b/>
+                <w:sz w:val="17"/>
+              </w:rPr>
+              <w:t>Step</w:t>
+            </w:r>
+          </w:p>
+        </w:tc>
+        <w:tc>
+          <w:tcPr>
+            <w:tcW w:type="dxa" w:w="2835"/>
+            <w:shd w:val="clear" w:color="auto" w:fill="F0E7DC"/>
+          </w:tcPr>
+          <w:p>
+            <w:r/>
+            <w:r>
+              <w:rPr>
+                <w:b/>
+                <w:sz w:val="17"/>
+              </w:rPr>
+              <w:t>Command / action</w:t>
+            </w:r>
+          </w:p>
+        </w:tc>
+        <w:tc>
+          <w:tcPr>
+            <w:tcW w:type="dxa" w:w="4479"/>
+            <w:shd w:val="clear" w:color="auto" w:fill="F0E7DC"/>
+          </w:tcPr>
+          <w:p>
+            <w:r/>
+            <w:r>
+              <w:rPr>
+                <w:b/>
+                <w:sz w:val="17"/>
+              </w:rPr>
+              <w:t>Notes</w:t>
+            </w:r>
+          </w:p>
+        </w:tc>
+      </w:tr>
+      <w:tr>
+        <w:tc>
+          <w:tcPr>
+            <w:tcW w:type="dxa" w:w="2041"/>
+          </w:tcPr>
+          <w:p>
+            <w:r>
+              <w:rPr>
+                <w:sz w:val="17"/>
+              </w:rPr>
+            </w:r>
+            <w:r>
+              <w:rPr>
+                <w:sz w:val="17"/>
+              </w:rPr>
+              <w:t>1. Start from the deployed state</w:t>
+            </w:r>
+          </w:p>
+        </w:tc>
+        <w:tc>
+          <w:tcPr>
+            <w:tcW w:type="dxa" w:w="2835"/>
+          </w:tcPr>
+          <w:p>
+            <w:r>
+              <w:rPr>
+                <w:sz w:val="17"/>
+              </w:rPr>
+            </w:r>
+            <w:r>
+              <w:rPr>
+                <w:sz w:val="17"/>
+              </w:rPr>
+              <w:t>git switch main · git pull --ff-only</w:t>
+            </w:r>
+          </w:p>
+        </w:tc>
+        <w:tc>
+          <w:tcPr>
+            <w:tcW w:type="dxa" w:w="4479"/>
+          </w:tcPr>
+          <w:p>
+            <w:r>
+              <w:rPr>
+                <w:sz w:val="17"/>
+              </w:rPr>
+            </w:r>
+            <w:r>
+              <w:rPr>
+                <w:sz w:val="17"/>
+              </w:rPr>
+              <w:t>If --ff-only refuses, main has local commits that never went through a PR: move them to a branch (git switch -c rescue; git switch main; git reset --hard origin/main).</w:t>
+            </w:r>
+          </w:p>
+        </w:tc>
+      </w:tr>
+      <w:tr>
+        <w:tc>
+          <w:tcPr>
+            <w:tcW w:type="dxa" w:w="2041"/>
+          </w:tcPr>
+          <w:p>
+            <w:r>
+              <w:rPr>
+                <w:sz w:val="17"/>
+              </w:rPr>
+            </w:r>
+            <w:r>
+              <w:rPr>
+                <w:sz w:val="17"/>
+              </w:rPr>
+              <w:t>2. Branch per patch</w:t>
+            </w:r>
+          </w:p>
+        </w:tc>
+        <w:tc>
+          <w:tcPr>
+            <w:tcW w:type="dxa" w:w="2835"/>
+          </w:tcPr>
+          <w:p>
+            <w:r>
+              <w:rPr>
+                <w:sz w:val="17"/>
+              </w:rPr>
+            </w:r>
+            <w:r>
+              <w:rPr>
+                <w:sz w:val="17"/>
+              </w:rPr>
+              <w:t>git switch -c fix/&lt;topic&gt;</w:t>
+            </w:r>
+          </w:p>
+        </w:tc>
+        <w:tc>
+          <w:tcPr>
+            <w:tcW w:type="dxa" w:w="4479"/>
+          </w:tcPr>
+          <w:p>
+            <w:r>
+              <w:rPr>
+                <w:sz w:val="17"/>
+              </w:rPr>
+            </w:r>
+            <w:r>
+              <w:rPr>
+                <w:sz w:val="17"/>
+              </w:rPr>
+              <w:t>Never commit on main; the branch rule would reject the push anyway.</w:t>
+            </w:r>
+          </w:p>
+        </w:tc>
+      </w:tr>
+      <w:tr>
+        <w:tc>
+          <w:tcPr>
+            <w:tcW w:type="dxa" w:w="2041"/>
+          </w:tcPr>
+          <w:p>
+            <w:r>
+              <w:rPr>
+                <w:sz w:val="17"/>
+              </w:rPr>
+            </w:r>
+            <w:r>
+              <w:rPr>
+                <w:sz w:val="17"/>
+              </w:rPr>
+              <w:t>3. Work and verify</w:t>
+            </w:r>
+          </w:p>
+        </w:tc>
+        <w:tc>
+          <w:tcPr>
+            <w:tcW w:type="dxa" w:w="2835"/>
+          </w:tcPr>
+          <w:p>
+            <w:r>
+              <w:rPr>
+                <w:sz w:val="17"/>
+              </w:rPr>
+            </w:r>
+            <w:r>
+              <w:rPr>
+                <w:sz w:val="17"/>
+              </w:rPr>
+              <w:t>npm run check · npm run test:e2e</w:t>
+            </w:r>
+          </w:p>
+        </w:tc>
+        <w:tc>
+          <w:tcPr>
+            <w:tcW w:type="dxa" w:w="4479"/>
+          </w:tcPr>
+          <w:p>
+            <w:r>
+              <w:rPr>
+                <w:sz w:val="17"/>
+              </w:rPr>
+            </w:r>
+            <w:r>
+              <w:rPr>
+                <w:sz w:val="17"/>
+              </w:rPr>
+              <w:t>check = type-check + content validator + unit tests + build. The e2e test writes screenshots to test-results/ (ignored); only UPDATE_SCREENSHOTS=1 touches docs/images/cms/. dist/ and node_modules/ are ignored.</w:t>
+            </w:r>
+          </w:p>
+        </w:tc>
+      </w:tr>
+      <w:tr>
+        <w:tc>
+          <w:tcPr>
+            <w:tcW w:type="dxa" w:w="2041"/>
+          </w:tcPr>
+          <w:p>
+            <w:r>
+              <w:rPr>
+                <w:sz w:val="17"/>
+              </w:rPr>
+            </w:r>
+            <w:r>
+              <w:rPr>
+                <w:sz w:val="17"/>
+              </w:rPr>
+              <w:t>4. Keep the tree clean</w:t>
+            </w:r>
+          </w:p>
+        </w:tc>
+        <w:tc>
+          <w:tcPr>
+            <w:tcW w:type="dxa" w:w="2835"/>
+          </w:tcPr>
+          <w:p>
+            <w:r>
+              <w:rPr>
+                <w:sz w:val="17"/>
+              </w:rPr>
+            </w:r>
+            <w:r>
+              <w:rPr>
+                <w:sz w:val="17"/>
+              </w:rPr>
+              <w:t>git status before any pull/rebase</w:t>
+            </w:r>
+          </w:p>
+        </w:tc>
+        <w:tc>
+          <w:tcPr>
+            <w:tcW w:type="dxa" w:w="4479"/>
+          </w:tcPr>
+          <w:p>
+            <w:r>
+              <w:rPr>
+                <w:sz w:val="17"/>
+              </w:rPr>
+            </w:r>
+            <w:r>
+              <w:rPr>
+                <w:sz w:val="17"/>
+              </w:rPr>
+              <w:t>git pull --rebase and git rebase refuse to run with unstaged or untracked-but-conflicting files. Commit to the branch, or git stash --include-untracked; git config rebase.autoStash true automates the stash. Never git add -A blindly — screenshots and other local artefacts stay out of commits.</w:t>
+            </w:r>
+          </w:p>
+        </w:tc>
+      </w:tr>
+      <w:tr>
+        <w:tc>
+          <w:tcPr>
+            <w:tcW w:type="dxa" w:w="2041"/>
+          </w:tcPr>
+          <w:p>
+            <w:r>
+              <w:rPr>
+                <w:sz w:val="17"/>
+              </w:rPr>
+            </w:r>
+            <w:r>
+              <w:rPr>
+                <w:sz w:val="17"/>
+              </w:rPr>
+              <w:t>5. Update the branch if main moved</w:t>
+            </w:r>
+          </w:p>
+        </w:tc>
+        <w:tc>
+          <w:tcPr>
+            <w:tcW w:type="dxa" w:w="2835"/>
+          </w:tcPr>
+          <w:p>
+            <w:r>
+              <w:rPr>
+                <w:sz w:val="17"/>
+              </w:rPr>
+            </w:r>
+            <w:r>
+              <w:rPr>
+                <w:sz w:val="17"/>
+              </w:rPr>
+              <w:t>git fetch · git rebase origin/main  (or merge)</w:t>
+            </w:r>
+          </w:p>
+        </w:tc>
+        <w:tc>
+          <w:tcPr>
+            <w:tcW w:type="dxa" w:w="4479"/>
+          </w:tcPr>
+          <w:p>
+            <w:r>
+              <w:rPr>
+                <w:sz w:val="17"/>
+              </w:rPr>
+            </w:r>
+            <w:r>
+              <w:rPr>
+                <w:sz w:val="17"/>
+              </w:rPr>
+              <w:t>Content PRs merged meanwhile only touch content/; conflicts are rare and confined to files both sides edited.</w:t>
+            </w:r>
+          </w:p>
+        </w:tc>
+      </w:tr>
+      <w:tr>
+        <w:tc>
+          <w:tcPr>
+            <w:tcW w:type="dxa" w:w="2041"/>
+          </w:tcPr>
+          <w:p>
+            <w:r>
+              <w:rPr>
+                <w:sz w:val="17"/>
+              </w:rPr>
+            </w:r>
+            <w:r>
+              <w:rPr>
+                <w:sz w:val="17"/>
+              </w:rPr>
+              <w:t>6. Push and open a PR</w:t>
+            </w:r>
+          </w:p>
+        </w:tc>
+        <w:tc>
+          <w:tcPr>
+            <w:tcW w:type="dxa" w:w="2835"/>
+          </w:tcPr>
+          <w:p>
+            <w:r>
+              <w:rPr>
+                <w:sz w:val="17"/>
+              </w:rPr>
+            </w:r>
+            <w:r>
+              <w:rPr>
+                <w:sz w:val="17"/>
+              </w:rPr>
+              <w:t>git push -u origin HEAD</w:t>
+            </w:r>
+          </w:p>
+        </w:tc>
+        <w:tc>
+          <w:tcPr>
+            <w:tcW w:type="dxa" w:w="4479"/>
+          </w:tcPr>
+          <w:p>
+            <w:r>
+              <w:rPr>
+                <w:sz w:val="17"/>
+              </w:rPr>
+            </w:r>
+            <w:r>
+              <w:rPr>
+                <w:sz w:val="17"/>
+              </w:rPr>
+              <w:t>The PR check runs; the gate reports sveltia/workflow = success for code PRs, so the branch rule is satisfied as soon as the check is green. Merge on GitHub (squash).</w:t>
+            </w:r>
+          </w:p>
+        </w:tc>
+      </w:tr>
+      <w:tr>
+        <w:tc>
+          <w:tcPr>
+            <w:tcW w:type="dxa" w:w="2041"/>
+          </w:tcPr>
+          <w:p>
+            <w:r>
+              <w:rPr>
+                <w:sz w:val="17"/>
+              </w:rPr>
+            </w:r>
+            <w:r>
+              <w:rPr>
+                <w:sz w:val="17"/>
+              </w:rPr>
+              <w:t>7. Content-model changes</w:t>
+            </w:r>
+          </w:p>
+        </w:tc>
+        <w:tc>
+          <w:tcPr>
+            <w:tcW w:type="dxa" w:w="2835"/>
+          </w:tcPr>
+          <w:p>
+            <w:r>
+              <w:rPr>
+                <w:sz w:val="17"/>
+              </w:rPr>
+            </w:r>
+            <w:r>
+              <w:rPr>
+                <w:sz w:val="17"/>
+              </w:rPr>
+              <w:t>one PR with code + content + migrated files</w:t>
+            </w:r>
+          </w:p>
+        </w:tc>
+        <w:tc>
+          <w:tcPr>
+            <w:tcW w:type="dxa" w:w="4479"/>
+          </w:tcPr>
+          <w:p>
+            <w:r>
+              <w:rPr>
+                <w:sz w:val="17"/>
+              </w:rPr>
+            </w:r>
+            <w:r>
+              <w:rPr>
+                <w:sz w:val="17"/>
+              </w:rPr>
+              <w:t>First publish or discard the open CMS pull requests (their branches carry the old structure), then merge the model change, then test GitHub mode — it reads the remote branch, so a folder that only exists locally shows as an empty collection (the editor's content-check banner says so).</w:t>
+            </w:r>
+          </w:p>
+        </w:tc>
+      </w:tr>
+      <w:tr>
+        <w:tc>
+          <w:tcPr>
+            <w:tcW w:type="dxa" w:w="2041"/>
+          </w:tcPr>
+          <w:p>
+            <w:r>
+              <w:rPr>
+                <w:sz w:val="17"/>
+              </w:rPr>
+            </w:r>
+            <w:r>
+              <w:rPr>
+                <w:sz w:val="17"/>
+              </w:rPr>
+              <w:t>8. Regenerating documents</w:t>
+            </w:r>
+          </w:p>
+        </w:tc>
+        <w:tc>
+          <w:tcPr>
+            <w:tcW w:type="dxa" w:w="2835"/>
+          </w:tcPr>
+          <w:p>
+            <w:r>
+              <w:rPr>
+                <w:sz w:val="17"/>
+              </w:rPr>
+            </w:r>
+            <w:r>
+              <w:rPr>
+                <w:sz w:val="17"/>
+              </w:rPr>
+              <w:t>python3 docs/src/build-tdd.py etc.</w:t>
+            </w:r>
+          </w:p>
+        </w:tc>
+        <w:tc>
+          <w:tcPr>
+            <w:tcW w:type="dxa" w:w="4479"/>
+          </w:tcPr>
+          <w:p>
+            <w:r>
+              <w:rPr>
+                <w:sz w:val="17"/>
+              </w:rPr>
+            </w:r>
+            <w:r>
+              <w:rPr>
+                <w:sz w:val="17"/>
+              </w:rPr>
+              <w:t>Only when the documents are meant to change; the outputs are committed files.</w:t>
             </w:r>
           </w:p>
         </w:tc>
@@ -7970,6 +9182,302 @@
                 <w:sz w:val="16"/>
               </w:rPr>
               <w:t>Workflow state lives in GitHub by design — a draft without a PR is invisible to everyone else; GitHub draft PRs already express “not yet”; merged PRs leave the board, so “Published” is the website itself (§7.2)</w:t>
+            </w:r>
+          </w:p>
+        </w:tc>
+      </w:tr>
+      <w:tr>
+        <w:tc>
+          <w:tcPr>
+            <w:tcW w:type="dxa" w:w="510"/>
+          </w:tcPr>
+          <w:p>
+            <w:r>
+              <w:rPr>
+                <w:sz w:val="16"/>
+              </w:rPr>
+            </w:r>
+            <w:r>
+              <w:rPr>
+                <w:sz w:val="16"/>
+              </w:rPr>
+              <w:t>D19</w:t>
+            </w:r>
+          </w:p>
+        </w:tc>
+        <w:tc>
+          <w:tcPr>
+            <w:tcW w:type="dxa" w:w="2608"/>
+          </w:tcPr>
+          <w:p>
+            <w:r>
+              <w:rPr>
+                <w:sz w:val="16"/>
+              </w:rPr>
+            </w:r>
+            <w:r>
+              <w:rPr>
+                <w:sz w:val="16"/>
+              </w:rPr>
+              <w:t>Content-source check after GitHub sign-in, with a banner naming missing folders/files (v1.4)</w:t>
+            </w:r>
+          </w:p>
+        </w:tc>
+        <w:tc>
+          <w:tcPr>
+            <w:tcW w:type="dxa" w:w="2438"/>
+          </w:tcPr>
+          <w:p>
+            <w:r>
+              <w:rPr>
+                <w:sz w:val="16"/>
+              </w:rPr>
+            </w:r>
+            <w:r>
+              <w:rPr>
+                <w:sz w:val="16"/>
+              </w:rPr>
+              <w:t>Rely on documentation only; a CI check (cannot see what the editor reads); fetching content from the working copy in GitHub mode (not how Sveltia works)</w:t>
+            </w:r>
+          </w:p>
+        </w:tc>
+        <w:tc>
+          <w:tcPr>
+            <w:tcW w:type="dxa" w:w="3798"/>
+          </w:tcPr>
+          <w:p>
+            <w:r>
+              <w:rPr>
+                <w:sz w:val="16"/>
+              </w:rPr>
+            </w:r>
+            <w:r>
+              <w:rPr>
+                <w:sz w:val="16"/>
+              </w:rPr>
+              <w:t>An empty collection with no error is indistinguishable from a bug; the editor has the token and the config, so it can verify the branch itself in a few cheap API calls. Read-only, dismissible, never blocks</w:t>
+            </w:r>
+          </w:p>
+        </w:tc>
+      </w:tr>
+      <w:tr>
+        <w:tc>
+          <w:tcPr>
+            <w:tcW w:type="dxa" w:w="510"/>
+          </w:tcPr>
+          <w:p>
+            <w:r>
+              <w:rPr>
+                <w:sz w:val="16"/>
+              </w:rPr>
+            </w:r>
+            <w:r>
+              <w:rPr>
+                <w:sz w:val="16"/>
+              </w:rPr>
+              <w:t>D20</w:t>
+            </w:r>
+          </w:p>
+        </w:tc>
+        <w:tc>
+          <w:tcPr>
+            <w:tcW w:type="dxa" w:w="2608"/>
+          </w:tcPr>
+          <w:p>
+            <w:r>
+              <w:rPr>
+                <w:sz w:val="16"/>
+              </w:rPr>
+            </w:r>
+            <w:r>
+              <w:rPr>
+                <w:sz w:val="16"/>
+              </w:rPr>
+              <w:t>CMS publish gate: commit status bound to the editor's lane, automatic squash-merge + deploy dispatch on Ready (v1.5)</w:t>
+            </w:r>
+          </w:p>
+        </w:tc>
+        <w:tc>
+          <w:tcPr>
+            <w:tcW w:type="dxa" w:w="2438"/>
+          </w:tcPr>
+          <w:p>
+            <w:r>
+              <w:rPr>
+                <w:sz w:val="16"/>
+              </w:rPr>
+            </w:r>
+            <w:r>
+              <w:rPr>
+                <w:sz w:val="16"/>
+              </w:rPr>
+              <w:t>Leave approval on GitHub (v1.0–1.4); GitHub auto-merge (needs a PAT/App token so the merge triggers workflows, and still an approval); a bot that sets GitHub reviews from labels</w:t>
+            </w:r>
+          </w:p>
+        </w:tc>
+        <w:tc>
+          <w:tcPr>
+            <w:tcW w:type="dxa" w:w="3798"/>
+          </w:tcPr>
+          <w:p>
+            <w:r>
+              <w:rPr>
+                <w:sz w:val="16"/>
+              </w:rPr>
+            </w:r>
+            <w:r>
+              <w:rPr>
+                <w:sz w:val="16"/>
+              </w:rPr>
+              <w:t>The owner's goal is that staff never open GitHub. Labels are the only signal Sveltia emits; a required status is the only GitHub mechanism that can block merging on a label; merging + workflow_dispatch from the gate needs no extra credentials. Trade-off: approval moves into the editor (0 required GitHub approvals), mitigated by the optional four-eyes rule and full PR audit trail (§8.5)</w:t>
+            </w:r>
+          </w:p>
+        </w:tc>
+      </w:tr>
+      <w:tr>
+        <w:tc>
+          <w:tcPr>
+            <w:tcW w:type="dxa" w:w="510"/>
+          </w:tcPr>
+          <w:p>
+            <w:r>
+              <w:rPr>
+                <w:sz w:val="16"/>
+              </w:rPr>
+            </w:r>
+            <w:r>
+              <w:rPr>
+                <w:sz w:val="16"/>
+              </w:rPr>
+              <w:t>D21</w:t>
+            </w:r>
+          </w:p>
+        </w:tc>
+        <w:tc>
+          <w:tcPr>
+            <w:tcW w:type="dxa" w:w="2608"/>
+          </w:tcPr>
+          <w:p>
+            <w:r>
+              <w:rPr>
+                <w:sz w:val="16"/>
+              </w:rPr>
+            </w:r>
+            <w:r>
+              <w:rPr>
+                <w:sz w:val="16"/>
+              </w:rPr>
+              <w:t>Deletion requests are never auto-merged</w:t>
+            </w:r>
+          </w:p>
+        </w:tc>
+        <w:tc>
+          <w:tcPr>
+            <w:tcW w:type="dxa" w:w="2438"/>
+          </w:tcPr>
+          <w:p>
+            <w:r>
+              <w:rPr>
+                <w:sz w:val="16"/>
+              </w:rPr>
+            </w:r>
+            <w:r>
+              <w:rPr>
+                <w:sz w:val="16"/>
+              </w:rPr>
+              <w:t>Treat pending_deletion like Ready</w:t>
+            </w:r>
+          </w:p>
+        </w:tc>
+        <w:tc>
+          <w:tcPr>
+            <w:tcW w:type="dxa" w:w="3798"/>
+          </w:tcPr>
+          <w:p>
+            <w:r>
+              <w:rPr>
+                <w:sz w:val="16"/>
+              </w:rPr>
+            </w:r>
+            <w:r>
+              <w:rPr>
+                <w:sz w:val="16"/>
+              </w:rPr>
+              <w:t>Removing content is rare and irreversible in the UI sense; a developer merges those on GitHub</w:t>
+            </w:r>
+          </w:p>
+        </w:tc>
+      </w:tr>
+      <w:tr>
+        <w:tc>
+          <w:tcPr>
+            <w:tcW w:type="dxa" w:w="510"/>
+          </w:tcPr>
+          <w:p>
+            <w:r>
+              <w:rPr>
+                <w:sz w:val="16"/>
+              </w:rPr>
+            </w:r>
+            <w:r>
+              <w:rPr>
+                <w:sz w:val="16"/>
+              </w:rPr>
+              <w:t>D22</w:t>
+            </w:r>
+          </w:p>
+        </w:tc>
+        <w:tc>
+          <w:tcPr>
+            <w:tcW w:type="dxa" w:w="2608"/>
+          </w:tcPr>
+          <w:p>
+            <w:r>
+              <w:rPr>
+                <w:sz w:val="16"/>
+              </w:rPr>
+            </w:r>
+            <w:r>
+              <w:rPr>
+                <w:sz w:val="16"/>
+              </w:rPr>
+              <w:t>e2e screenshots go to test-results/ unless UPDATE_SCREENSHOTS=1; /admin without slash redirects (v1.5)</w:t>
+            </w:r>
+          </w:p>
+        </w:tc>
+        <w:tc>
+          <w:tcPr>
+            <w:tcW w:type="dxa" w:w="2438"/>
+          </w:tcPr>
+          <w:p>
+            <w:r>
+              <w:rPr>
+                <w:sz w:val="16"/>
+              </w:rPr>
+            </w:r>
+            <w:r>
+              <w:rPr>
+                <w:sz w:val="16"/>
+              </w:rPr>
+              <w:t>Always overwrite docs images; rely on Pages' directory redirect</w:t>
+            </w:r>
+          </w:p>
+        </w:tc>
+        <w:tc>
+          <w:tcPr>
+            <w:tcW w:type="dxa" w:w="3798"/>
+          </w:tcPr>
+          <w:p>
+            <w:r>
+              <w:rPr>
+                <w:sz w:val="16"/>
+              </w:rPr>
+            </w:r>
+            <w:r>
+              <w:rPr>
+                <w:sz w:val="16"/>
+              </w:rPr>
+              <w:t>Running tests must not dirty the working tree (it did, and interfered with git rebase); the dev server's SPA fallback showed the website for /admin</w:t>
             </w:r>
           </w:p>
         </w:tc>
@@ -8757,6 +10265,34 @@
       </w:r>
       <w:r>
         <w:t xml:space="preserve"> Hero copy, contact details, the “Batch Capacity” notice and the header hours badge are still hard-coded. They can be moved to content/ with the same pattern if routine updates are expected.</w:t>
+      </w:r>
+    </w:p>
+    <w:p>
+      <w:pPr>
+        <w:pStyle w:val="ListBullet"/>
+      </w:pPr>
+      <w:r>
+        <w:rPr>
+          <w:b/>
+        </w:rPr>
+        <w:t>Who may publish?</w:t>
+      </w:r>
+      <w:r>
+        <w:t xml:space="preserve"> With the publish gate, moving a card to Ready publishes it. Decide whether every editor may do that or only the manager — GitHub cannot restrict who applies a label, so this is a staff instruction unless CMS_REQUIRE_SECOND_REVIEWER=true (author ≠ approver) is enough.</w:t>
+      </w:r>
+    </w:p>
+    <w:p>
+      <w:pPr>
+        <w:pStyle w:val="ListBullet"/>
+      </w:pPr>
+      <w:r>
+        <w:rPr>
+          <w:b/>
+        </w:rPr>
+        <w:t>Deletions.</w:t>
+      </w:r>
+      <w:r>
+        <w:t xml:space="preserve"> Deleting an entry in the editor still ends in a pull request that a developer merges on GitHub (D21). If staff need to remove dishes themselves, use the item's “Show on menu” switch instead, or extend the gate to deletions.</w:t>
       </w:r>
     </w:p>
     <w:p>
@@ -9561,6 +11097,118 @@
               <w:rPr>
                 <w:sz w:val="18"/>
               </w:rPr>
+              <w:t>1.5</w:t>
+            </w:r>
+          </w:p>
+        </w:tc>
+        <w:tc>
+          <w:tcPr>
+            <w:tcW w:type="dxa" w:w="5669"/>
+          </w:tcPr>
+          <w:p>
+            <w:r>
+              <w:rPr>
+                <w:sz w:val="18"/>
+              </w:rPr>
+            </w:r>
+            <w:r>
+              <w:rPr>
+                <w:sz w:val="18"/>
+              </w:rPr>
+              <w:t>CMS publish gate (cms-publish.yml + scripts/cms-publish-gate.mjs, unit-tested): GitHub mergeability follows the editor's lanes via the required status sveltia/workflow; Ready + green check → squash-merge + deploy dispatch, optional four-eyes rule (§8.5, D20, D21). Editor URL works without trailing slash (§5.4, D22). Developer workflow procedure (§12.3); e2e screenshots no longer dirty the working tree. Site Content file identifiers renamed (dough-announcement, opening-hours, menu-introduction) so PR titles are self-explanatory.</w:t>
+            </w:r>
+          </w:p>
+        </w:tc>
+        <w:tc>
+          <w:tcPr>
+            <w:tcW w:type="dxa" w:w="2778"/>
+          </w:tcPr>
+          <w:p>
+            <w:r>
+              <w:rPr>
+                <w:sz w:val="18"/>
+              </w:rPr>
+            </w:r>
+            <w:r>
+              <w:rPr>
+                <w:sz w:val="18"/>
+              </w:rPr>
+              <w:t>Owner requests: PRs showed as mergeable while only In Review; make Ready the publishing step and automate the merge so staff never visit GitHub; document the developer git workflow after a rebase mishap; allow the editor link without a trailing slash; clearer PR titles.</w:t>
+            </w:r>
+          </w:p>
+        </w:tc>
+      </w:tr>
+      <w:tr>
+        <w:tc>
+          <w:tcPr>
+            <w:tcW w:type="dxa" w:w="907"/>
+          </w:tcPr>
+          <w:p>
+            <w:r>
+              <w:rPr>
+                <w:sz w:val="18"/>
+              </w:rPr>
+            </w:r>
+            <w:r>
+              <w:rPr>
+                <w:sz w:val="18"/>
+              </w:rPr>
+              <w:t>1.4</w:t>
+            </w:r>
+          </w:p>
+        </w:tc>
+        <w:tc>
+          <w:tcPr>
+            <w:tcW w:type="dxa" w:w="5669"/>
+          </w:tcPr>
+          <w:p>
+            <w:r>
+              <w:rPr>
+                <w:sz w:val="18"/>
+              </w:rPr>
+            </w:r>
+            <w:r>
+              <w:rPr>
+                <w:sz w:val="18"/>
+              </w:rPr>
+              <w:t>Content-source check: after a GitHub sign-in the editor verifies every configured content folder/file exists on the branch it reads and shows a banner naming the missing ones (§6.3, D19). e2e scenario 10; README guidance on pushing content before testing GitHub mode.</w:t>
+            </w:r>
+          </w:p>
+        </w:tc>
+        <w:tc>
+          <w:tcPr>
+            <w:tcW w:type="dxa" w:w="2778"/>
+          </w:tcPr>
+          <w:p>
+            <w:r>
+              <w:rPr>
+                <w:sz w:val="18"/>
+              </w:rPr>
+            </w:r>
+            <w:r>
+              <w:rPr>
+                <w:sz w:val="18"/>
+              </w:rPr>
+              <w:t>Owner report: all menu items missing in GitHub auth mode but present in local mode after updating to v1.3 — reproduced as “branch on GitHub does not yet contain content/menu-items and content/menu-sections” (the same GitHub code path loads all 13 items when the folders are present, as e2e scenario 3 shows).</w:t>
+            </w:r>
+          </w:p>
+        </w:tc>
+      </w:tr>
+      <w:tr>
+        <w:tc>
+          <w:tcPr>
+            <w:tcW w:type="dxa" w:w="907"/>
+          </w:tcPr>
+          <w:p>
+            <w:r>
+              <w:rPr>
+                <w:sz w:val="18"/>
+              </w:rPr>
+            </w:r>
+            <w:r>
+              <w:rPr>
+                <w:sz w:val="18"/>
+              </w:rPr>
               <w:t>1.3</w:t>
             </w:r>
           </w:p>
@@ -9986,7 +11634,7 @@
               <w:rPr>
                 <w:sz w:val="17"/>
               </w:rPr>
-              <w:t>admin/index.html, src/admin/main.ts, src/admin/config.ts, src/admin/theme.css, src/admin/preview/templates.tsx, src/admin/preview/preview.css, public/admin/logo.svg</w:t>
+              <w:t>admin/index.html, src/admin/main.ts, src/admin/config.ts, src/admin/theme.css, src/admin/content-check.ts, src/admin/preview/templates.tsx, src/admin/preview/preview.css, public/admin/logo.svg</w:t>
             </w:r>
           </w:p>
         </w:tc>
@@ -10004,7 +11652,7 @@
               <w:rPr>
                 <w:sz w:val="17"/>
               </w:rPr>
-              <w:t>The editor: entry page, bootstrap, typed configuration, site theme (incl. hiding the asset UI), site-styled preview templates + stylesheet, logo</w:t>
+              <w:t>The editor: entry page, bootstrap, typed configuration, site theme (incl. hiding the asset UI), content-source check, site-styled preview templates + stylesheet, logo</w:t>
             </w:r>
           </w:p>
         </w:tc>
@@ -10138,7 +11786,7 @@
               <w:rPr>
                 <w:sz w:val="17"/>
               </w:rPr>
-              <w:t>.github/workflows/pr-check.yml, deploy.yml</w:t>
+              <w:t>.github/workflows/pr-check.yml, cms-publish.yml, deploy.yml; scripts/cms-publish-gate.mjs; tests/unit/</w:t>
             </w:r>
           </w:p>
         </w:tc>
@@ -10156,7 +11804,45 @@
               <w:rPr>
                 <w:sz w:val="17"/>
               </w:rPr>
-              <w:t>PR status check; build &amp; deploy to GitHub Pages</w:t>
+              <w:t>PR status check; publishing gate (status + auto-merge + deploy dispatch) with unit tests; build &amp; deploy to GitHub Pages</w:t>
+            </w:r>
+          </w:p>
+        </w:tc>
+      </w:tr>
+      <w:tr>
+        <w:tc>
+          <w:tcPr>
+            <w:tcW w:type="dxa" w:w="4535"/>
+          </w:tcPr>
+          <w:p>
+            <w:r>
+              <w:rPr>
+                <w:sz w:val="17"/>
+              </w:rPr>
+            </w:r>
+            <w:r>
+              <w:rPr>
+                <w:sz w:val="17"/>
+              </w:rPr>
+              <w:t>public/admin.html, tools/vite-plugin-admin-redirect.ts</w:t>
+            </w:r>
+          </w:p>
+        </w:tc>
+        <w:tc>
+          <w:tcPr>
+            <w:tcW w:type="dxa" w:w="4819"/>
+          </w:tcPr>
+          <w:p>
+            <w:r>
+              <w:rPr>
+                <w:sz w:val="17"/>
+              </w:rPr>
+            </w:r>
+            <w:r>
+              <w:rPr>
+                <w:sz w:val="17"/>
+              </w:rPr>
+              <w:t>…/admin without trailing slash → admin/ (Pages and dev server)</w:t>
             </w:r>
           </w:p>
         </w:tc>
@@ -10947,7 +12633,7 @@
               <a:graphicData uri="http://schemas.openxmlformats.org/drawingml/2006/picture">
                 <pic:pic>
                   <pic:nvPicPr>
-                    <pic:cNvPr id="0" name="14-local-mode-hours.png"/>
+                    <pic:cNvPr id="0" name="18-content-check-banner.png"/>
                     <pic:cNvPicPr/>
                   </pic:nvPicPr>
                   <pic:blipFill>
@@ -10981,7 +12667,60 @@
           <w:i/>
           <w:sz w:val="18"/>
         </w:rPr>
-        <w:t>B-13 — Local repository mode editing Opening Hours (day names are read-only); preview shows the Weekly Schedule table.</w:t>
+        <w:t>B-13 — Content-source check: the GitHub branch lacks the menu folders, so the collections are empty and the banner names what to push.</w:t>
+      </w:r>
+    </w:p>
+    <w:p>
+      <w:pPr>
+        <w:jc w:val="center"/>
+      </w:pPr>
+      <w:r>
+        <w:drawing>
+          <wp:inline xmlns:a="http://schemas.openxmlformats.org/drawingml/2006/main" xmlns:pic="http://schemas.openxmlformats.org/drawingml/2006/picture">
+            <wp:extent cx="5580000" cy="3487500"/>
+            <wp:docPr id="19" name="Picture 19"/>
+            <wp:cNvGraphicFramePr>
+              <a:graphicFrameLocks noChangeAspect="1"/>
+            </wp:cNvGraphicFramePr>
+            <a:graphic>
+              <a:graphicData uri="http://schemas.openxmlformats.org/drawingml/2006/picture">
+                <pic:pic>
+                  <pic:nvPicPr>
+                    <pic:cNvPr id="0" name="14-local-mode-hours.png"/>
+                    <pic:cNvPicPr/>
+                  </pic:nvPicPr>
+                  <pic:blipFill>
+                    <a:blip r:embed="rId26"/>
+                    <a:stretch>
+                      <a:fillRect/>
+                    </a:stretch>
+                  </pic:blipFill>
+                  <pic:spPr>
+                    <a:xfrm>
+                      <a:off x="0" y="0"/>
+                      <a:ext cx="5580000" cy="3487500"/>
+                    </a:xfrm>
+                    <a:prstGeom prst="rect"/>
+                  </pic:spPr>
+                </pic:pic>
+              </a:graphicData>
+            </a:graphic>
+          </wp:inline>
+        </w:drawing>
+      </w:r>
+    </w:p>
+    <w:p>
+      <w:pPr>
+        <w:spacing w:after="200"/>
+        <w:jc w:val="center"/>
+      </w:pPr>
+      <w:r>
+        <w:rPr>
+          <w:b w:val="0"/>
+          <w:i/>
+          <w:sz w:val="18"/>
+        </w:rPr>
+        <w:t>B-14 — Local repository mode editing Opening Hours (day names are read-only); preview shows the Weekly Schedule table.</w:t>
       </w:r>
     </w:p>
     <w:sectPr>

</xml_diff>

<commit_message>
Doc changes and python doc generator fixes
</commit_message>
<xml_diff>
--- a/docs/Technical-Design-Document.docx
+++ b/docs/Technical-Design-Document.docx
@@ -231,7 +231,7 @@
               <w:rPr>
                 <w:sz w:val="18"/>
               </w:rPr>
-              <w:t>1.5 — 17 October 2026 (see §16 Revision history)</w:t>
+              <w:t>1.6 — 17 October 2026 (see §16 Revision history)</w:t>
             </w:r>
           </w:p>
         </w:tc>
@@ -269,7 +269,7 @@
               <w:rPr>
                 <w:sz w:val="18"/>
               </w:rPr>
-              <w:t>Prototype — implemented and verified offline with an end-to-end test; production sign-in (OAuth helper) and branch protection require one-time owner setup (§12)</w:t>
+              <w:t>In production. Verified offline with unit + end-to-end tests and in the owner's GitHub repository; the one-time repository settings are listed in §12.1. Open questions were answered by the dev team (§14).</w:t>
             </w:r>
           </w:p>
         </w:tc>
@@ -307,7 +307,7 @@
               <w:rPr>
                 <w:sz w:val="18"/>
               </w:rPr>
-              <w:t>Site owner, developers maintaining the site, reviewers of content pull requests</w:t>
+              <w:t>Site owner, developers maintaining the site, the manager who approves content in the editor</w:t>
             </w:r>
           </w:p>
         </w:tc>
@@ -467,7 +467,7 @@
         <w:pStyle w:val="ListBullet"/>
       </w:pPr>
       <w:r>
-        <w:t>A pull-request based publishing workflow on a feature branch, with review/approval on GitHub.</w:t>
+        <w:t>A pull-request based publishing workflow on a feature branch: every change is reviewed in the editor and recorded as a GitHub pull request; GitHub merges it automatically once the manager marks it Ready (v1.5).</w:t>
       </w:r>
     </w:p>
     <w:p>
@@ -1167,20 +1167,7 @@
               <w:rPr>
                 <w:sz w:val="17"/>
               </w:rPr>
-              <w:t>, draft PR, “Send for Review”; editors cannot publish (</w:t>
-            </w:r>
-            <w:r>
-              <w:rPr>
-                <w:rFonts w:ascii="Consolas" w:hAnsi="Consolas" w:eastAsia="Consolas"/>
-                <w:sz w:val="17"/>
-              </w:rPr>
-              <w:t>publish: false</w:t>
-            </w:r>
-            <w:r>
-              <w:rPr>
-                <w:sz w:val="17"/>
-              </w:rPr>
-              <w:t>)</w:t>
+              <w:t>, draft PR, “Send for Review”, review in the editor, “Ready” = approval; the publish gate (§8.5) keeps the PR unmergeable until then. Approval on GitHub itself was replaced by approval in the editor at the owner's request (D20, §14)</w:t>
             </w:r>
           </w:p>
         </w:tc>
@@ -1198,7 +1185,7 @@
               <w:rPr>
                 <w:sz w:val="17"/>
               </w:rPr>
-              <w:t>e2e scenarios 3, 5, 6 (branch, commit, PR, labels asserted)</w:t>
+              <w:t>e2e scenarios 3, 5, 6 (branch, commit, PR, labels, single PR across lane moves); unit tests of the gate</w:t>
             </w:r>
           </w:p>
         </w:tc>
@@ -1254,20 +1241,20 @@
               <w:rPr>
                 <w:sz w:val="17"/>
               </w:rPr>
-              <w:t xml:space="preserve">§8 — </w:t>
+              <w:t xml:space="preserve">§8 — the gate squash-merges on Ready and dispatches </w:t>
             </w:r>
             <w:r>
               <w:rPr>
                 <w:rFonts w:ascii="Consolas" w:hAnsi="Consolas" w:eastAsia="Consolas"/>
                 <w:sz w:val="17"/>
               </w:rPr>
-              <w:t>.github/workflows/deploy.yml</w:t>
-            </w:r>
-            <w:r>
-              <w:rPr>
-                <w:sz w:val="17"/>
-              </w:rPr>
-              <w:t xml:space="preserve"> on push to main → validate → build → deploy-pages</w:t>
+              <w:t>deploy.yml</w:t>
+            </w:r>
+            <w:r>
+              <w:rPr>
+                <w:sz w:val="17"/>
+              </w:rPr>
+              <w:t xml:space="preserve"> (validate → build → deploy-pages); a manual merge triggers it through the push event</w:t>
             </w:r>
           </w:p>
         </w:tc>
@@ -1285,7 +1272,7 @@
               <w:rPr>
                 <w:sz w:val="17"/>
               </w:rPr>
-              <w:t>Workflow file review; build verified locally (same commands)</w:t>
+              <w:t>Workflow file review; unit tests; build verified locally; post-deployment check (§12.1)</w:t>
             </w:r>
           </w:p>
         </w:tc>
@@ -1380,7 +1367,7 @@
           <w:b w:val="0"/>
           <w:i w:val="0"/>
         </w:rPr>
-        <w:t>Figure 1 (next page) shows the overall architecture. The site remains a fully static build. Editable content is stored as plain files in the repository; the React components import those files at build time. Sveltia CMS — a single-page application that runs entirely in the editor's browser — reads and writes the same files through the GitHub API on a dedicated branch and opens a pull request. GitHub Actions validates and builds every pull request and deploys main to GitHub Pages after a merge. No server-side code is required anywhere in the path; the only optional service is a tiny OAuth helper for the “Sign in with GitHub” button.</w:t>
+        <w:t>Figure 1 (next page) shows the overall architecture. The site remains a fully static build. Editable content is stored as plain files in the repository; the React components import those files at build time. Sveltia CMS — a single-page application that runs entirely in the editor's browser — reads and writes the same files through the GitHub API on a dedicated branch and opens a pull request. GitHub Actions validates and builds every pull request, keeps it unmergeable until the manager marks the entry Ready in the editor, then merges it and deploys main to GitHub Pages. No server-side code is required anywhere in the path; the only optional service is a tiny OAuth helper for the “Sign in with GitHub” button (not used: the owner chose token sign-in, §14).</w:t>
       </w:r>
     </w:p>
     <w:p>
@@ -3611,7 +3598,7 @@
         <w:pStyle w:val="ListBullet"/>
       </w:pPr>
       <w:r>
-        <w:t>Cannot from the editor: merge to main. The Publish control is disabled for every collection (</w:t>
+        <w:t>Cannot: write to main directly or merge a pull request by hand — branch protection (§12.1) requires a pull request with green status checks even for users with write access, and Sveltia's Publish control is disabled for every collection (</w:t>
       </w:r>
       <w:r>
         <w:rPr>
@@ -3621,7 +3608,7 @@
         <w:t>publish: false</w:t>
       </w:r>
       <w:r>
-        <w:t>), and branch protection on main (§12) requires a pull request with an approval and a green status check even for users with write access. Open Authoring (editing from forks) is off, so outsiders cannot even propose changes through the editor.</w:t>
+        <w:t>). Merging is done by the publish gate once an entry is Ready (§8.5). Open Authoring (editing from forks) is off, so outsiders cannot even propose changes through the editor.</w:t>
       </w:r>
     </w:p>
     <w:p>
@@ -4028,7 +4015,7 @@
               <w:rPr>
                 <w:sz w:val="18"/>
               </w:rPr>
-              <w:t>9</w:t>
+              <w:t>8 (cont.)</w:t>
             </w:r>
           </w:p>
         </w:tc>
@@ -4046,7 +4033,7 @@
               <w:rPr>
                 <w:sz w:val="18"/>
               </w:rPr>
-              <w:t>The PR check workflow runs: content validation, type-check and a full build. Its result appears as a status check on the pull request.</w:t>
+              <w:t>The publish gate reports the commit status sveltia/workflow = pending on the PR; because the branch rule requires that status, the pull request cannot be merged by anyone while the entry is a Draft or In Review.</w:t>
             </w:r>
           </w:p>
         </w:tc>
@@ -4064,7 +4051,7 @@
               <w:rPr>
                 <w:sz w:val="18"/>
               </w:rPr>
-              <w:t>GitHub Actions</w:t>
+              <w:t>GitHub Actions → GitHub</w:t>
             </w:r>
           </w:p>
         </w:tc>
@@ -4084,7 +4071,7 @@
               <w:rPr>
                 <w:sz w:val="18"/>
               </w:rPr>
-              <w:t>10–11</w:t>
+              <w:t>9</w:t>
             </w:r>
           </w:p>
         </w:tc>
@@ -4102,7 +4089,7 @@
               <w:rPr>
                 <w:sz w:val="18"/>
               </w:rPr>
-              <w:t>The reviewer reads the diff (plain JSON / Markdown), approves and merges (squash merge recommended). Branch protection makes approval + green check mandatory.</w:t>
+              <w:t>The PR check workflow runs: content validation, type-check, unit tests and a full build. Its result appears as a check on the pull request.</w:t>
             </w:r>
           </w:p>
         </w:tc>
@@ -4120,7 +4107,7 @@
               <w:rPr>
                 <w:sz w:val="18"/>
               </w:rPr>
-              <w:t>Reviewer on GitHub</w:t>
+              <w:t>GitHub Actions</w:t>
             </w:r>
           </w:p>
         </w:tc>
@@ -4140,6 +4127,118 @@
               <w:rPr>
                 <w:sz w:val="18"/>
               </w:rPr>
+              <w:t>10</w:t>
+            </w:r>
+          </w:p>
+        </w:tc>
+        <w:tc>
+          <w:tcPr>
+            <w:tcW w:type="dxa" w:w="6803"/>
+          </w:tcPr>
+          <w:p>
+            <w:r>
+              <w:rPr>
+                <w:sz w:val="18"/>
+              </w:rPr>
+            </w:r>
+            <w:r>
+              <w:rPr>
+                <w:sz w:val="18"/>
+              </w:rPr>
+              <w:t>The manager opens the card from the editor's In Review lane, checks the site-styled preview and moves it to Ready (label sveltia-cms/pending_publish). Nothing is done on GitHub.</w:t>
+            </w:r>
+          </w:p>
+        </w:tc>
+        <w:tc>
+          <w:tcPr>
+            <w:tcW w:type="dxa" w:w="1814"/>
+          </w:tcPr>
+          <w:p>
+            <w:r>
+              <w:rPr>
+                <w:sz w:val="18"/>
+              </w:rPr>
+            </w:r>
+            <w:r>
+              <w:rPr>
+                <w:sz w:val="18"/>
+              </w:rPr>
+              <w:t>Reviewer in the editor</w:t>
+            </w:r>
+          </w:p>
+        </w:tc>
+      </w:tr>
+      <w:tr>
+        <w:tc>
+          <w:tcPr>
+            <w:tcW w:type="dxa" w:w="737"/>
+          </w:tcPr>
+          <w:p>
+            <w:r>
+              <w:rPr>
+                <w:sz w:val="18"/>
+              </w:rPr>
+            </w:r>
+            <w:r>
+              <w:rPr>
+                <w:sz w:val="18"/>
+              </w:rPr>
+              <w:t>11</w:t>
+            </w:r>
+          </w:p>
+        </w:tc>
+        <w:tc>
+          <w:tcPr>
+            <w:tcW w:type="dxa" w:w="6803"/>
+          </w:tcPr>
+          <w:p>
+            <w:r>
+              <w:rPr>
+                <w:sz w:val="18"/>
+              </w:rPr>
+            </w:r>
+            <w:r>
+              <w:rPr>
+                <w:sz w:val="18"/>
+              </w:rPr>
+              <w:t>The gate re-evaluates: Ready + green PR check → status success → squash-merge of the pull request (commit title = PR title) → deploy workflow dispatched → explanatory comment on the PR. If the check failed, the status is failure and nothing is merged.</w:t>
+            </w:r>
+          </w:p>
+        </w:tc>
+        <w:tc>
+          <w:tcPr>
+            <w:tcW w:type="dxa" w:w="1814"/>
+          </w:tcPr>
+          <w:p>
+            <w:r>
+              <w:rPr>
+                <w:sz w:val="18"/>
+              </w:rPr>
+            </w:r>
+            <w:r>
+              <w:rPr>
+                <w:sz w:val="18"/>
+              </w:rPr>
+              <w:t>GitHub Actions</w:t>
+            </w:r>
+          </w:p>
+        </w:tc>
+      </w:tr>
+      <w:tr>
+        <w:tc>
+          <w:tcPr>
+            <w:tcW w:type="dxa" w:w="737"/>
+          </w:tcPr>
+          <w:p>
+            <w:r>
+              <w:rPr>
+                <w:sz w:val="18"/>
+              </w:rPr>
+            </w:r>
+            <w:r>
+              <w:rPr>
+                <w:sz w:val="18"/>
+              </w:rPr>
               <w:t>12–13</w:t>
             </w:r>
           </w:p>
@@ -4158,7 +4257,7 @@
               <w:rPr>
                 <w:sz w:val="18"/>
               </w:rPr>
-              <w:t>The push to main triggers the deploy workflow: validate → build with the Pages base path → publish. The site is typically live 2–3 minutes after the merge.</w:t>
+              <w:t>The deploy workflow validates, builds with the Pages base path and publishes. The site is typically live 2–3 minutes after the card was moved to Ready; the card leaves the board. No GitHub visit is needed at any step — GitHub is the audit trail (diff, checks, who set Ready).</w:t>
             </w:r>
           </w:p>
         </w:tc>
@@ -4460,7 +4559,7 @@
               <w:rPr>
                 <w:sz w:val="18"/>
               </w:rPr>
-              <w:t>sveltia-cms/draft → sveltia-cms/pending_review (→ sveltia-cms/pending_publish is unused because publishing from the editor is disabled)</w:t>
+              <w:t>sveltia-cms/draft → sveltia-cms/pending_review → sveltia-cms/pending_publish (Ready). The publish gate turns the last one into a merge.</w:t>
             </w:r>
           </w:p>
         </w:tc>
@@ -4498,7 +4597,7 @@
               <w:rPr>
                 <w:sz w:val="18"/>
               </w:rPr>
-              <w:t>Draft PR while the status is Draft; ready for review after “Send for Review”</w:t>
+              <w:t>A genuine GitHub draft pull request while the card is in Drafts (Sveltia creates the PR with draft: true and later calls the markPullRequestReadyForReview / convertPullRequestToDraft GraphQL mutations); ready for review after “Send for Review”. GitHub itself refuses to merge a draft PR — this is not a label.</w:t>
             </w:r>
           </w:p>
         </w:tc>
@@ -4536,7 +4635,7 @@
               <w:rPr>
                 <w:sz w:val="18"/>
               </w:rPr>
-              <w:t xml:space="preserve">Done by the reviewer on GitHub. </w:t>
+              <w:t xml:space="preserve">Done by the publish gate (squash, commit title = PR title). </w:t>
             </w:r>
             <w:r>
               <w:rPr>
@@ -4549,7 +4648,7 @@
               <w:rPr>
                 <w:sz w:val="18"/>
               </w:rPr>
-              <w:t xml:space="preserve"> only affects the (disabled) in-editor publish action; enable “Automatically delete head branches” in the repository so merged cms/… branches disappear.</w:t>
+              <w:t xml:space="preserve"> only affects Sveltia's disabled in-editor publish action. Enable “Automatically delete head branches” so merged cms/… branches disappear.</w:t>
             </w:r>
           </w:p>
         </w:tc>
@@ -4587,7 +4686,7 @@
               <w:rPr>
                 <w:sz w:val="18"/>
               </w:rPr>
-              <w:t>Deleting a blog post in the editor also goes through a pull request (label sveltia-cms/pending_deletion); nothing is removed from main without review.</w:t>
+              <w:t>Deleting an entry in the editor also goes through a pull request (label sveltia-cms/pending_deletion). The gate never merges deletions (D21); a developer merges them on GitHub — the owner accepted this (§14).</w:t>
             </w:r>
           </w:p>
         </w:tc>
@@ -4672,7 +4771,7 @@
         <w:pStyle w:val="Heading2"/>
       </w:pPr>
       <w:r>
-        <w:t>7.3 What the reviewer sees</w:t>
+        <w:t>7.3 What the manager and GitHub see</w:t>
       </w:r>
     </w:p>
     <w:p>
@@ -4681,7 +4780,7 @@
           <w:b w:val="0"/>
           <w:i w:val="0"/>
         </w:rPr>
-        <w:t>The pull request's Files changed tab shows a line-level diff of a JSON or Markdown file (e.g. `"price": 19` → `"price": 21`, plus the recomputed label line). The PR check summary lists the changed files. Because the validator and the build run on the exact merge result, a green check means the site will build with that content. If the check is red, the job log names the file, field and rule that failed (e.g. “content/menu.json: categories[0].items[2].description is longer than 300 characters”).</w:t>
+        <w:t>The manager reviews in the editor: the card names the change (“Neapolitan Pizzas … › Margherita — $21”), and opening it shows every field next to the site-styled preview. GitHub keeps the audit trail: the pull request's Files changed tab shows a line-level diff of a JSON or Markdown file (e.g. `"price": 19` → `"price": 21`, plus the recomputed label line), the Checks tab the PR check and the gate, the timeline who applied which label and when. The PR check summary lists the changed files. Because the validator and the build run on the exact merge result, a green check means the site will build with that content. If the check is red, the job log names the file, field and rule that failed (e.g. “content/menu.json: categories[0].items[2].description is longer than 300 characters”).</w:t>
       </w:r>
     </w:p>
     <w:p>
@@ -5723,6 +5822,15 @@
           <w:b w:val="0"/>
           <w:i w:val="0"/>
         </w:rPr>
+        <w:t>How to confirm the gate is active on a pull request: the Checks tab lists “PR check / Validate &amp; build (PR)” and “CMS publish / Sveltia workflow gate”, and the merge box shows the status “sveltia/workflow” with one of the descriptions above. If the status is absent, cms-publish.yml is not yet on main or the branch rule does not require it; if it is green but the PR stays open, the branch rule still requires approvals (the gate logs “Could not merge automatically …” in that case).</w:t>
+      </w:r>
+    </w:p>
+    <w:p>
+      <w:r>
+        <w:rPr>
+          <w:b w:val="0"/>
+          <w:i w:val="0"/>
+        </w:rPr>
         <w:t>Prerequisites and trade-offs (decision D20): the branch rule for main must require both statuses — “Validate &amp; build (PR)” and “sveltia/workflow” — and, for the no-GitHub flow, require 0 approvals: GitHub cannot count a label as an approval, and a required approval can only be given on GitHub by someone other than the author. The approval therefore moves into the editor: whoever moves a card to Ready publishes it. With a single manager that is acceptable (and identical to a site owner merging their own change); where separation of duties matters, CMS_REQUIRE_SECOND_REVIEWER=true enforces that the person who sets Ready is not the author of the draft, using GitHub's own audit trail. The gate never bypasses branch protection — if the rule still requires approvals, the merge call fails and the status explains why, leaving the PR for a developer.</w:t>
       </w:r>
     </w:p>
@@ -5750,7 +5858,7 @@
       <w:r>
         <w:drawing>
           <wp:inline xmlns:a="http://schemas.openxmlformats.org/drawingml/2006/main" xmlns:pic="http://schemas.openxmlformats.org/drawingml/2006/picture">
-            <wp:extent cx="6120000" cy="573818"/>
+            <wp:extent cx="6120000" cy="523945"/>
             <wp:docPr id="4" name="Picture 4"/>
             <wp:cNvGraphicFramePr>
               <a:graphicFrameLocks noChangeAspect="1"/>
@@ -5771,7 +5879,7 @@
                   <pic:spPr>
                     <a:xfrm>
                       <a:off x="0" y="0"/>
-                      <a:ext cx="6120000" cy="573818"/>
+                      <a:ext cx="6120000" cy="523945"/>
                     </a:xfrm>
                     <a:prstGeom prst="rect"/>
                   </pic:spPr>
@@ -6370,7 +6478,7 @@
           <w:b w:val="0"/>
           <w:i w:val="0"/>
         </w:rPr>
-        <w:t>Every change is a pull request whose diff is small and readable. This is the only layer that can judge tone, typos and prices; the technical layers make sure the reviewer never has to look for hidden markup.</w:t>
+        <w:t>Every change waits in the editor's In Review lane until the manager has looked at it in the site-styled preview and moved it to Ready; the corresponding pull request is unmergeable until then (§8.5). This is the only layer that can judge tone, typos and prices; the technical layers make sure the reviewer never has to look for hidden markup. The pull request diff remains available on GitHub for audit or for a developer's second look.</w:t>
       </w:r>
     </w:p>
     <w:p>
@@ -7389,7 +7497,7 @@
               <w:rPr>
                 <w:sz w:val="18"/>
               </w:rPr>
-              <w:t>Review a content change</w:t>
+              <w:t>Review and publish a content change (manager)</w:t>
             </w:r>
           </w:p>
         </w:tc>
@@ -7407,7 +7515,7 @@
               <w:rPr>
                 <w:sz w:val="18"/>
               </w:rPr>
-              <w:t>Open the pull request → Files changed → Approve → Squash and merge. The site redeploys automatically.</w:t>
+              <w:t>Editorial Workflow board → open the card in In Review → check the preview → set the status to Ready. The gate merges and deploys; the card disappears when live.</w:t>
             </w:r>
           </w:p>
         </w:tc>
@@ -7427,7 +7535,7 @@
               <w:rPr>
                 <w:sz w:val="18"/>
               </w:rPr>
-              <w:t>Ask for a correction</w:t>
+              <w:t>Ask for a correction (manager)</w:t>
             </w:r>
           </w:p>
         </w:tc>
@@ -7445,7 +7553,7 @@
               <w:rPr>
                 <w:sz w:val="18"/>
               </w:rPr>
-              <w:t>Request changes on the PR; the manager reopens the entry in the editor (it shows “In Review”), edits and saves again — the same PR is updated.</w:t>
+              <w:t>Move the card back to Draft (or tell the editor); they edit and save again — the same pull request is updated, then send it for review again.</w:t>
             </w:r>
           </w:p>
         </w:tc>
@@ -7483,7 +7591,45 @@
               <w:rPr>
                 <w:sz w:val="18"/>
               </w:rPr>
-              <w:t>Revert the merge commit on GitHub (Revert button on the merged PR) and merge the revert; or fix forward through the editor.</w:t>
+              <w:t>Fix forward through the editor (fastest), or a developer reverts the merge commit on GitHub (Revert button on the merged PR) and merges the revert.</w:t>
+            </w:r>
+          </w:p>
+        </w:tc>
+      </w:tr>
+      <w:tr>
+        <w:tc>
+          <w:tcPr>
+            <w:tcW w:type="dxa" w:w="2551"/>
+          </w:tcPr>
+          <w:p>
+            <w:r>
+              <w:rPr>
+                <w:sz w:val="18"/>
+              </w:rPr>
+            </w:r>
+            <w:r>
+              <w:rPr>
+                <w:sz w:val="18"/>
+              </w:rPr>
+              <w:t>Nothing happens after Ready</w:t>
+            </w:r>
+          </w:p>
+        </w:tc>
+        <w:tc>
+          <w:tcPr>
+            <w:tcW w:type="dxa" w:w="6803"/>
+          </w:tcPr>
+          <w:p>
+            <w:r>
+              <w:rPr>
+                <w:sz w:val="18"/>
+              </w:rPr>
+            </w:r>
+            <w:r>
+              <w:rPr>
+                <w:sz w:val="18"/>
+              </w:rPr>
+              <w:t>Check Actions → “CMS publish” runs and the PR's Checks tab: the status sveltia/workflow explains the state (PR check failed, four-eyes rule, or the branch rule still requires approvals — set them to 0, §12.1). A developer can always merge manually once the status is green.</w:t>
             </w:r>
           </w:p>
         </w:tc>
@@ -8275,7 +8421,7 @@
               <w:rPr>
                 <w:sz w:val="17"/>
               </w:rPr>
-              <w:t>The PR check runs; the gate reports sveltia/workflow = success for code PRs, so the branch rule is satisfied as soon as the check is green. Merge on GitHub (squash).</w:t>
+              <w:t>The PR check runs; the gate reports sveltia/workflow = success for code PRs, so the branch rule is satisfied as soon as the check is green. Code PRs are merged by a developer on GitHub (squash) — the gate only merges content PRs.</w:t>
             </w:r>
           </w:p>
         </w:tc>
@@ -10194,7 +10340,873 @@
         <w:pStyle w:val="Heading1"/>
       </w:pPr>
       <w:r>
-        <w:t>14. Open questions</w:t>
+        <w:t>14. Open questions and their resolution</w:t>
+      </w:r>
+    </w:p>
+    <w:p>
+      <w:r>
+        <w:rPr>
+          <w:b w:val="0"/>
+          <w:i w:val="0"/>
+        </w:rPr>
+        <w:t>The questions raised during design were answered by the owner's dev team after the first production cycle. Decisions are recorded here; the configuration reflects them.</w:t>
+      </w:r>
+    </w:p>
+    <w:tbl>
+      <w:tblPr>
+        <w:tblStyle w:val="TableGrid"/>
+        <w:tblW w:type="auto" w:w="0"/>
+        <w:jc w:val="center"/>
+        <w:tblLook w:firstColumn="1" w:firstRow="1" w:lastColumn="0" w:lastRow="0" w:noHBand="0" w:noVBand="1" w:val="04A0"/>
+      </w:tblPr>
+      <w:tblGrid>
+        <w:gridCol w:w="3137"/>
+        <w:gridCol w:w="3137"/>
+        <w:gridCol w:w="3137"/>
+      </w:tblGrid>
+      <w:tr>
+        <w:tc>
+          <w:tcPr>
+            <w:tcW w:type="dxa" w:w="1928"/>
+            <w:shd w:val="clear" w:color="auto" w:fill="F0E7DC"/>
+          </w:tcPr>
+          <w:p>
+            <w:r/>
+            <w:r>
+              <w:rPr>
+                <w:b/>
+                <w:sz w:val="17"/>
+              </w:rPr>
+              <w:t>Question</w:t>
+            </w:r>
+          </w:p>
+        </w:tc>
+        <w:tc>
+          <w:tcPr>
+            <w:tcW w:type="dxa" w:w="3175"/>
+            <w:shd w:val="clear" w:color="auto" w:fill="F0E7DC"/>
+          </w:tcPr>
+          <w:p>
+            <w:r/>
+            <w:r>
+              <w:rPr>
+                <w:b/>
+                <w:sz w:val="17"/>
+              </w:rPr>
+              <w:t>Decision (dev team)</w:t>
+            </w:r>
+          </w:p>
+        </w:tc>
+        <w:tc>
+          <w:tcPr>
+            <w:tcW w:type="dxa" w:w="4252"/>
+            <w:shd w:val="clear" w:color="auto" w:fill="F0E7DC"/>
+          </w:tcPr>
+          <w:p>
+            <w:r/>
+            <w:r>
+              <w:rPr>
+                <w:b/>
+                <w:sz w:val="17"/>
+              </w:rPr>
+              <w:t>Consequence in the solution</w:t>
+            </w:r>
+          </w:p>
+        </w:tc>
+      </w:tr>
+      <w:tr>
+        <w:tc>
+          <w:tcPr>
+            <w:tcW w:type="dxa" w:w="1928"/>
+          </w:tcPr>
+          <w:p>
+            <w:r>
+              <w:rPr>
+                <w:sz w:val="17"/>
+              </w:rPr>
+            </w:r>
+            <w:r>
+              <w:rPr>
+                <w:sz w:val="17"/>
+              </w:rPr>
+              <w:t>Who reviews?</w:t>
+            </w:r>
+          </w:p>
+        </w:tc>
+        <w:tc>
+          <w:tcPr>
+            <w:tcW w:type="dxa" w:w="3175"/>
+          </w:tcPr>
+          <w:p>
+            <w:r>
+              <w:rPr>
+                <w:sz w:val="17"/>
+              </w:rPr>
+            </w:r>
+            <w:r>
+              <w:rPr>
+                <w:sz w:val="17"/>
+              </w:rPr>
+              <w:t>A single set of eyes reviews and approves changes for now.</w:t>
+            </w:r>
+          </w:p>
+        </w:tc>
+        <w:tc>
+          <w:tcPr>
+            <w:tcW w:type="dxa" w:w="4252"/>
+          </w:tcPr>
+          <w:p>
+            <w:r>
+              <w:rPr>
+                <w:sz w:val="17"/>
+              </w:rPr>
+            </w:r>
+            <w:r>
+              <w:rPr>
+                <w:sz w:val="17"/>
+              </w:rPr>
+              <w:t>Branch rule with 0 required GitHub approvals; the manager's Ready in the editor is the approval (D20). CMS_REQUIRE_SECOND_REVIEWER stays off.</w:t>
+            </w:r>
+          </w:p>
+        </w:tc>
+      </w:tr>
+      <w:tr>
+        <w:tc>
+          <w:tcPr>
+            <w:tcW w:type="dxa" w:w="1928"/>
+          </w:tcPr>
+          <w:p>
+            <w:r>
+              <w:rPr>
+                <w:sz w:val="17"/>
+              </w:rPr>
+            </w:r>
+            <w:r>
+              <w:rPr>
+                <w:sz w:val="17"/>
+              </w:rPr>
+              <w:t>OAuth helper hosting</w:t>
+            </w:r>
+          </w:p>
+        </w:tc>
+        <w:tc>
+          <w:tcPr>
+            <w:tcW w:type="dxa" w:w="3175"/>
+          </w:tcPr>
+          <w:p>
+            <w:r>
+              <w:rPr>
+                <w:sz w:val="17"/>
+              </w:rPr>
+            </w:r>
+            <w:r>
+              <w:rPr>
+                <w:sz w:val="17"/>
+              </w:rPr>
+              <w:t>Token sign-in is sufficient; the owner requests a GitHub token and sets up a passkey on the pizza laptop.</w:t>
+            </w:r>
+          </w:p>
+        </w:tc>
+        <w:tc>
+          <w:tcPr>
+            <w:tcW w:type="dxa" w:w="4252"/>
+          </w:tcPr>
+          <w:p>
+            <w:r>
+              <w:rPr>
+                <w:sz w:val="17"/>
+              </w:rPr>
+            </w:r>
+            <w:r>
+              <w:rPr>
+                <w:sz w:val="17"/>
+              </w:rPr>
+              <w:t>CMS_OAUTH_BASE_URL left unset → the editor offers token sign-in only (no broken OAuth button). The guide describes the one-time token paste.</w:t>
+            </w:r>
+          </w:p>
+        </w:tc>
+      </w:tr>
+      <w:tr>
+        <w:tc>
+          <w:tcPr>
+            <w:tcW w:type="dxa" w:w="1928"/>
+          </w:tcPr>
+          <w:p>
+            <w:r>
+              <w:rPr>
+                <w:sz w:val="17"/>
+              </w:rPr>
+            </w:r>
+            <w:r>
+              <w:rPr>
+                <w:sz w:val="17"/>
+              </w:rPr>
+              <w:t>Preview of a pending change</w:t>
+            </w:r>
+          </w:p>
+        </w:tc>
+        <w:tc>
+          <w:tcPr>
+            <w:tcW w:type="dxa" w:w="3175"/>
+          </w:tcPr>
+          <w:p>
+            <w:r>
+              <w:rPr>
+                <w:sz w:val="17"/>
+              </w:rPr>
+            </w:r>
+            <w:r>
+              <w:rPr>
+                <w:sz w:val="17"/>
+              </w:rPr>
+              <w:t>The editor's visual review is sufficient.</w:t>
+            </w:r>
+          </w:p>
+        </w:tc>
+        <w:tc>
+          <w:tcPr>
+            <w:tcW w:type="dxa" w:w="4252"/>
+          </w:tcPr>
+          <w:p>
+            <w:r>
+              <w:rPr>
+                <w:sz w:val="17"/>
+              </w:rPr>
+            </w:r>
+            <w:r>
+              <w:rPr>
+                <w:sz w:val="17"/>
+              </w:rPr>
+              <w:t>No per-PR deploy previews; the site-styled preview templates (§5.5) are the review surface.</w:t>
+            </w:r>
+          </w:p>
+        </w:tc>
+      </w:tr>
+      <w:tr>
+        <w:tc>
+          <w:tcPr>
+            <w:tcW w:type="dxa" w:w="1928"/>
+          </w:tcPr>
+          <w:p>
+            <w:r>
+              <w:rPr>
+                <w:sz w:val="17"/>
+              </w:rPr>
+            </w:r>
+            <w:r>
+              <w:rPr>
+                <w:sz w:val="17"/>
+              </w:rPr>
+              <w:t>Images</w:t>
+            </w:r>
+          </w:p>
+        </w:tc>
+        <w:tc>
+          <w:tcPr>
+            <w:tcW w:type="dxa" w:w="3175"/>
+          </w:tcPr>
+          <w:p>
+            <w:r>
+              <w:rPr>
+                <w:sz w:val="17"/>
+              </w:rPr>
+            </w:r>
+            <w:r>
+              <w:rPr>
+                <w:sz w:val="17"/>
+              </w:rPr>
+              <w:t>Not required.</w:t>
+            </w:r>
+          </w:p>
+        </w:tc>
+        <w:tc>
+          <w:tcPr>
+            <w:tcW w:type="dxa" w:w="4252"/>
+          </w:tcPr>
+          <w:p>
+            <w:r>
+              <w:rPr>
+                <w:sz w:val="17"/>
+              </w:rPr>
+            </w:r>
+            <w:r>
+              <w:rPr>
+                <w:sz w:val="17"/>
+              </w:rPr>
+              <w:t>No image fields; uploads disabled (§5.6).</w:t>
+            </w:r>
+          </w:p>
+        </w:tc>
+      </w:tr>
+      <w:tr>
+        <w:tc>
+          <w:tcPr>
+            <w:tcW w:type="dxa" w:w="1928"/>
+          </w:tcPr>
+          <w:p>
+            <w:r>
+              <w:rPr>
+                <w:sz w:val="17"/>
+              </w:rPr>
+            </w:r>
+            <w:r>
+              <w:rPr>
+                <w:sz w:val="17"/>
+              </w:rPr>
+              <w:t>More editable areas</w:t>
+            </w:r>
+          </w:p>
+        </w:tc>
+        <w:tc>
+          <w:tcPr>
+            <w:tcW w:type="dxa" w:w="3175"/>
+          </w:tcPr>
+          <w:p>
+            <w:r>
+              <w:rPr>
+                <w:sz w:val="17"/>
+              </w:rPr>
+            </w:r>
+            <w:r>
+              <w:rPr>
+                <w:sz w:val="17"/>
+              </w:rPr>
+              <w:t>Current scope is sufficient.</w:t>
+            </w:r>
+          </w:p>
+        </w:tc>
+        <w:tc>
+          <w:tcPr>
+            <w:tcW w:type="dxa" w:w="4252"/>
+          </w:tcPr>
+          <w:p>
+            <w:r>
+              <w:rPr>
+                <w:sz w:val="17"/>
+              </w:rPr>
+            </w:r>
+            <w:r>
+              <w:rPr>
+                <w:sz w:val="17"/>
+              </w:rPr>
+              <w:t>Hero copy, contact details etc. stay in code.</w:t>
+            </w:r>
+          </w:p>
+        </w:tc>
+      </w:tr>
+      <w:tr>
+        <w:tc>
+          <w:tcPr>
+            <w:tcW w:type="dxa" w:w="1928"/>
+          </w:tcPr>
+          <w:p>
+            <w:r>
+              <w:rPr>
+                <w:sz w:val="17"/>
+              </w:rPr>
+            </w:r>
+            <w:r>
+              <w:rPr>
+                <w:sz w:val="17"/>
+              </w:rPr>
+              <w:t>Who may publish?</w:t>
+            </w:r>
+          </w:p>
+        </w:tc>
+        <w:tc>
+          <w:tcPr>
+            <w:tcW w:type="dxa" w:w="3175"/>
+          </w:tcPr>
+          <w:p>
+            <w:r>
+              <w:rPr>
+                <w:sz w:val="17"/>
+              </w:rPr>
+            </w:r>
+            <w:r>
+              <w:rPr>
+                <w:sz w:val="17"/>
+              </w:rPr>
+              <w:t>Defaults; the manager coordinates who edits and asks Ops to add/remove GitHub logins.</w:t>
+            </w:r>
+          </w:p>
+        </w:tc>
+        <w:tc>
+          <w:tcPr>
+            <w:tcW w:type="dxa" w:w="4252"/>
+          </w:tcPr>
+          <w:p>
+            <w:r>
+              <w:rPr>
+                <w:sz w:val="17"/>
+              </w:rPr>
+            </w:r>
+            <w:r>
+              <w:rPr>
+                <w:sz w:val="17"/>
+              </w:rPr>
+              <w:t>Any collaborator can technically set Ready; governance by staff instruction (guide: “Ready = manager only”). Collaborator list = access list.</w:t>
+            </w:r>
+          </w:p>
+        </w:tc>
+      </w:tr>
+      <w:tr>
+        <w:tc>
+          <w:tcPr>
+            <w:tcW w:type="dxa" w:w="1928"/>
+          </w:tcPr>
+          <w:p>
+            <w:r>
+              <w:rPr>
+                <w:sz w:val="17"/>
+              </w:rPr>
+            </w:r>
+            <w:r>
+              <w:rPr>
+                <w:sz w:val="17"/>
+              </w:rPr>
+              <w:t>Deletions</w:t>
+            </w:r>
+          </w:p>
+        </w:tc>
+        <w:tc>
+          <w:tcPr>
+            <w:tcW w:type="dxa" w:w="3175"/>
+          </w:tcPr>
+          <w:p>
+            <w:r>
+              <w:rPr>
+                <w:sz w:val="17"/>
+              </w:rPr>
+            </w:r>
+            <w:r>
+              <w:rPr>
+                <w:sz w:val="17"/>
+              </w:rPr>
+              <w:t>All edits flow through an approved PR.</w:t>
+            </w:r>
+          </w:p>
+        </w:tc>
+        <w:tc>
+          <w:tcPr>
+            <w:tcW w:type="dxa" w:w="4252"/>
+          </w:tcPr>
+          <w:p>
+            <w:r>
+              <w:rPr>
+                <w:sz w:val="17"/>
+              </w:rPr>
+            </w:r>
+            <w:r>
+              <w:rPr>
+                <w:sz w:val="17"/>
+              </w:rPr>
+              <w:t>Deletion PRs are never auto-merged (D21); a developer merges them. Staff use “Show on menu / website” switches to hide content.</w:t>
+            </w:r>
+          </w:p>
+        </w:tc>
+      </w:tr>
+      <w:tr>
+        <w:tc>
+          <w:tcPr>
+            <w:tcW w:type="dxa" w:w="1928"/>
+          </w:tcPr>
+          <w:p>
+            <w:r>
+              <w:rPr>
+                <w:sz w:val="17"/>
+              </w:rPr>
+            </w:r>
+            <w:r>
+              <w:rPr>
+                <w:sz w:val="17"/>
+              </w:rPr>
+              <w:t>Renaming a menu section</w:t>
+            </w:r>
+          </w:p>
+        </w:tc>
+        <w:tc>
+          <w:tcPr>
+            <w:tcW w:type="dxa" w:w="3175"/>
+          </w:tcPr>
+          <w:p>
+            <w:r>
+              <w:rPr>
+                <w:sz w:val="17"/>
+              </w:rPr>
+            </w:r>
+            <w:r>
+              <w:rPr>
+                <w:sz w:val="17"/>
+              </w:rPr>
+              <w:t>Defaults; renames are rare and can be done as delete + add.</w:t>
+            </w:r>
+          </w:p>
+        </w:tc>
+        <w:tc>
+          <w:tcPr>
+            <w:tcW w:type="dxa" w:w="4252"/>
+          </w:tcPr>
+          <w:p>
+            <w:r>
+              <w:rPr>
+                <w:sz w:val="17"/>
+              </w:rPr>
+            </w:r>
+            <w:r>
+              <w:rPr>
+                <w:sz w:val="17"/>
+              </w:rPr>
+              <w:t>Items keep referencing sections by title; the CI validator flags orphans.</w:t>
+            </w:r>
+          </w:p>
+        </w:tc>
+      </w:tr>
+      <w:tr>
+        <w:tc>
+          <w:tcPr>
+            <w:tcW w:type="dxa" w:w="1928"/>
+          </w:tcPr>
+          <w:p>
+            <w:r>
+              <w:rPr>
+                <w:sz w:val="17"/>
+              </w:rPr>
+            </w:r>
+            <w:r>
+              <w:rPr>
+                <w:sz w:val="17"/>
+              </w:rPr>
+              <w:t>Group order in the Menu Items list</w:t>
+            </w:r>
+          </w:p>
+        </w:tc>
+        <w:tc>
+          <w:tcPr>
+            <w:tcW w:type="dxa" w:w="3175"/>
+          </w:tcPr>
+          <w:p>
+            <w:r>
+              <w:rPr>
+                <w:sz w:val="17"/>
+              </w:rPr>
+            </w:r>
+            <w:r>
+              <w:rPr>
+                <w:sz w:val="17"/>
+              </w:rPr>
+              <w:t>Keep the current (alphabetical) group order.</w:t>
+            </w:r>
+          </w:p>
+        </w:tc>
+        <w:tc>
+          <w:tcPr>
+            <w:tcW w:type="dxa" w:w="4252"/>
+          </w:tcPr>
+          <w:p>
+            <w:r>
+              <w:rPr>
+                <w:sz w:val="17"/>
+              </w:rPr>
+            </w:r>
+            <w:r>
+              <w:rPr>
+                <w:sz w:val="17"/>
+              </w:rPr>
+              <w:t>No change.</w:t>
+            </w:r>
+          </w:p>
+        </w:tc>
+      </w:tr>
+      <w:tr>
+        <w:tc>
+          <w:tcPr>
+            <w:tcW w:type="dxa" w:w="1928"/>
+          </w:tcPr>
+          <w:p>
+            <w:r>
+              <w:rPr>
+                <w:sz w:val="17"/>
+              </w:rPr>
+            </w:r>
+            <w:r>
+              <w:rPr>
+                <w:sz w:val="17"/>
+              </w:rPr>
+              <w:t>Menu badge vocabulary</w:t>
+            </w:r>
+          </w:p>
+        </w:tc>
+        <w:tc>
+          <w:tcPr>
+            <w:tcW w:type="dxa" w:w="3175"/>
+          </w:tcPr>
+          <w:p>
+            <w:r>
+              <w:rPr>
+                <w:sz w:val="17"/>
+              </w:rPr>
+            </w:r>
+            <w:r>
+              <w:rPr>
+                <w:sz w:val="17"/>
+              </w:rPr>
+              <w:t>Keep the fixed dictionary.</w:t>
+            </w:r>
+          </w:p>
+        </w:tc>
+        <w:tc>
+          <w:tcPr>
+            <w:tcW w:type="dxa" w:w="4252"/>
+          </w:tcPr>
+          <w:p>
+            <w:r>
+              <w:rPr>
+                <w:sz w:val="17"/>
+              </w:rPr>
+            </w:r>
+            <w:r>
+              <w:rPr>
+                <w:sz w:val="17"/>
+              </w:rPr>
+              <w:t>MENU_TAGS in config.ts; a developer adds badges.</w:t>
+            </w:r>
+          </w:p>
+        </w:tc>
+      </w:tr>
+      <w:tr>
+        <w:tc>
+          <w:tcPr>
+            <w:tcW w:type="dxa" w:w="1928"/>
+          </w:tcPr>
+          <w:p>
+            <w:r>
+              <w:rPr>
+                <w:sz w:val="17"/>
+              </w:rPr>
+            </w:r>
+            <w:r>
+              <w:rPr>
+                <w:sz w:val="17"/>
+              </w:rPr>
+              <w:t>Date of blog posts</w:t>
+            </w:r>
+          </w:p>
+        </w:tc>
+        <w:tc>
+          <w:tcPr>
+            <w:tcW w:type="dxa" w:w="3175"/>
+          </w:tcPr>
+          <w:p>
+            <w:r>
+              <w:rPr>
+                <w:sz w:val="17"/>
+              </w:rPr>
+            </w:r>
+            <w:r>
+              <w:rPr>
+                <w:sz w:val="17"/>
+              </w:rPr>
+              <w:t>No scheduled posts.</w:t>
+            </w:r>
+          </w:p>
+        </w:tc>
+        <w:tc>
+          <w:tcPr>
+            <w:tcW w:type="dxa" w:w="4252"/>
+          </w:tcPr>
+          <w:p>
+            <w:r>
+              <w:rPr>
+                <w:sz w:val="17"/>
+              </w:rPr>
+            </w:r>
+            <w:r>
+              <w:rPr>
+                <w:sz w:val="17"/>
+              </w:rPr>
+              <w:t>Posts show as soon as published; future dates are not held back.</w:t>
+            </w:r>
+          </w:p>
+        </w:tc>
+      </w:tr>
+      <w:tr>
+        <w:tc>
+          <w:tcPr>
+            <w:tcW w:type="dxa" w:w="1928"/>
+          </w:tcPr>
+          <w:p>
+            <w:r>
+              <w:rPr>
+                <w:sz w:val="17"/>
+              </w:rPr>
+            </w:r>
+            <w:r>
+              <w:rPr>
+                <w:sz w:val="17"/>
+              </w:rPr>
+              <w:t>Token lifetime</w:t>
+            </w:r>
+          </w:p>
+        </w:tc>
+        <w:tc>
+          <w:tcPr>
+            <w:tcW w:type="dxa" w:w="3175"/>
+          </w:tcPr>
+          <w:p>
+            <w:r>
+              <w:rPr>
+                <w:sz w:val="17"/>
+              </w:rPr>
+            </w:r>
+            <w:r>
+              <w:rPr>
+                <w:sz w:val="17"/>
+              </w:rPr>
+              <w:t>Yearly renewal; an administrative App proxy for the GitHub handshake may come later.</w:t>
+            </w:r>
+          </w:p>
+        </w:tc>
+        <w:tc>
+          <w:tcPr>
+            <w:tcW w:type="dxa" w:w="4252"/>
+          </w:tcPr>
+          <w:p>
+            <w:r>
+              <w:rPr>
+                <w:sz w:val="17"/>
+              </w:rPr>
+            </w:r>
+            <w:r>
+              <w:rPr>
+                <w:sz w:val="17"/>
+              </w:rPr>
+              <w:t>Runbook entry for token renewal (§12.2). Replacing token sign-in with OAuth later needs only the worker + CMS_OAUTH_BASE_URL.</w:t>
+            </w:r>
+          </w:p>
+        </w:tc>
+      </w:tr>
+      <w:tr>
+        <w:tc>
+          <w:tcPr>
+            <w:tcW w:type="dxa" w:w="1928"/>
+          </w:tcPr>
+          <w:p>
+            <w:r>
+              <w:rPr>
+                <w:sz w:val="17"/>
+              </w:rPr>
+            </w:r>
+            <w:r>
+              <w:rPr>
+                <w:sz w:val="17"/>
+              </w:rPr>
+              <w:t>Notifications</w:t>
+            </w:r>
+          </w:p>
+        </w:tc>
+        <w:tc>
+          <w:tcPr>
+            <w:tcW w:type="dxa" w:w="3175"/>
+          </w:tcPr>
+          <w:p>
+            <w:r>
+              <w:rPr>
+                <w:sz w:val="17"/>
+              </w:rPr>
+            </w:r>
+            <w:r>
+              <w:rPr>
+                <w:sz w:val="17"/>
+              </w:rPr>
+              <w:t>Rely on GitHub's subscriptions.</w:t>
+            </w:r>
+          </w:p>
+        </w:tc>
+        <w:tc>
+          <w:tcPr>
+            <w:tcW w:type="dxa" w:w="4252"/>
+          </w:tcPr>
+          <w:p>
+            <w:r>
+              <w:rPr>
+                <w:sz w:val="17"/>
+              </w:rPr>
+            </w:r>
+            <w:r>
+              <w:rPr>
+                <w:sz w:val="17"/>
+              </w:rPr>
+              <w:t>The gate comments on each PR when it publishes; GitHub notifications reach subscribed developers.</w:t>
+            </w:r>
+          </w:p>
+        </w:tc>
+      </w:tr>
+      <w:tr>
+        <w:tc>
+          <w:tcPr>
+            <w:tcW w:type="dxa" w:w="1928"/>
+          </w:tcPr>
+          <w:p>
+            <w:r>
+              <w:rPr>
+                <w:sz w:val="17"/>
+              </w:rPr>
+            </w:r>
+            <w:r>
+              <w:rPr>
+                <w:sz w:val="17"/>
+              </w:rPr>
+              <w:t>Browser support for local mode</w:t>
+            </w:r>
+          </w:p>
+        </w:tc>
+        <w:tc>
+          <w:tcPr>
+            <w:tcW w:type="dxa" w:w="3175"/>
+          </w:tcPr>
+          <w:p>
+            <w:r>
+              <w:rPr>
+                <w:sz w:val="17"/>
+              </w:rPr>
+            </w:r>
+            <w:r>
+              <w:rPr>
+                <w:sz w:val="17"/>
+              </w:rPr>
+              <w:t>Chrome is the recommended browser.</w:t>
+            </w:r>
+          </w:p>
+        </w:tc>
+        <w:tc>
+          <w:tcPr>
+            <w:tcW w:type="dxa" w:w="4252"/>
+          </w:tcPr>
+          <w:p>
+            <w:r>
+              <w:rPr>
+                <w:sz w:val="17"/>
+              </w:rPr>
+            </w:r>
+            <w:r>
+              <w:rPr>
+                <w:sz w:val="17"/>
+              </w:rPr>
+              <w:t>Stated in the README and guide.</w:t>
+            </w:r>
+          </w:p>
+        </w:tc>
+      </w:tr>
+    </w:tbl>
+    <w:p/>
+    <w:p>
+      <w:r>
+        <w:rPr>
+          <w:b w:val="0"/>
+          <w:i w:val="0"/>
+        </w:rPr>
+        <w:t>Still open:</w:t>
       </w:r>
     </w:p>
     <w:p>
@@ -10205,10 +11217,10 @@
         <w:rPr>
           <w:b/>
         </w:rPr>
-        <w:t>Who reviews?</w:t>
+        <w:t>Deletion requests</w:t>
       </w:r>
       <w:r>
-        <w:t xml:space="preserve"> The brief says the owner self-serves and changes need approval. If the owner is both editor and the only reviewer, GitHub cannot require an approval from someone else. Options: a second reviewer (developer), or allow the owner to bypass the rule while the manager's changes still require approval. Decision needed before enabling branch protection.</w:t>
+        <w:t xml:space="preserve"> remain the one path that needs a developer on GitHub (D21). If that becomes a nuisance, the gate can be extended to merge pending_deletion PRs that were set by the manager.</w:t>
       </w:r>
     </w:p>
     <w:p>
@@ -10219,208 +11231,10 @@
         <w:rPr>
           <w:b/>
         </w:rPr>
-        <w:t>OAuth helper hosting.</w:t>
+        <w:t>Token renewal reminder.</w:t>
       </w:r>
       <w:r>
-        <w:t xml:space="preserve"> Cloudflare Workers is proposed. Does the owner have (or want) a Cloudflare account, or is token sign-in acceptable for the prototype?</w:t>
-      </w:r>
-    </w:p>
-    <w:p>
-      <w:pPr>
-        <w:pStyle w:val="ListBullet"/>
-      </w:pPr>
-      <w:r>
-        <w:rPr>
-          <w:b/>
-        </w:rPr>
-        <w:t>Preview of a pending change.</w:t>
-      </w:r>
-      <w:r>
-        <w:t xml:space="preserve"> GitHub Pages has no per-PR previews. The reviewer sees a text diff (plus a green build). If a visual preview is needed, a follow-up could publish PR builds to a preview folder or another host and use Sveltia's deploy-preview link support.</w:t>
-      </w:r>
-    </w:p>
-    <w:p>
-      <w:pPr>
-        <w:pStyle w:val="ListBullet"/>
-      </w:pPr>
-      <w:r>
-        <w:rPr>
-          <w:b/>
-        </w:rPr>
-        <w:t>Images.</w:t>
-      </w:r>
-      <w:r>
-        <w:t xml:space="preserve"> No image fields are exposed (the site uses inline SVG art). If photos are wanted, decide on a media folder under public/uploads (with size/type limits) or an external media library; the validator would need an asset check.</w:t>
-      </w:r>
-    </w:p>
-    <w:p>
-      <w:pPr>
-        <w:pStyle w:val="ListBullet"/>
-      </w:pPr>
-      <w:r>
-        <w:rPr>
-          <w:b/>
-        </w:rPr>
-        <w:t>More editable areas.</w:t>
-      </w:r>
-      <w:r>
-        <w:t xml:space="preserve"> Hero copy, contact details, the “Batch Capacity” notice and the header hours badge are still hard-coded. They can be moved to content/ with the same pattern if routine updates are expected.</w:t>
-      </w:r>
-    </w:p>
-    <w:p>
-      <w:pPr>
-        <w:pStyle w:val="ListBullet"/>
-      </w:pPr>
-      <w:r>
-        <w:rPr>
-          <w:b/>
-        </w:rPr>
-        <w:t>Who may publish?</w:t>
-      </w:r>
-      <w:r>
-        <w:t xml:space="preserve"> With the publish gate, moving a card to Ready publishes it. Decide whether every editor may do that or only the manager — GitHub cannot restrict who applies a label, so this is a staff instruction unless CMS_REQUIRE_SECOND_REVIEWER=true (author ≠ approver) is enough.</w:t>
-      </w:r>
-    </w:p>
-    <w:p>
-      <w:pPr>
-        <w:pStyle w:val="ListBullet"/>
-      </w:pPr>
-      <w:r>
-        <w:rPr>
-          <w:b/>
-        </w:rPr>
-        <w:t>Deletions.</w:t>
-      </w:r>
-      <w:r>
-        <w:t xml:space="preserve"> Deleting an entry in the editor still ends in a pull request that a developer merges on GitHub (D21). If staff need to remove dishes themselves, use the item's “Show on menu” switch instead, or extend the gate to deletions.</w:t>
-      </w:r>
-    </w:p>
-    <w:p>
-      <w:pPr>
-        <w:pStyle w:val="ListBullet"/>
-      </w:pPr>
-      <w:r>
-        <w:rPr>
-          <w:b/>
-        </w:rPr>
-        <w:t>Renaming a menu section.</w:t>
-      </w:r>
-      <w:r>
-        <w:t xml:space="preserve"> Items refer to their section by title (so diffs and cards stay human-readable). Renaming a section therefore needs the items re-pointed (the CI validator flags any item whose section no longer exists). If renames turn out to be frequent, switch the relation to the section slug and resolve titles in the loader.</w:t>
-      </w:r>
-    </w:p>
-    <w:p>
-      <w:pPr>
-        <w:pStyle w:val="ListBullet"/>
-      </w:pPr>
-      <w:r>
-        <w:rPr>
-          <w:b/>
-        </w:rPr>
-        <w:t>Group order in the Menu Items list.</w:t>
-      </w:r>
-      <w:r>
-        <w:t xml:space="preserve"> Sveltia orders groups alphabetically, not by the sections' </w:t>
-      </w:r>
-      <w:r>
-        <w:rPr>
-          <w:rFonts w:ascii="Consolas" w:hAnsi="Consolas" w:eastAsia="Consolas"/>
-          <w:sz w:val="19"/>
-        </w:rPr>
-        <w:t>order</w:t>
-      </w:r>
-      <w:r>
-        <w:t xml:space="preserve">; the website uses </w:t>
-      </w:r>
-      <w:r>
-        <w:rPr>
-          <w:rFonts w:ascii="Consolas" w:hAnsi="Consolas" w:eastAsia="Consolas"/>
-          <w:sz w:val="19"/>
-        </w:rPr>
-        <w:t>order</w:t>
-      </w:r>
-      <w:r>
-        <w:t>. Prefixing section titles with numbers would align both at the cost of uglier headings.</w:t>
-      </w:r>
-    </w:p>
-    <w:p>
-      <w:pPr>
-        <w:pStyle w:val="ListBullet"/>
-      </w:pPr>
-      <w:r>
-        <w:rPr>
-          <w:b/>
-        </w:rPr>
-        <w:t>Menu badge vocabulary.</w:t>
-      </w:r>
-      <w:r>
-        <w:t xml:space="preserve"> Badges are a fixed list (MENU_TAGS). Confirm the list, and whether the manager should be able to add new badges (free text) at the cost of looser validation.</w:t>
-      </w:r>
-    </w:p>
-    <w:p>
-      <w:pPr>
-        <w:pStyle w:val="ListBullet"/>
-      </w:pPr>
-      <w:r>
-        <w:rPr>
-          <w:b/>
-        </w:rPr>
-        <w:t>Date of blog posts.</w:t>
-      </w:r>
-      <w:r>
-        <w:t xml:space="preserve"> Posts are listed by </w:t>
-      </w:r>
-      <w:r>
-        <w:rPr>
-          <w:rFonts w:ascii="Consolas" w:hAnsi="Consolas" w:eastAsia="Consolas"/>
-          <w:sz w:val="19"/>
-        </w:rPr>
-        <w:t>date</w:t>
-      </w:r>
-      <w:r>
-        <w:t>; future-dated posts are shown immediately. Should scheduling (hide until date) be added?</w:t>
-      </w:r>
-    </w:p>
-    <w:p>
-      <w:pPr>
-        <w:pStyle w:val="ListBullet"/>
-      </w:pPr>
-      <w:r>
-        <w:rPr>
-          <w:b/>
-        </w:rPr>
-        <w:t>Token lifetime.</w:t>
-      </w:r>
-      <w:r>
-        <w:t xml:space="preserve"> Fine-grained tokens expire (max 1 year). If token mode is used long-term, decide on a renewal reminder or move to OAuth.</w:t>
-      </w:r>
-    </w:p>
-    <w:p>
-      <w:pPr>
-        <w:pStyle w:val="ListBullet"/>
-      </w:pPr>
-      <w:r>
-        <w:rPr>
-          <w:b/>
-        </w:rPr>
-        <w:t>Notifications.</w:t>
-      </w:r>
-      <w:r>
-        <w:t xml:space="preserve"> Who is notified when a PR is opened? GitHub's default notifications to the reviewer may be enough; otherwise configure a CODEOWNERS file (content/ → reviewer) so review requests are automatic.</w:t>
-      </w:r>
-    </w:p>
-    <w:p>
-      <w:pPr>
-        <w:pStyle w:val="ListBullet"/>
-      </w:pPr>
-      <w:r>
-        <w:rPr>
-          <w:b/>
-        </w:rPr>
-        <w:t>Browser support for local mode.</w:t>
-      </w:r>
-      <w:r>
-        <w:t xml:space="preserve"> The local-repository mode needs Chrome/Edge. Confirm this is acceptable for the development team.</w:t>
+        <w:t xml:space="preserve"> A yearly calendar entry is the current plan; a GitHub App (owner's “App proxy” idea) would remove the expiry altogether.</w:t>
       </w:r>
     </w:p>
     <w:p>
@@ -10913,7 +11727,7 @@
               <w:rPr>
                 <w:sz w:val="18"/>
               </w:rPr>
-              <w:t>Token leakage from the manager's browser</w:t>
+              <w:t>Token leakage from a staff browser</w:t>
             </w:r>
           </w:p>
         </w:tc>
@@ -10931,7 +11745,7 @@
               <w:rPr>
                 <w:sz w:val="18"/>
               </w:rPr>
-              <w:t>Unauthorised commits/PRs as the manager</w:t>
+              <w:t>Unauthorised entries could be saved and, if the holder also moves them to Ready, published</w:t>
             </w:r>
           </w:p>
         </w:tc>
@@ -10949,7 +11763,7 @@
               <w:rPr>
                 <w:sz w:val="18"/>
               </w:rPr>
-              <w:t>Fine-grained, single-repo, expiring token; branch protection still requires review; revoke on GitHub</w:t>
+              <w:t>Fine-grained, single-repo, expiring token; every change is a visible pull request with an audit trail; optional four-eyes rule (CMS_REQUIRE_SECOND_REVIEWER); revoke the token and remove the collaborator on GitHub</w:t>
             </w:r>
           </w:p>
         </w:tc>
@@ -11078,6 +11892,131 @@
                 <w:sz w:val="18"/>
               </w:rPr>
               <w:t>—</w:t>
+            </w:r>
+          </w:p>
+        </w:tc>
+      </w:tr>
+      <w:tr>
+        <w:tc>
+          <w:tcPr>
+            <w:tcW w:type="dxa" w:w="907"/>
+          </w:tcPr>
+          <w:p>
+            <w:r>
+              <w:rPr>
+                <w:sz w:val="18"/>
+              </w:rPr>
+            </w:r>
+            <w:r>
+              <w:rPr>
+                <w:sz w:val="18"/>
+              </w:rPr>
+              <w:t>1.6.1</w:t>
+            </w:r>
+          </w:p>
+        </w:tc>
+        <w:tc>
+          <w:tcPr>
+            <w:tcW w:type="dxa" w:w="5669"/>
+          </w:tcPr>
+          <w:p>
+            <w:r>
+              <w:rPr>
+                <w:sz w:val="18"/>
+              </w:rPr>
+            </w:r>
+            <w:r>
+              <w:rPr>
+                <w:sz w:val="18"/>
+              </w:rPr>
+              <w:t>Documentation tooling made cross-platform: Pillow diagram scripts look up fonts from a Linux/Windows/macOS candidate list with a built-in fallback (docs/src/diagram_common.py) and, like the Graphviz script, write to docs/images/diagrams from any working directory; new build-guide-pdf.py; docs/src/requirements.txt and rebuilt instructions.</w:t>
+            </w:r>
+          </w:p>
+        </w:tc>
+        <w:tc>
+          <w:tcPr>
+            <w:tcW w:type="dxa" w:w="2778"/>
+          </w:tcPr>
+          <w:p>
+            <w:r>
+              <w:rPr>
+                <w:sz w:val="18"/>
+              </w:rPr>
+            </w:r>
+            <w:r>
+              <w:rPr>
+                <w:sz w:val="18"/>
+              </w:rPr>
+              <w:t xml:space="preserve">Dev team hit </w:t>
+            </w:r>
+            <w:r>
+              <w:rPr>
+                <w:rFonts w:ascii="Consolas" w:hAnsi="Consolas" w:eastAsia="Consolas"/>
+                <w:sz w:val="18"/>
+              </w:rPr>
+              <w:t>OSError: cannot open resource</w:t>
+            </w:r>
+            <w:r>
+              <w:rPr>
+                <w:sz w:val="18"/>
+              </w:rPr>
+              <w:t xml:space="preserve"> running diagram-content-update-flow.py on Windows (hard-coded DejaVu font path) and had to cd into the output folder first.</w:t>
+            </w:r>
+          </w:p>
+        </w:tc>
+      </w:tr>
+      <w:tr>
+        <w:tc>
+          <w:tcPr>
+            <w:tcW w:type="dxa" w:w="907"/>
+          </w:tcPr>
+          <w:p>
+            <w:r>
+              <w:rPr>
+                <w:sz w:val="18"/>
+              </w:rPr>
+            </w:r>
+            <w:r>
+              <w:rPr>
+                <w:sz w:val="18"/>
+              </w:rPr>
+              <w:t>1.6</w:t>
+            </w:r>
+          </w:p>
+        </w:tc>
+        <w:tc>
+          <w:tcPr>
+            <w:tcW w:type="dxa" w:w="5669"/>
+          </w:tcPr>
+          <w:p>
+            <w:r>
+              <w:rPr>
+                <w:sz w:val="18"/>
+              </w:rPr>
+            </w:r>
+            <w:r>
+              <w:rPr>
+                <w:sz w:val="18"/>
+              </w:rPr>
+              <w:t>Documentation audit against the v1.5 behaviour: workflow table (§7, steps 8–13), conventions, reviewer wording, routine operations, risks and the validation-layers figure now describe review in the editor and automatic merge by the gate; open questions replaced by the dev team's decisions (§14); verification checklist for the gate (§8.5); explanation of GitHub draft pull requests versus labels (§7.1). No code changes.</w:t>
+            </w:r>
+          </w:p>
+        </w:tc>
+        <w:tc>
+          <w:tcPr>
+            <w:tcW w:type="dxa" w:w="2778"/>
+          </w:tcPr>
+          <w:p>
+            <w:r>
+              <w:rPr>
+                <w:sz w:val="18"/>
+              </w:rPr>
+            </w:r>
+            <w:r>
+              <w:rPr>
+                <w:sz w:val="18"/>
+              </w:rPr>
+              <w:t>Owner review: step 13 questioned (a GitHub visit still seemed necessary — it is not once the v1.5 branch rule is in place); dev-team answers to the open questions; question how the Draft gate works.</w:t>
             </w:r>
           </w:p>
         </w:tc>

</xml_diff>

<commit_message>
Fix e2e test wf lane issues, update all docs, final demo completed
</commit_message>
<xml_diff>
--- a/docs/Technical-Design-Document.docx
+++ b/docs/Technical-Design-Document.docx
@@ -231,7 +231,7 @@
               <w:rPr>
                 <w:sz w:val="18"/>
               </w:rPr>
-              <w:t>1.6 — 17 October 2026 (see §16 Revision history)</w:t>
+              <w:t>1.7.2 — 17 October 2026 (see §16 Revision history)</w:t>
             </w:r>
           </w:p>
         </w:tc>
@@ -4668,6 +4668,44 @@
               <w:rPr>
                 <w:sz w:val="18"/>
               </w:rPr>
+              <w:t>New menu section → new dishes</w:t>
+            </w:r>
+          </w:p>
+        </w:tc>
+        <w:tc>
+          <w:tcPr>
+            <w:tcW w:type="dxa" w:w="7200"/>
+          </w:tcPr>
+          <w:p>
+            <w:r>
+              <w:rPr>
+                <w:sz w:val="18"/>
+              </w:rPr>
+            </w:r>
+            <w:r>
+              <w:rPr>
+                <w:sz w:val="18"/>
+              </w:rPr>
+              <w:t>Two steps, in order. The item's Menu section field is a relation that lists only published sections (Sveltia reads relation options from main; a draft section lives on its own PR branch). Under the Editorial Workflow Sveltia also disables the inline “Add Menu Section” button that local mode offers, because a draft is itself a pull request and cannot spawn a second entry. Publish the section (Ready → live, minutes), reload the editor, then add items. An item saved without a section is allowed as a Draft (Sveltia does not enforce required fields on drafts) but cannot be sent for review — “This field is required.” — and the CI validator rejects it. Its card reads “(no section yet) › …”. Covered by e2e scenario 11.</w:t>
+            </w:r>
+          </w:p>
+        </w:tc>
+      </w:tr>
+      <w:tr>
+        <w:tc>
+          <w:tcPr>
+            <w:tcW w:type="dxa" w:w="2154"/>
+          </w:tcPr>
+          <w:p>
+            <w:r>
+              <w:rPr>
+                <w:sz w:val="18"/>
+              </w:rPr>
+            </w:r>
+            <w:r>
+              <w:rPr>
+                <w:sz w:val="18"/>
+              </w:rPr>
               <w:t>Deleting an entry</w:t>
             </w:r>
           </w:p>
@@ -5858,7 +5896,7 @@
       <w:r>
         <w:drawing>
           <wp:inline xmlns:a="http://schemas.openxmlformats.org/drawingml/2006/main" xmlns:pic="http://schemas.openxmlformats.org/drawingml/2006/picture">
-            <wp:extent cx="6120000" cy="523945"/>
+            <wp:extent cx="6120000" cy="612437"/>
             <wp:docPr id="4" name="Picture 4"/>
             <wp:cNvGraphicFramePr>
               <a:graphicFrameLocks noChangeAspect="1"/>
@@ -5879,7 +5917,7 @@
                   <pic:spPr>
                     <a:xfrm>
                       <a:off x="0" y="0"/>
-                      <a:ext cx="6120000" cy="523945"/>
+                      <a:ext cx="6120000" cy="612437"/>
                     </a:xfrm>
                     <a:prstGeom prst="rect"/>
                   </pic:spPr>
@@ -6615,7 +6653,7 @@
       <w:r>
         <w:drawing>
           <wp:inline xmlns:a="http://schemas.openxmlformats.org/drawingml/2006/main" xmlns:pic="http://schemas.openxmlformats.org/drawingml/2006/picture">
-            <wp:extent cx="5760000" cy="878431"/>
+            <wp:extent cx="5760000" cy="1008560"/>
             <wp:docPr id="5" name="Picture 5"/>
             <wp:cNvGraphicFramePr>
               <a:graphicFrameLocks noChangeAspect="1"/>
@@ -6636,7 +6674,7 @@
                   <pic:spPr>
                     <a:xfrm>
                       <a:off x="0" y="0"/>
-                      <a:ext cx="5760000" cy="878431"/>
+                      <a:ext cx="5760000" cy="1008560"/>
                     </a:xfrm>
                     <a:prstGeom prst="rect"/>
                   </pic:spPr>
@@ -7006,6 +7044,62 @@
               <w:rPr>
                 <w:sz w:val="17"/>
               </w:rPr>
+              <w:t>11</w:t>
+            </w:r>
+          </w:p>
+        </w:tc>
+        <w:tc>
+          <w:tcPr>
+            <w:tcW w:type="dxa" w:w="3402"/>
+          </w:tcPr>
+          <w:p>
+            <w:r>
+              <w:rPr>
+                <w:sz w:val="17"/>
+              </w:rPr>
+            </w:r>
+            <w:r>
+              <w:rPr>
+                <w:sz w:val="17"/>
+              </w:rPr>
+              <w:t>Draft a new menu section, then create a menu item</w:t>
+            </w:r>
+          </w:p>
+        </w:tc>
+        <w:tc>
+          <w:tcPr>
+            <w:tcW w:type="dxa" w:w="5499"/>
+          </w:tcPr>
+          <w:p>
+            <w:r>
+              <w:rPr>
+                <w:sz w:val="17"/>
+              </w:rPr>
+            </w:r>
+            <w:r>
+              <w:rPr>
+                <w:sz w:val="17"/>
+              </w:rPr>
+              <w:t>Only the three published sections are offered, no inline Add button, the explanatory hint is shown; an item without a section saves as a Draft with label “(no section yet) › …”, gets no Send-for-Review prompt and cannot be moved to In Review (“This field is required.”)</w:t>
+            </w:r>
+          </w:p>
+        </w:tc>
+      </w:tr>
+      <w:tr>
+        <w:tc>
+          <w:tcPr>
+            <w:tcW w:type="dxa" w:w="454"/>
+          </w:tcPr>
+          <w:p>
+            <w:r>
+              <w:rPr>
+                <w:sz w:val="17"/>
+              </w:rPr>
+            </w:r>
+            <w:r>
+              <w:rPr>
+                <w:sz w:val="17"/>
+              </w:rPr>
               <w:t>10</w:t>
             </w:r>
           </w:p>
@@ -7345,6 +7439,15 @@
           <w:i w:val="0"/>
         </w:rPr>
         <w:t>Run with `npm run test:e2e`. Screenshots are written to the git-ignored test-results/ folder; `UPDATE_SCREENSHOTS=1 npm run test:e2e` refreshes the committed documentation images. npm install brings the Playwright package but not the browser binary; run `npm run test:e2e:setup` (= `npx playwright install chromium`) once — the test prints this hint and exits if Chromium is missing. The test also writes the screenshots used in this document and in the manager guide (docs/images/cms/). Static checks: `npm run lint` type-checks the site, the Vite plugins and the CMS configuration; `npm run validate:content` validates the committed content. Both run in CI.</w:t>
+      </w:r>
+    </w:p>
+    <w:p>
+      <w:r>
+        <w:rPr>
+          <w:b w:val="0"/>
+          <w:i w:val="0"/>
+        </w:rPr>
+        <w:t>Content independence (v1.7.1): the simulated repository is seeded from the real content/ folder, so the scenarios read their expectations from it — the first menu item with a section and its current price, the current Wednesday hours, the published section titles — and everything they create is named “E2E …”. Before that, the suite hard-coded the Margherita price and created a fictitious “Buffalo Trace”/“Alcohol”; the moment the owner added a real Buffalo Trace dish the scenario opened the real entry and failed. Status-menu clicks (v1.7.2): Sveltia's menu component activates its click handling about 100 ms after the menu opens, so a click that lands earlier — fast machines, or Windows with animations turned off, where the popup appears instantly — is silently ignored and the menu just stays open. The chooseStatus helper lets the menu settle before clicking and clicks again if the menu is still open; it never presses Escape, which (with the default “close with Escape” preference) closes the whole entry editor when no menu is open. A failing scenario now also writes test-results/screenshots/FAILED-&lt;n&gt;.png and prints the browser console errors, so a failure on another machine can be diagnosed from its output.</w:t>
       </w:r>
     </w:p>
     <w:p>
@@ -7611,6 +7714,44 @@
               <w:rPr>
                 <w:sz w:val="18"/>
               </w:rPr>
+              <w:t>A new menu section is not offered for a dish</w:t>
+            </w:r>
+          </w:p>
+        </w:tc>
+        <w:tc>
+          <w:tcPr>
+            <w:tcW w:type="dxa" w:w="6803"/>
+          </w:tcPr>
+          <w:p>
+            <w:r>
+              <w:rPr>
+                <w:sz w:val="18"/>
+              </w:rPr>
+            </w:r>
+            <w:r>
+              <w:rPr>
+                <w:sz w:val="18"/>
+              </w:rPr>
+              <w:t>The section is not published yet. Send it for review, set it to Ready, wait for the deployment, reload the editor.</w:t>
+            </w:r>
+          </w:p>
+        </w:tc>
+      </w:tr>
+      <w:tr>
+        <w:tc>
+          <w:tcPr>
+            <w:tcW w:type="dxa" w:w="2551"/>
+          </w:tcPr>
+          <w:p>
+            <w:r>
+              <w:rPr>
+                <w:sz w:val="18"/>
+              </w:rPr>
+            </w:r>
+            <w:r>
+              <w:rPr>
+                <w:sz w:val="18"/>
+              </w:rPr>
               <w:t>Nothing happens after Ready</w:t>
             </w:r>
           </w:p>
@@ -9624,6 +9765,80 @@
                 <w:sz w:val="16"/>
               </w:rPr>
               <w:t>Running tests must not dirty the working tree (it did, and interfered with git rebase); the dev server's SPA fallback showed the website for /admin</w:t>
+            </w:r>
+          </w:p>
+        </w:tc>
+      </w:tr>
+      <w:tr>
+        <w:tc>
+          <w:tcPr>
+            <w:tcW w:type="dxa" w:w="510"/>
+          </w:tcPr>
+          <w:p>
+            <w:r>
+              <w:rPr>
+                <w:sz w:val="16"/>
+              </w:rPr>
+            </w:r>
+            <w:r>
+              <w:rPr>
+                <w:sz w:val="16"/>
+              </w:rPr>
+              <w:t>D23</w:t>
+            </w:r>
+          </w:p>
+        </w:tc>
+        <w:tc>
+          <w:tcPr>
+            <w:tcW w:type="dxa" w:w="2608"/>
+          </w:tcPr>
+          <w:p>
+            <w:r>
+              <w:rPr>
+                <w:sz w:val="16"/>
+              </w:rPr>
+            </w:r>
+            <w:r>
+              <w:rPr>
+                <w:sz w:val="16"/>
+              </w:rPr>
+              <w:t>Keep the relation field and the two-step “publish the section first” process; explain it in the field hint (v1.7)</w:t>
+            </w:r>
+          </w:p>
+        </w:tc>
+        <w:tc>
+          <w:tcPr>
+            <w:tcW w:type="dxa" w:w="2438"/>
+          </w:tcPr>
+          <w:p>
+            <w:r>
+              <w:rPr>
+                <w:sz w:val="16"/>
+              </w:rPr>
+            </w:r>
+            <w:r>
+              <w:rPr>
+                <w:sz w:val="16"/>
+              </w:rPr>
+              <w:t>Free-text section with auto-created headings; a second “new section title” field; simple publish mode for sections (would commit straight to main — rejected by the branch rule anyway); custom relation widget that includes draft entries</w:t>
+            </w:r>
+          </w:p>
+        </w:tc>
+        <w:tc>
+          <w:tcPr>
+            <w:tcW w:type="dxa" w:w="3798"/>
+          </w:tcPr>
+          <w:p>
+            <w:r>
+              <w:rPr>
+                <w:sz w:val="16"/>
+              </w:rPr>
+            </w:r>
+            <w:r>
+              <w:rPr>
+                <w:sz w:val="16"/>
+              </w:rPr>
+              <w:t>Sveltia hard-codes both limits under Editorial Workflow (relation options come from main; inline creation is disabled). Sections are rare; a few minutes' wait is cheaper than a second source of truth or a custom widget. Safety nets already exist: drafts cannot be sent for review without a section and CI rejects orphans</w:t>
             </w:r>
           </w:p>
         </w:tc>
@@ -11892,6 +12107,174 @@
                 <w:sz w:val="18"/>
               </w:rPr>
               <w:t>—</w:t>
+            </w:r>
+          </w:p>
+        </w:tc>
+      </w:tr>
+      <w:tr>
+        <w:tc>
+          <w:tcPr>
+            <w:tcW w:type="dxa" w:w="907"/>
+          </w:tcPr>
+          <w:p>
+            <w:r>
+              <w:rPr>
+                <w:sz w:val="18"/>
+              </w:rPr>
+            </w:r>
+            <w:r>
+              <w:rPr>
+                <w:sz w:val="18"/>
+              </w:rPr>
+              <w:t>1.7.2</w:t>
+            </w:r>
+          </w:p>
+        </w:tc>
+        <w:tc>
+          <w:tcPr>
+            <w:tcW w:type="dxa" w:w="5669"/>
+          </w:tcPr>
+          <w:p>
+            <w:r>
+              <w:rPr>
+                <w:sz w:val="18"/>
+              </w:rPr>
+            </w:r>
+            <w:r>
+              <w:rPr>
+                <w:sz w:val="18"/>
+              </w:rPr>
+              <w:t>Status-menu clicks in the e2e suite wait for Sveltia's menu to become active and retry ignored clicks without pressing Escape; failure screenshots and console errors captured (§11).</w:t>
+            </w:r>
+          </w:p>
+        </w:tc>
+        <w:tc>
+          <w:tcPr>
+            <w:tcW w:type="dxa" w:w="2778"/>
+          </w:tcPr>
+          <w:p>
+            <w:r>
+              <w:rPr>
+                <w:sz w:val="18"/>
+              </w:rPr>
+            </w:r>
+            <w:r>
+              <w:rPr>
+                <w:sz w:val="18"/>
+              </w:rPr>
+              <w:t>Owner: scenarios 3 and 11 still failed on the owner's Windows machine (status-menu option click had no effect; the earlier retry's Escape then closed the editor). Root cause traced in the Sveltia UI bundle (100 ms activation delay) and reproduced locally with an instant click.</w:t>
+            </w:r>
+          </w:p>
+        </w:tc>
+      </w:tr>
+      <w:tr>
+        <w:tc>
+          <w:tcPr>
+            <w:tcW w:type="dxa" w:w="907"/>
+          </w:tcPr>
+          <w:p>
+            <w:r>
+              <w:rPr>
+                <w:sz w:val="18"/>
+              </w:rPr>
+            </w:r>
+            <w:r>
+              <w:rPr>
+                <w:sz w:val="18"/>
+              </w:rPr>
+              <w:t>1.7.1</w:t>
+            </w:r>
+          </w:p>
+        </w:tc>
+        <w:tc>
+          <w:tcPr>
+            <w:tcW w:type="dxa" w:w="5669"/>
+          </w:tcPr>
+          <w:p>
+            <w:r>
+              <w:rPr>
+                <w:sz w:val="18"/>
+              </w:rPr>
+            </w:r>
+            <w:r>
+              <w:rPr>
+                <w:sz w:val="18"/>
+              </w:rPr>
+              <w:t>End-to-end suite made independent of the real content (expectations derived from content/, “E2E …” names for created entries) and lane-move clicks retried (§11).</w:t>
+            </w:r>
+          </w:p>
+        </w:tc>
+        <w:tc>
+          <w:tcPr>
+            <w:tcW w:type="dxa" w:w="2778"/>
+          </w:tcPr>
+          <w:p>
+            <w:r>
+              <w:rPr>
+                <w:sz w:val="18"/>
+              </w:rPr>
+            </w:r>
+            <w:r>
+              <w:rPr>
+                <w:sz w:val="18"/>
+              </w:rPr>
+              <w:t>Owner: npm run test:e2e failed after adding a real “Buffalo Trace” dish (the fixture name the test relied on) and a slower machine lost a status-menu click.</w:t>
+            </w:r>
+          </w:p>
+        </w:tc>
+      </w:tr>
+      <w:tr>
+        <w:tc>
+          <w:tcPr>
+            <w:tcW w:type="dxa" w:w="907"/>
+          </w:tcPr>
+          <w:p>
+            <w:r>
+              <w:rPr>
+                <w:sz w:val="18"/>
+              </w:rPr>
+            </w:r>
+            <w:r>
+              <w:rPr>
+                <w:sz w:val="18"/>
+              </w:rPr>
+              <w:t>1.7</w:t>
+            </w:r>
+          </w:p>
+        </w:tc>
+        <w:tc>
+          <w:tcPr>
+            <w:tcW w:type="dxa" w:w="5669"/>
+          </w:tcPr>
+          <w:p>
+            <w:r>
+              <w:rPr>
+                <w:sz w:val="18"/>
+              </w:rPr>
+            </w:r>
+            <w:r>
+              <w:rPr>
+                <w:sz w:val="18"/>
+              </w:rPr>
+              <w:t>New-section-then-items ordering documented and tested: relation hint and “(no section yet)” card label in config.ts, §7.1 row, D23, runbook row, guide; e2e scenario 11.</w:t>
+            </w:r>
+          </w:p>
+        </w:tc>
+        <w:tc>
+          <w:tcPr>
+            <w:tcW w:type="dxa" w:w="2778"/>
+          </w:tcPr>
+          <w:p>
+            <w:r>
+              <w:rPr>
+                <w:sz w:val="18"/>
+              </w:rPr>
+            </w:r>
+            <w:r>
+              <w:rPr>
+                <w:sz w:val="18"/>
+              </w:rPr>
+              <w:t>Dev team: a new Menu Section and a new Menu Item could no longer be created in one session in GitHub mode (it works in local mode). Analysed as Sveltia behaviour under Editorial Workflow, not a regression.</w:t>
             </w:r>
           </w:p>
         </w:tc>
@@ -13572,7 +13955,7 @@
               <a:graphicData uri="http://schemas.openxmlformats.org/drawingml/2006/picture">
                 <pic:pic>
                   <pic:nvPicPr>
-                    <pic:cNvPr id="0" name="18-content-check-banner.png"/>
+                    <pic:cNvPr id="0" name="19-item-needs-published-section.png"/>
                     <pic:cNvPicPr/>
                   </pic:nvPicPr>
                   <pic:blipFill>
@@ -13606,7 +13989,7 @@
           <w:i/>
           <w:sz w:val="18"/>
         </w:rPr>
-        <w:t>B-13 — Content-source check: the GitHub branch lacks the menu folders, so the collections are empty and the banner names what to push.</w:t>
+        <w:t>B-13 — A dish cannot be sent for review until its menu section is published; the hint explains the order.</w:t>
       </w:r>
     </w:p>
     <w:p>
@@ -13625,7 +14008,7 @@
               <a:graphicData uri="http://schemas.openxmlformats.org/drawingml/2006/picture">
                 <pic:pic>
                   <pic:nvPicPr>
-                    <pic:cNvPr id="0" name="14-local-mode-hours.png"/>
+                    <pic:cNvPr id="0" name="18-content-check-banner.png"/>
                     <pic:cNvPicPr/>
                   </pic:nvPicPr>
                   <pic:blipFill>
@@ -13659,7 +14042,60 @@
           <w:i/>
           <w:sz w:val="18"/>
         </w:rPr>
-        <w:t>B-14 — Local repository mode editing Opening Hours (day names are read-only); preview shows the Weekly Schedule table.</w:t>
+        <w:t>B-14 — Content-source check: the GitHub branch lacks the menu folders, so the collections are empty and the banner names what to push.</w:t>
+      </w:r>
+    </w:p>
+    <w:p>
+      <w:pPr>
+        <w:jc w:val="center"/>
+      </w:pPr>
+      <w:r>
+        <w:drawing>
+          <wp:inline xmlns:a="http://schemas.openxmlformats.org/drawingml/2006/main" xmlns:pic="http://schemas.openxmlformats.org/drawingml/2006/picture">
+            <wp:extent cx="5580000" cy="3487500"/>
+            <wp:docPr id="20" name="Picture 20"/>
+            <wp:cNvGraphicFramePr>
+              <a:graphicFrameLocks noChangeAspect="1"/>
+            </wp:cNvGraphicFramePr>
+            <a:graphic>
+              <a:graphicData uri="http://schemas.openxmlformats.org/drawingml/2006/picture">
+                <pic:pic>
+                  <pic:nvPicPr>
+                    <pic:cNvPr id="0" name="14-local-mode-hours.png"/>
+                    <pic:cNvPicPr/>
+                  </pic:nvPicPr>
+                  <pic:blipFill>
+                    <a:blip r:embed="rId27"/>
+                    <a:stretch>
+                      <a:fillRect/>
+                    </a:stretch>
+                  </pic:blipFill>
+                  <pic:spPr>
+                    <a:xfrm>
+                      <a:off x="0" y="0"/>
+                      <a:ext cx="5580000" cy="3487500"/>
+                    </a:xfrm>
+                    <a:prstGeom prst="rect"/>
+                  </pic:spPr>
+                </pic:pic>
+              </a:graphicData>
+            </a:graphic>
+          </wp:inline>
+        </w:drawing>
+      </w:r>
+    </w:p>
+    <w:p>
+      <w:pPr>
+        <w:spacing w:after="200"/>
+        <w:jc w:val="center"/>
+      </w:pPr>
+      <w:r>
+        <w:rPr>
+          <w:b w:val="0"/>
+          <w:i/>
+          <w:sz w:val="18"/>
+        </w:rPr>
+        <w:t>B-15 — Local repository mode editing Opening Hours (day names are read-only); preview shows the Weekly Schedule table.</w:t>
       </w:r>
     </w:p>
     <w:sectPr>

</xml_diff>